<commit_message>
feat: loading UX improvements, progress tracking, and document summarizer updates
Co-Authored-By: Claude Opus 4.6 <noreply@anthropic.com>
</commit_message>
<xml_diff>
--- a/Examples/Example Altimmune Risk Management Procedure v2 11-30-2022.docx
+++ b/Examples/Example Altimmune Risk Management Procedure v2 11-30-2022.docx
@@ -1,6 +1,6 @@
 
 <file path=word/document.xml><?xml version="1.0" encoding="utf-8"?>
-<w:document xmlns:wpc="http://schemas.microsoft.com/office/word/2010/wordprocessingCanvas" xmlns:cx="http://schemas.microsoft.com/office/drawing/2014/chartex" xmlns:cx1="http://schemas.microsoft.com/office/drawing/2015/9/8/chartex" xmlns:cx2="http://schemas.microsoft.com/office/drawing/2015/10/21/chartex" xmlns:cx3="http://schemas.microsoft.com/office/drawing/2016/5/9/chartex" xmlns:cx4="http://schemas.microsoft.com/office/drawing/2016/5/10/chartex" xmlns:cx5="http://schemas.microsoft.com/office/drawing/2016/5/11/chartex" xmlns:cx6="http://schemas.microsoft.com/office/drawing/2016/5/12/chartex" xmlns:cx7="http://schemas.microsoft.com/office/drawing/2016/5/13/chartex" xmlns:cx8="http://schemas.microsoft.com/office/drawing/2016/5/14/chartex" xmlns:mc="http://schemas.openxmlformats.org/markup-compatibility/2006" xmlns:aink="http://schemas.microsoft.com/office/drawing/2016/ink" xmlns:am3d="http://schemas.microsoft.com/office/drawing/2017/model3d" xmlns:o="urn:schemas-microsoft-com:office:office" xmlns:oel="http://schemas.microsoft.com/office/2019/extlst" xmlns:r="http://schemas.openxmlformats.org/officeDocument/2006/relationships" xmlns:m="http://schemas.openxmlformats.org/officeDocument/2006/math" xmlns:v="urn:schemas-microsoft-com:vml" xmlns:wp14="http://schemas.microsoft.com/office/word/2010/wordprocessingDrawing" xmlns:wp="http://schemas.openxmlformats.org/drawingml/2006/wordprocessingDrawing" xmlns:w10="urn:schemas-microsoft-com:office:word" xmlns:w="http://schemas.openxmlformats.org/wordprocessingml/2006/main" xmlns:w14="http://schemas.microsoft.com/office/word/2010/wordml" xmlns:w15="http://schemas.microsoft.com/office/word/2012/wordml" xmlns:w16cex="http://schemas.microsoft.com/office/word/2018/wordml/cex" xmlns:w16cid="http://schemas.microsoft.com/office/word/2016/wordml/cid" xmlns:w16="http://schemas.microsoft.com/office/word/2018/wordml" xmlns:w16sdtdh="http://schemas.microsoft.com/office/word/2020/wordml/sdtdatahash" xmlns:w16se="http://schemas.microsoft.com/office/word/2015/wordml/symex" xmlns:wpg="http://schemas.microsoft.com/office/word/2010/wordprocessingGroup" xmlns:wpi="http://schemas.microsoft.com/office/word/2010/wordprocessingInk" xmlns:wne="http://schemas.microsoft.com/office/word/2006/wordml" xmlns:wps="http://schemas.microsoft.com/office/word/2010/wordprocessingShape" mc:Ignorable="w14 w15 w16se w16cid w16 w16cex w16sdtdh wp14">
+<w:document xmlns:wpc="http://schemas.microsoft.com/office/word/2010/wordprocessingCanvas" xmlns:cx="http://schemas.microsoft.com/office/drawing/2014/chartex" xmlns:cx1="http://schemas.microsoft.com/office/drawing/2015/9/8/chartex" xmlns:cx2="http://schemas.microsoft.com/office/drawing/2015/10/21/chartex" xmlns:cx3="http://schemas.microsoft.com/office/drawing/2016/5/9/chartex" xmlns:cx4="http://schemas.microsoft.com/office/drawing/2016/5/10/chartex" xmlns:cx5="http://schemas.microsoft.com/office/drawing/2016/5/11/chartex" xmlns:cx6="http://schemas.microsoft.com/office/drawing/2016/5/12/chartex" xmlns:cx7="http://schemas.microsoft.com/office/drawing/2016/5/13/chartex" xmlns:cx8="http://schemas.microsoft.com/office/drawing/2016/5/14/chartex" xmlns:mc="http://schemas.openxmlformats.org/markup-compatibility/2006" xmlns:aink="http://schemas.microsoft.com/office/drawing/2016/ink" xmlns:am3d="http://schemas.microsoft.com/office/drawing/2017/model3d" xmlns:o="urn:schemas-microsoft-com:office:office" xmlns:oel="http://schemas.microsoft.com/office/2019/extlst" xmlns:r="http://schemas.openxmlformats.org/officeDocument/2006/relationships" xmlns:m="http://schemas.openxmlformats.org/officeDocument/2006/math" xmlns:v="urn:schemas-microsoft-com:vml" xmlns:wp14="http://schemas.microsoft.com/office/word/2010/wordprocessingDrawing" xmlns:wp="http://schemas.openxmlformats.org/drawingml/2006/wordprocessingDrawing" xmlns:w10="urn:schemas-microsoft-com:office:word" xmlns:w="http://schemas.openxmlformats.org/wordprocessingml/2006/main" xmlns:w14="http://schemas.microsoft.com/office/word/2010/wordml" xmlns:w15="http://schemas.microsoft.com/office/word/2012/wordml" xmlns:w16cex="http://schemas.microsoft.com/office/word/2018/wordml/cex" xmlns:w16cid="http://schemas.microsoft.com/office/word/2016/wordml/cid" xmlns:w16="http://schemas.microsoft.com/office/word/2018/wordml" xmlns:w16du="http://schemas.microsoft.com/office/word/2023/wordml/word16du" xmlns:w16sdtdh="http://schemas.microsoft.com/office/word/2020/wordml/sdtdatahash" xmlns:w16sdtfl="http://schemas.microsoft.com/office/word/2024/wordml/sdtformatlock" xmlns:w16se="http://schemas.microsoft.com/office/word/2015/wordml/symex" xmlns:wpg="http://schemas.microsoft.com/office/word/2010/wordprocessingGroup" xmlns:wpi="http://schemas.microsoft.com/office/word/2010/wordprocessingInk" xmlns:wne="http://schemas.microsoft.com/office/word/2006/wordml" xmlns:wps="http://schemas.microsoft.com/office/word/2010/wordprocessingShape" mc:Ignorable="w14 w15 w16se w16cid w16 w16cex w16sdtdh w16sdtfl w16du wp14">
   <w:body>
     <w:p>
       <w:pPr>
@@ -1164,11 +1164,11 @@
           <w:szCs w:val="24"/>
         </w:rPr>
         <w:sectPr>
-          <w:headerReference w:type="even" r:id="rId8"/>
-          <w:headerReference w:type="default" r:id="rId9"/>
-          <w:footerReference w:type="default" r:id="rId10"/>
-          <w:headerReference w:type="first" r:id="rId11"/>
-          <w:footerReference w:type="first" r:id="rId12"/>
+          <w:headerReference w:type="even" r:id="rId11"/>
+          <w:headerReference w:type="default" r:id="rId12"/>
+          <w:footerReference w:type="default" r:id="rId13"/>
+          <w:headerReference w:type="first" r:id="rId14"/>
+          <w:footerReference w:type="first" r:id="rId15"/>
           <w:pgSz w:w="12240" w:h="15840" w:code="1"/>
           <w:pgMar w:top="1440" w:right="1440" w:bottom="1440" w:left="1440" w:header="720" w:footer="720" w:gutter="0"/>
           <w:cols w:space="720"/>
@@ -1210,8 +1210,8 @@
       <w:r>
         <w:rPr>
           <w:rStyle w:val="CommentReference"/>
-          <w:rFonts w:ascii="Arial" w:hAnsi="Arial"/>
-          <w:lang w:val="en-GB"/>
+          <w:sz w:val="24"/>
+          <w:szCs w:val="24"/>
         </w:rPr>
         <w:commentReference w:id="2"/>
       </w:r>
@@ -1564,8 +1564,8 @@
         <w:tblLook w:val="04A0" w:firstRow="1" w:lastRow="0" w:firstColumn="1" w:lastColumn="0" w:noHBand="0" w:noVBand="1"/>
       </w:tblPr>
       <w:tblGrid>
-        <w:gridCol w:w="2723"/>
-        <w:gridCol w:w="6254"/>
+        <w:gridCol w:w="3323"/>
+        <w:gridCol w:w="5654"/>
       </w:tblGrid>
       <w:tr>
         <w:trPr>
@@ -1608,8 +1608,10 @@
             <w:r>
               <w:rPr>
                 <w:rStyle w:val="CommentReference"/>
-                <w:rFonts w:ascii="Arial" w:hAnsi="Arial"/>
-                <w:lang w:val="en-GB"/>
+                <w:b/>
+                <w:bCs/>
+                <w:sz w:val="24"/>
+                <w:szCs w:val="20"/>
               </w:rPr>
               <w:commentReference w:id="3"/>
             </w:r>
@@ -1617,8 +1619,10 @@
             <w:r>
               <w:rPr>
                 <w:rStyle w:val="CommentReference"/>
-                <w:rFonts w:ascii="Arial" w:hAnsi="Arial"/>
-                <w:lang w:val="en-GB"/>
+                <w:b/>
+                <w:bCs/>
+                <w:sz w:val="24"/>
+                <w:szCs w:val="20"/>
               </w:rPr>
               <w:commentReference w:id="4"/>
             </w:r>
@@ -1675,8 +1679,8 @@
             <w:r>
               <w:rPr>
                 <w:rStyle w:val="CommentReference"/>
-                <w:rFonts w:ascii="Arial" w:hAnsi="Arial"/>
-                <w:lang w:val="en-GB"/>
+                <w:sz w:val="24"/>
+                <w:szCs w:val="20"/>
               </w:rPr>
               <w:commentReference w:id="5"/>
             </w:r>
@@ -1684,8 +1688,8 @@
             <w:r>
               <w:rPr>
                 <w:rStyle w:val="CommentReference"/>
-                <w:rFonts w:ascii="Arial" w:hAnsi="Arial"/>
-                <w:lang w:val="en-GB"/>
+                <w:sz w:val="24"/>
+                <w:szCs w:val="20"/>
               </w:rPr>
               <w:commentReference w:id="6"/>
             </w:r>
@@ -1693,8 +1697,8 @@
             <w:r>
               <w:rPr>
                 <w:rStyle w:val="CommentReference"/>
-                <w:rFonts w:ascii="Arial" w:hAnsi="Arial"/>
-                <w:lang w:val="en-GB"/>
+                <w:sz w:val="24"/>
+                <w:szCs w:val="20"/>
               </w:rPr>
               <w:commentReference w:id="7"/>
             </w:r>
@@ -1865,13 +1869,30 @@
             <w:r>
               <w:t xml:space="preserve"> available information such as the general acknowledged state of the art and known stakeholder concerns.</w:t>
             </w:r>
+            <w:commentRangeEnd w:id="10"/>
+            <w:r>
+              <w:rPr>
+                <w:rStyle w:val="CommentReference"/>
+                <w:sz w:val="24"/>
+                <w:szCs w:val="20"/>
+              </w:rPr>
+              <w:commentReference w:id="10"/>
+            </w:r>
+            <w:commentRangeEnd w:id="11"/>
+            <w:r>
+              <w:rPr>
+                <w:rStyle w:val="CommentReference"/>
+                <w:sz w:val="24"/>
+                <w:szCs w:val="20"/>
+              </w:rPr>
+              <w:commentReference w:id="11"/>
+            </w:r>
             <w:commentRangeEnd w:id="8"/>
-            <w:commentRangeEnd w:id="10"/>
             <w:r>
               <w:rPr>
                 <w:rStyle w:val="CommentReference"/>
-                <w:rFonts w:ascii="Arial" w:hAnsi="Arial"/>
-                <w:lang w:val="en-GB"/>
+                <w:sz w:val="24"/>
+                <w:szCs w:val="20"/>
               </w:rPr>
               <w:commentReference w:id="8"/>
             </w:r>
@@ -1879,27 +1900,10 @@
             <w:r>
               <w:rPr>
                 <w:rStyle w:val="CommentReference"/>
-                <w:rFonts w:ascii="Arial" w:hAnsi="Arial"/>
-                <w:lang w:val="en-GB"/>
+                <w:sz w:val="24"/>
+                <w:szCs w:val="20"/>
               </w:rPr>
               <w:commentReference w:id="9"/>
-            </w:r>
-            <w:r>
-              <w:rPr>
-                <w:rStyle w:val="CommentReference"/>
-                <w:rFonts w:ascii="Arial" w:hAnsi="Arial"/>
-                <w:lang w:val="en-GB"/>
-              </w:rPr>
-              <w:commentReference w:id="10"/>
-            </w:r>
-            <w:commentRangeEnd w:id="11"/>
-            <w:r>
-              <w:rPr>
-                <w:rStyle w:val="CommentReference"/>
-                <w:rFonts w:ascii="Arial" w:hAnsi="Arial"/>
-                <w:lang w:val="en-GB"/>
-              </w:rPr>
-              <w:commentReference w:id="11"/>
             </w:r>
           </w:p>
           <w:p>
@@ -2421,9 +2425,8 @@
       <w:r>
         <w:rPr>
           <w:rStyle w:val="CommentReference"/>
-          <w:rFonts w:ascii="Arial" w:hAnsi="Arial"/>
-          <w:b w:val="0"/>
-          <w:lang w:val="en-GB"/>
+          <w:sz w:val="24"/>
+          <w:szCs w:val="24"/>
         </w:rPr>
         <w:commentReference w:id="12"/>
       </w:r>
@@ -2559,7 +2562,6 @@
         <w:tc>
           <w:tcPr>
             <w:tcW w:w="2390" w:type="dxa"/>
-            <w:shd w:val="clear" w:color="auto" w:fill="auto"/>
           </w:tcPr>
           <w:p>
             <w:r>
@@ -2579,7 +2581,6 @@
         <w:tc>
           <w:tcPr>
             <w:tcW w:w="6610" w:type="dxa"/>
-            <w:shd w:val="clear" w:color="auto" w:fill="auto"/>
           </w:tcPr>
           <w:p>
             <w:r>
@@ -2592,7 +2593,6 @@
         <w:tc>
           <w:tcPr>
             <w:tcW w:w="2390" w:type="dxa"/>
-            <w:shd w:val="clear" w:color="auto" w:fill="auto"/>
           </w:tcPr>
           <w:p>
             <w:r>
@@ -2606,7 +2606,6 @@
         <w:tc>
           <w:tcPr>
             <w:tcW w:w="6610" w:type="dxa"/>
-            <w:shd w:val="clear" w:color="auto" w:fill="auto"/>
           </w:tcPr>
           <w:p>
             <w:r>
@@ -2619,7 +2618,6 @@
         <w:tc>
           <w:tcPr>
             <w:tcW w:w="2390" w:type="dxa"/>
-            <w:shd w:val="clear" w:color="auto" w:fill="auto"/>
           </w:tcPr>
           <w:p>
             <w:r>
@@ -2636,7 +2634,6 @@
         <w:tc>
           <w:tcPr>
             <w:tcW w:w="6610" w:type="dxa"/>
-            <w:shd w:val="clear" w:color="auto" w:fill="auto"/>
           </w:tcPr>
           <w:p>
             <w:r>
@@ -2652,7 +2649,6 @@
         <w:tc>
           <w:tcPr>
             <w:tcW w:w="2390" w:type="dxa"/>
-            <w:shd w:val="clear" w:color="auto" w:fill="auto"/>
           </w:tcPr>
           <w:p>
             <w:r>
@@ -2672,7 +2668,6 @@
         <w:tc>
           <w:tcPr>
             <w:tcW w:w="6610" w:type="dxa"/>
-            <w:shd w:val="clear" w:color="auto" w:fill="auto"/>
           </w:tcPr>
           <w:p>
             <w:r>
@@ -2688,7 +2683,6 @@
         <w:tc>
           <w:tcPr>
             <w:tcW w:w="2390" w:type="dxa"/>
-            <w:shd w:val="clear" w:color="auto" w:fill="auto"/>
           </w:tcPr>
           <w:p>
             <w:r>
@@ -2708,7 +2702,6 @@
         <w:tc>
           <w:tcPr>
             <w:tcW w:w="6610" w:type="dxa"/>
-            <w:shd w:val="clear" w:color="auto" w:fill="auto"/>
           </w:tcPr>
           <w:p>
             <w:r>
@@ -2721,7 +2714,6 @@
         <w:tc>
           <w:tcPr>
             <w:tcW w:w="2390" w:type="dxa"/>
-            <w:shd w:val="clear" w:color="auto" w:fill="auto"/>
           </w:tcPr>
           <w:p>
             <w:r>
@@ -2741,7 +2733,6 @@
         <w:tc>
           <w:tcPr>
             <w:tcW w:w="6610" w:type="dxa"/>
-            <w:shd w:val="clear" w:color="auto" w:fill="auto"/>
           </w:tcPr>
           <w:p>
             <w:r>
@@ -2754,7 +2745,6 @@
         <w:tc>
           <w:tcPr>
             <w:tcW w:w="2390" w:type="dxa"/>
-            <w:shd w:val="clear" w:color="auto" w:fill="auto"/>
           </w:tcPr>
           <w:p>
             <w:r>
@@ -2771,7 +2761,6 @@
         <w:tc>
           <w:tcPr>
             <w:tcW w:w="6610" w:type="dxa"/>
-            <w:shd w:val="clear" w:color="auto" w:fill="auto"/>
           </w:tcPr>
           <w:p>
             <w:r>
@@ -2787,7 +2776,6 @@
         <w:tc>
           <w:tcPr>
             <w:tcW w:w="2390" w:type="dxa"/>
-            <w:shd w:val="clear" w:color="auto" w:fill="auto"/>
           </w:tcPr>
           <w:p>
             <w:r>
@@ -2804,7 +2792,6 @@
         <w:tc>
           <w:tcPr>
             <w:tcW w:w="6610" w:type="dxa"/>
-            <w:shd w:val="clear" w:color="auto" w:fill="auto"/>
           </w:tcPr>
           <w:p>
             <w:r>
@@ -2817,7 +2804,6 @@
         <w:tc>
           <w:tcPr>
             <w:tcW w:w="2390" w:type="dxa"/>
-            <w:shd w:val="clear" w:color="auto" w:fill="auto"/>
           </w:tcPr>
           <w:p>
             <w:r>
@@ -2831,7 +2817,6 @@
         <w:tc>
           <w:tcPr>
             <w:tcW w:w="6610" w:type="dxa"/>
-            <w:shd w:val="clear" w:color="auto" w:fill="auto"/>
           </w:tcPr>
           <w:p>
             <w:r>
@@ -2844,7 +2829,6 @@
         <w:tc>
           <w:tcPr>
             <w:tcW w:w="2390" w:type="dxa"/>
-            <w:shd w:val="clear" w:color="auto" w:fill="auto"/>
           </w:tcPr>
           <w:p>
             <w:r>
@@ -2864,7 +2848,6 @@
         <w:tc>
           <w:tcPr>
             <w:tcW w:w="6610" w:type="dxa"/>
-            <w:shd w:val="clear" w:color="auto" w:fill="auto"/>
           </w:tcPr>
           <w:p>
             <w:r>
@@ -2877,7 +2860,6 @@
         <w:tc>
           <w:tcPr>
             <w:tcW w:w="2390" w:type="dxa"/>
-            <w:shd w:val="clear" w:color="auto" w:fill="auto"/>
           </w:tcPr>
           <w:p>
             <w:r>
@@ -2897,7 +2879,6 @@
         <w:tc>
           <w:tcPr>
             <w:tcW w:w="6610" w:type="dxa"/>
-            <w:shd w:val="clear" w:color="auto" w:fill="auto"/>
           </w:tcPr>
           <w:p>
             <w:r>
@@ -2910,7 +2891,6 @@
         <w:tc>
           <w:tcPr>
             <w:tcW w:w="2390" w:type="dxa"/>
-            <w:shd w:val="clear" w:color="auto" w:fill="auto"/>
           </w:tcPr>
           <w:p>
             <w:r>
@@ -2921,7 +2901,6 @@
         <w:tc>
           <w:tcPr>
             <w:tcW w:w="6610" w:type="dxa"/>
-            <w:shd w:val="clear" w:color="auto" w:fill="auto"/>
           </w:tcPr>
           <w:p>
             <w:r>
@@ -3125,7 +3104,6 @@
                 <w:rStyle w:val="CommentReference"/>
                 <w:sz w:val="24"/>
                 <w:szCs w:val="24"/>
-                <w:lang w:val="en-GB"/>
               </w:rPr>
               <w:commentReference w:id="14"/>
             </w:r>
@@ -3694,7 +3672,6 @@
         <w:tc>
           <w:tcPr>
             <w:tcW w:w="2245" w:type="dxa"/>
-            <w:shd w:val="clear" w:color="auto" w:fill="auto"/>
           </w:tcPr>
           <w:p>
             <w:pPr>
@@ -3711,7 +3688,6 @@
         <w:tc>
           <w:tcPr>
             <w:tcW w:w="6755" w:type="dxa"/>
-            <w:shd w:val="clear" w:color="auto" w:fill="auto"/>
           </w:tcPr>
           <w:p>
             <w:pPr>
@@ -3720,108 +3696,6 @@
             </w:pPr>
             <w:r>
               <w:t>Data supporting the existence or verity of something, which can be obtained through observation, measurement, test or by other means [2]</w:t>
-            </w:r>
-          </w:p>
-        </w:tc>
-      </w:tr>
-      <w:tr>
-        <w:trPr>
-          <w:cantSplit/>
-        </w:trPr>
-        <w:tc>
-          <w:tcPr>
-            <w:tcW w:w="2245" w:type="dxa"/>
-            <w:shd w:val="clear" w:color="auto" w:fill="auto"/>
-          </w:tcPr>
-          <w:p>
-            <w:pPr>
-              <w:pStyle w:val="ListParagraph"/>
-              <w:spacing w:before="40" w:after="40"/>
-              <w:ind w:left="0"/>
-              <w:contextualSpacing w:val="0"/>
-            </w:pPr>
-            <w:r>
-              <w:t>Post-production</w:t>
-            </w:r>
-          </w:p>
-        </w:tc>
-        <w:tc>
-          <w:tcPr>
-            <w:tcW w:w="6755" w:type="dxa"/>
-            <w:shd w:val="clear" w:color="auto" w:fill="auto"/>
-          </w:tcPr>
-          <w:p>
-            <w:pPr>
-              <w:pStyle w:val="ListParagraph"/>
-              <w:spacing w:before="40" w:after="40"/>
-              <w:ind w:left="0"/>
-              <w:contextualSpacing w:val="0"/>
-              <w:rPr>
-                <w:szCs w:val="24"/>
-              </w:rPr>
-            </w:pPr>
-            <w:r>
-              <w:rPr>
-                <w:szCs w:val="24"/>
-              </w:rPr>
-              <w:t xml:space="preserve">Part of the lifecycle of the </w:t>
-            </w:r>
-            <w:r>
-              <w:rPr>
-                <w:szCs w:val="24"/>
-              </w:rPr>
-              <w:t>combination product</w:t>
-            </w:r>
-            <w:r>
-              <w:rPr>
-                <w:szCs w:val="24"/>
-              </w:rPr>
-              <w:t xml:space="preserve"> after the design has been completed and the combination product has been manufactured [2]</w:t>
-            </w:r>
-          </w:p>
-        </w:tc>
-      </w:tr>
-      <w:tr>
-        <w:trPr>
-          <w:cantSplit/>
-        </w:trPr>
-        <w:tc>
-          <w:tcPr>
-            <w:tcW w:w="2245" w:type="dxa"/>
-            <w:shd w:val="clear" w:color="auto" w:fill="auto"/>
-          </w:tcPr>
-          <w:p>
-            <w:pPr>
-              <w:pStyle w:val="ListParagraph"/>
-              <w:spacing w:before="40" w:after="40"/>
-              <w:ind w:left="0"/>
-              <w:contextualSpacing w:val="0"/>
-            </w:pPr>
-            <w:r>
-              <w:t>Process</w:t>
-            </w:r>
-          </w:p>
-        </w:tc>
-        <w:tc>
-          <w:tcPr>
-            <w:tcW w:w="6755" w:type="dxa"/>
-            <w:shd w:val="clear" w:color="auto" w:fill="auto"/>
-          </w:tcPr>
-          <w:p>
-            <w:pPr>
-              <w:pStyle w:val="ListParagraph"/>
-              <w:spacing w:before="40" w:after="40"/>
-              <w:ind w:left="0"/>
-              <w:contextualSpacing w:val="0"/>
-              <w:rPr>
-                <w:szCs w:val="24"/>
-              </w:rPr>
-            </w:pPr>
-            <w:r>
-              <w:rPr>
-                <w:szCs w:val="24"/>
-              </w:rPr>
-              <w:t>Set of interrelated of interacting activities that use inputs to deliver an intended result.</w:t>
             </w:r>
           </w:p>
         </w:tc>
@@ -3842,7 +3716,7 @@
               <w:contextualSpacing w:val="0"/>
             </w:pPr>
             <w:r>
-              <w:t>Reasonable Foreseeable Misuse</w:t>
+              <w:t>Post-production</w:t>
             </w:r>
           </w:p>
         </w:tc>
@@ -3864,7 +3738,19 @@
               <w:rPr>
                 <w:szCs w:val="24"/>
               </w:rPr>
-              <w:t>Use of a product or system in a way not intended by the manufacturer, but which can result from readily predictable behavior.</w:t>
+              <w:t xml:space="preserve">Part of the lifecycle of the </w:t>
+            </w:r>
+            <w:r>
+              <w:rPr>
+                <w:szCs w:val="24"/>
+              </w:rPr>
+              <w:t>combination product</w:t>
+            </w:r>
+            <w:r>
+              <w:rPr>
+                <w:szCs w:val="24"/>
+              </w:rPr>
+              <w:t xml:space="preserve"> after the design has been completed and the combination product has been manufactured [2]</w:t>
             </w:r>
           </w:p>
         </w:tc>
@@ -3885,7 +3771,7 @@
               <w:contextualSpacing w:val="0"/>
             </w:pPr>
             <w:r>
-              <w:t>Residual Risk</w:t>
+              <w:t>Process</w:t>
             </w:r>
           </w:p>
         </w:tc>
@@ -3907,7 +3793,7 @@
               <w:rPr>
                 <w:szCs w:val="24"/>
               </w:rPr>
-              <w:t>Risk remaining after risk control measures have been implemented [2]</w:t>
+              <w:t>Set of interrelated of interacting activities that use inputs to deliver an intended result.</w:t>
             </w:r>
           </w:p>
         </w:tc>
@@ -3928,8 +3814,7 @@
               <w:contextualSpacing w:val="0"/>
             </w:pPr>
             <w:r>
-              <w:lastRenderedPageBreak/>
-              <w:t>Risk</w:t>
+              <w:t>Reasonable Foreseeable Misuse</w:t>
             </w:r>
           </w:p>
         </w:tc>
@@ -3951,7 +3836,7 @@
               <w:rPr>
                 <w:szCs w:val="24"/>
               </w:rPr>
-              <w:t>Combination of the probability of occurrence of harm and the severity of that harm [2]</w:t>
+              <w:t>Use of a product or system in a way not intended by the manufacturer, but which can result from readily predictable behavior.</w:t>
             </w:r>
           </w:p>
         </w:tc>
@@ -3972,7 +3857,7 @@
               <w:contextualSpacing w:val="0"/>
             </w:pPr>
             <w:r>
-              <w:t>Risk Analysis</w:t>
+              <w:t>Residual Risk</w:t>
             </w:r>
           </w:p>
         </w:tc>
@@ -3994,7 +3879,7 @@
               <w:rPr>
                 <w:szCs w:val="24"/>
               </w:rPr>
-              <w:t>Systematic use of available information to identify hazards and to estimate the risk [2]</w:t>
+              <w:t>Risk remaining after risk control measures have been implemented [2]</w:t>
             </w:r>
           </w:p>
         </w:tc>
@@ -4015,7 +3900,8 @@
               <w:contextualSpacing w:val="0"/>
             </w:pPr>
             <w:r>
-              <w:t>Risk Assessment</w:t>
+              <w:lastRenderedPageBreak/>
+              <w:t>Risk</w:t>
             </w:r>
           </w:p>
         </w:tc>
@@ -4037,7 +3923,7 @@
               <w:rPr>
                 <w:szCs w:val="24"/>
               </w:rPr>
-              <w:t>Overall process comprising a risk analysis and a risk evaluation [2]</w:t>
+              <w:t>Combination of the probability of occurrence of harm and the severity of that harm [2]</w:t>
             </w:r>
           </w:p>
         </w:tc>
@@ -4058,7 +3944,7 @@
               <w:contextualSpacing w:val="0"/>
             </w:pPr>
             <w:r>
-              <w:t>Risk Control</w:t>
+              <w:t>Risk Analysis</w:t>
             </w:r>
           </w:p>
         </w:tc>
@@ -4080,19 +3966,7 @@
               <w:rPr>
                 <w:szCs w:val="24"/>
               </w:rPr>
-              <w:t>Process in which decisions are made and measures implemented by which risks are reduce</w:t>
-            </w:r>
-            <w:r>
-              <w:rPr>
-                <w:szCs w:val="24"/>
-              </w:rPr>
-              <w:t>d</w:t>
-            </w:r>
-            <w:r>
-              <w:rPr>
-                <w:szCs w:val="24"/>
-              </w:rPr>
-              <w:t xml:space="preserve"> to, or maintained within, specified levels [2]</w:t>
+              <w:t>Systematic use of available information to identify hazards and to estimate the risk [2]</w:t>
             </w:r>
           </w:p>
         </w:tc>
@@ -4113,7 +3987,7 @@
               <w:contextualSpacing w:val="0"/>
             </w:pPr>
             <w:r>
-              <w:t>Risk Estimation</w:t>
+              <w:t>Risk Assessment</w:t>
             </w:r>
           </w:p>
         </w:tc>
@@ -4135,7 +4009,7 @@
               <w:rPr>
                 <w:szCs w:val="24"/>
               </w:rPr>
-              <w:t>Process used to assign values to the probability of occurrence of harm and the severity of that harm [2]</w:t>
+              <w:t>Overall process comprising a risk analysis and a risk evaluation [2]</w:t>
             </w:r>
           </w:p>
         </w:tc>
@@ -4156,7 +4030,7 @@
               <w:contextualSpacing w:val="0"/>
             </w:pPr>
             <w:r>
-              <w:t>Risk Evaluation</w:t>
+              <w:t>Risk Control</w:t>
             </w:r>
           </w:p>
         </w:tc>
@@ -4178,7 +4052,19 @@
               <w:rPr>
                 <w:szCs w:val="24"/>
               </w:rPr>
-              <w:t>Process of comparing the estimated risk against given risk criteria to determine the acceptability of the risk [2]</w:t>
+              <w:t>Process in which decisions are made and measures implemented by which risks are reduce</w:t>
+            </w:r>
+            <w:r>
+              <w:rPr>
+                <w:szCs w:val="24"/>
+              </w:rPr>
+              <w:t>d</w:t>
+            </w:r>
+            <w:r>
+              <w:rPr>
+                <w:szCs w:val="24"/>
+              </w:rPr>
+              <w:t xml:space="preserve"> to, or maintained within, specified levels [2]</w:t>
             </w:r>
           </w:p>
         </w:tc>
@@ -4199,7 +4085,7 @@
               <w:contextualSpacing w:val="0"/>
             </w:pPr>
             <w:r>
-              <w:t>Risk Management</w:t>
+              <w:t>Risk Estimation</w:t>
             </w:r>
           </w:p>
         </w:tc>
@@ -4221,7 +4107,7 @@
               <w:rPr>
                 <w:szCs w:val="24"/>
               </w:rPr>
-              <w:t>Systemic application of management policies, procedures, and practices to the tasks of analyzing, evaluating, controlling, and monitoring risk [2]</w:t>
+              <w:t>Process used to assign values to the probability of occurrence of harm and the severity of that harm [2]</w:t>
             </w:r>
           </w:p>
         </w:tc>
@@ -4233,7 +4119,6 @@
         <w:tc>
           <w:tcPr>
             <w:tcW w:w="2245" w:type="dxa"/>
-            <w:shd w:val="clear" w:color="auto" w:fill="auto"/>
           </w:tcPr>
           <w:p>
             <w:pPr>
@@ -4243,14 +4128,13 @@
               <w:contextualSpacing w:val="0"/>
             </w:pPr>
             <w:r>
-              <w:t>Risk Management File</w:t>
+              <w:t>Risk Evaluation</w:t>
             </w:r>
           </w:p>
         </w:tc>
         <w:tc>
           <w:tcPr>
             <w:tcW w:w="6755" w:type="dxa"/>
-            <w:shd w:val="clear" w:color="auto" w:fill="auto"/>
           </w:tcPr>
           <w:p>
             <w:pPr>
@@ -4266,7 +4150,7 @@
               <w:rPr>
                 <w:szCs w:val="24"/>
               </w:rPr>
-              <w:t>Set of records and other documents that are produced by risk management [2]</w:t>
+              <w:t>Process of comparing the estimated risk against given risk criteria to determine the acceptability of the risk [2]</w:t>
             </w:r>
           </w:p>
         </w:tc>
@@ -4278,7 +4162,6 @@
         <w:tc>
           <w:tcPr>
             <w:tcW w:w="2245" w:type="dxa"/>
-            <w:shd w:val="clear" w:color="auto" w:fill="auto"/>
           </w:tcPr>
           <w:p>
             <w:pPr>
@@ -4288,14 +4171,13 @@
               <w:contextualSpacing w:val="0"/>
             </w:pPr>
             <w:r>
-              <w:t>Safety</w:t>
+              <w:t>Risk Management</w:t>
             </w:r>
           </w:p>
         </w:tc>
         <w:tc>
           <w:tcPr>
             <w:tcW w:w="6755" w:type="dxa"/>
-            <w:shd w:val="clear" w:color="auto" w:fill="auto"/>
           </w:tcPr>
           <w:p>
             <w:pPr>
@@ -4311,7 +4193,7 @@
               <w:rPr>
                 <w:szCs w:val="24"/>
               </w:rPr>
-              <w:t>Freedom from unacceptable risk [2]</w:t>
+              <w:t>Systemic application of management policies, procedures, and practices to the tasks of analyzing, evaluating, controlling, and monitoring risk [2]</w:t>
             </w:r>
           </w:p>
         </w:tc>
@@ -4323,7 +4205,6 @@
         <w:tc>
           <w:tcPr>
             <w:tcW w:w="2245" w:type="dxa"/>
-            <w:shd w:val="clear" w:color="auto" w:fill="auto"/>
           </w:tcPr>
           <w:p>
             <w:pPr>
@@ -4333,14 +4214,13 @@
               <w:contextualSpacing w:val="0"/>
             </w:pPr>
             <w:r>
-              <w:t>Severity</w:t>
+              <w:t>Risk Management File</w:t>
             </w:r>
           </w:p>
         </w:tc>
         <w:tc>
           <w:tcPr>
             <w:tcW w:w="6755" w:type="dxa"/>
-            <w:shd w:val="clear" w:color="auto" w:fill="auto"/>
           </w:tcPr>
           <w:p>
             <w:pPr>
@@ -4356,7 +4236,7 @@
               <w:rPr>
                 <w:szCs w:val="24"/>
               </w:rPr>
-              <w:t>Measure of the possible consequences of a hazard [2]</w:t>
+              <w:t>Set of records and other documents that are produced by risk management [2]</w:t>
             </w:r>
           </w:p>
         </w:tc>
@@ -4368,7 +4248,6 @@
         <w:tc>
           <w:tcPr>
             <w:tcW w:w="2245" w:type="dxa"/>
-            <w:shd w:val="clear" w:color="auto" w:fill="auto"/>
           </w:tcPr>
           <w:p>
             <w:pPr>
@@ -4378,14 +4257,13 @@
               <w:contextualSpacing w:val="0"/>
             </w:pPr>
             <w:r>
-              <w:t>State of the Art</w:t>
+              <w:t>Safety</w:t>
             </w:r>
           </w:p>
         </w:tc>
         <w:tc>
           <w:tcPr>
             <w:tcW w:w="6755" w:type="dxa"/>
-            <w:shd w:val="clear" w:color="auto" w:fill="auto"/>
           </w:tcPr>
           <w:p>
             <w:pPr>
@@ -4401,7 +4279,7 @@
               <w:rPr>
                 <w:szCs w:val="24"/>
               </w:rPr>
-              <w:t>Developed stage of technical capacity at a given time as regards products, processes and services, based on the relevant consolidated findings of science, technology and experience.</w:t>
+              <w:t>Freedom from unacceptable risk [2]</w:t>
             </w:r>
           </w:p>
         </w:tc>
@@ -4413,7 +4291,6 @@
         <w:tc>
           <w:tcPr>
             <w:tcW w:w="2245" w:type="dxa"/>
-            <w:shd w:val="clear" w:color="auto" w:fill="auto"/>
           </w:tcPr>
           <w:p>
             <w:pPr>
@@ -4423,14 +4300,13 @@
               <w:contextualSpacing w:val="0"/>
             </w:pPr>
             <w:r>
-              <w:t>Top Management</w:t>
+              <w:t>Severity</w:t>
             </w:r>
           </w:p>
         </w:tc>
         <w:tc>
           <w:tcPr>
             <w:tcW w:w="6755" w:type="dxa"/>
-            <w:shd w:val="clear" w:color="auto" w:fill="auto"/>
           </w:tcPr>
           <w:p>
             <w:pPr>
@@ -4446,27 +4322,7 @@
               <w:rPr>
                 <w:szCs w:val="24"/>
               </w:rPr>
-              <w:t>A person or group of people who directs and controls an organization at the highest level</w:t>
-            </w:r>
-            <w:r>
-              <w:rPr>
-                <w:szCs w:val="24"/>
-              </w:rPr>
-              <w:t>, having</w:t>
-            </w:r>
-            <w:r>
-              <w:rPr>
-                <w:szCs w:val="24"/>
-              </w:rPr>
-              <w:t xml:space="preserve"> the power to delegate authority and provide resources within the organization</w:t>
-            </w:r>
-            <w:r>
-              <w:rPr>
-                <w:rStyle w:val="hgkelc"/>
-                <w:szCs w:val="24"/>
-                <w:lang w:val="en"/>
-              </w:rPr>
-              <w:t>.</w:t>
+              <w:t>Measure of the possible consequences of a hazard [2]</w:t>
             </w:r>
           </w:p>
         </w:tc>
@@ -4478,7 +4334,6 @@
         <w:tc>
           <w:tcPr>
             <w:tcW w:w="2245" w:type="dxa"/>
-            <w:shd w:val="clear" w:color="auto" w:fill="auto"/>
           </w:tcPr>
           <w:p>
             <w:pPr>
@@ -4488,14 +4343,13 @@
               <w:contextualSpacing w:val="0"/>
             </w:pPr>
             <w:r>
-              <w:t>User Error</w:t>
+              <w:t>State of the Art</w:t>
             </w:r>
           </w:p>
         </w:tc>
         <w:tc>
           <w:tcPr>
             <w:tcW w:w="6755" w:type="dxa"/>
-            <w:shd w:val="clear" w:color="auto" w:fill="auto"/>
           </w:tcPr>
           <w:p>
             <w:pPr>
@@ -4511,19 +4365,7 @@
               <w:rPr>
                 <w:szCs w:val="24"/>
               </w:rPr>
-              <w:t xml:space="preserve">User action or lack of user action while using the </w:t>
-            </w:r>
-            <w:r>
-              <w:rPr>
-                <w:szCs w:val="24"/>
-              </w:rPr>
-              <w:t>combination product</w:t>
-            </w:r>
-            <w:r>
-              <w:rPr>
-                <w:szCs w:val="24"/>
-              </w:rPr>
-              <w:t xml:space="preserve"> that leads to a different result than that intended by the manufacturer or expected by the user. [2]</w:t>
+              <w:t>Developed stage of technical capacity at a given time as regards products, processes and services, based on the relevant consolidated findings of science, technology and experience.</w:t>
             </w:r>
           </w:p>
         </w:tc>
@@ -4535,7 +4377,6 @@
         <w:tc>
           <w:tcPr>
             <w:tcW w:w="2245" w:type="dxa"/>
-            <w:shd w:val="clear" w:color="auto" w:fill="auto"/>
           </w:tcPr>
           <w:p>
             <w:pPr>
@@ -4545,14 +4386,13 @@
               <w:contextualSpacing w:val="0"/>
             </w:pPr>
             <w:r>
-              <w:t>Verification</w:t>
+              <w:t>Top Management</w:t>
             </w:r>
           </w:p>
         </w:tc>
         <w:tc>
           <w:tcPr>
             <w:tcW w:w="6755" w:type="dxa"/>
-            <w:shd w:val="clear" w:color="auto" w:fill="auto"/>
           </w:tcPr>
           <w:p>
             <w:pPr>
@@ -4568,7 +4408,27 @@
               <w:rPr>
                 <w:szCs w:val="24"/>
               </w:rPr>
-              <w:t>Confirmation, through the provision of objective evidence, that specified requirements have been fulfilled. [2]</w:t>
+              <w:t>A person or group of people who directs and controls an organization at the highest level</w:t>
+            </w:r>
+            <w:r>
+              <w:rPr>
+                <w:szCs w:val="24"/>
+              </w:rPr>
+              <w:t>, having</w:t>
+            </w:r>
+            <w:r>
+              <w:rPr>
+                <w:szCs w:val="24"/>
+              </w:rPr>
+              <w:t xml:space="preserve"> the power to delegate authority and provide resources within the organization</w:t>
+            </w:r>
+            <w:r>
+              <w:rPr>
+                <w:rStyle w:val="hgkelc"/>
+                <w:szCs w:val="24"/>
+                <w:lang w:val="en"/>
+              </w:rPr>
+              <w:t>.</w:t>
             </w:r>
           </w:p>
         </w:tc>
@@ -4580,7 +4440,6 @@
         <w:tc>
           <w:tcPr>
             <w:tcW w:w="2245" w:type="dxa"/>
-            <w:shd w:val="clear" w:color="auto" w:fill="auto"/>
           </w:tcPr>
           <w:p>
             <w:pPr>
@@ -4590,14 +4449,111 @@
               <w:contextualSpacing w:val="0"/>
             </w:pPr>
             <w:r>
-              <w:t>Validation</w:t>
+              <w:t>User Error</w:t>
             </w:r>
           </w:p>
         </w:tc>
         <w:tc>
           <w:tcPr>
             <w:tcW w:w="6755" w:type="dxa"/>
-            <w:shd w:val="clear" w:color="auto" w:fill="auto"/>
+          </w:tcPr>
+          <w:p>
+            <w:pPr>
+              <w:pStyle w:val="ListParagraph"/>
+              <w:spacing w:before="40" w:after="40"/>
+              <w:ind w:left="0"/>
+              <w:contextualSpacing w:val="0"/>
+              <w:rPr>
+                <w:szCs w:val="24"/>
+              </w:rPr>
+            </w:pPr>
+            <w:r>
+              <w:rPr>
+                <w:szCs w:val="24"/>
+              </w:rPr>
+              <w:t xml:space="preserve">User action or lack of user action while using the </w:t>
+            </w:r>
+            <w:r>
+              <w:rPr>
+                <w:szCs w:val="24"/>
+              </w:rPr>
+              <w:t>combination product</w:t>
+            </w:r>
+            <w:r>
+              <w:rPr>
+                <w:szCs w:val="24"/>
+              </w:rPr>
+              <w:t xml:space="preserve"> that leads to a different result than that intended by the manufacturer or expected by the user. [2]</w:t>
+            </w:r>
+          </w:p>
+        </w:tc>
+      </w:tr>
+      <w:tr>
+        <w:trPr>
+          <w:cantSplit/>
+        </w:trPr>
+        <w:tc>
+          <w:tcPr>
+            <w:tcW w:w="2245" w:type="dxa"/>
+          </w:tcPr>
+          <w:p>
+            <w:pPr>
+              <w:pStyle w:val="ListParagraph"/>
+              <w:spacing w:before="40" w:after="40"/>
+              <w:ind w:left="0"/>
+              <w:contextualSpacing w:val="0"/>
+            </w:pPr>
+            <w:r>
+              <w:t>Verification</w:t>
+            </w:r>
+          </w:p>
+        </w:tc>
+        <w:tc>
+          <w:tcPr>
+            <w:tcW w:w="6755" w:type="dxa"/>
+          </w:tcPr>
+          <w:p>
+            <w:pPr>
+              <w:pStyle w:val="ListParagraph"/>
+              <w:spacing w:before="40" w:after="40"/>
+              <w:ind w:left="0"/>
+              <w:contextualSpacing w:val="0"/>
+              <w:rPr>
+                <w:szCs w:val="24"/>
+              </w:rPr>
+            </w:pPr>
+            <w:r>
+              <w:rPr>
+                <w:szCs w:val="24"/>
+              </w:rPr>
+              <w:t>Confirmation, through the provision of objective evidence, that specified requirements have been fulfilled. [2]</w:t>
+            </w:r>
+          </w:p>
+        </w:tc>
+      </w:tr>
+      <w:tr>
+        <w:trPr>
+          <w:cantSplit/>
+        </w:trPr>
+        <w:tc>
+          <w:tcPr>
+            <w:tcW w:w="2245" w:type="dxa"/>
+          </w:tcPr>
+          <w:p>
+            <w:pPr>
+              <w:pStyle w:val="ListParagraph"/>
+              <w:spacing w:before="40" w:after="40"/>
+              <w:ind w:left="0"/>
+              <w:contextualSpacing w:val="0"/>
+            </w:pPr>
+            <w:r>
+              <w:t>Validation</w:t>
+            </w:r>
+          </w:p>
+        </w:tc>
+        <w:tc>
+          <w:tcPr>
+            <w:tcW w:w="6755" w:type="dxa"/>
           </w:tcPr>
           <w:p>
             <w:pPr>
@@ -4851,9 +4807,39 @@
       <w:r>
         <w:fldChar w:fldCharType="separate"/>
       </w:r>
-      <w:r>
-        <w:t>Figure 1</w:t>
-      </w:r>
+      <w:ins w:id="17" w:author="Matt Parson" w:date="2026-03-17T12:44:00Z" w16du:dateUtc="2026-03-17T16:44:00Z">
+        <w:r>
+          <w:rPr>
+            <w:rPrChange w:id="18" w:author="Matt Parson" w:date="2026-03-17T12:44:00Z" w16du:dateUtc="2026-03-17T16:44:00Z">
+              <w:rPr>
+                <w:b/>
+                <w:sz w:val="22"/>
+                <w:szCs w:val="22"/>
+              </w:rPr>
+            </w:rPrChange>
+          </w:rPr>
+          <w:t xml:space="preserve">Figure </w:t>
+        </w:r>
+        <w:r>
+          <w:rPr>
+            <w:rPrChange w:id="19" w:author="Matt Parson" w:date="2026-03-17T12:44:00Z" w16du:dateUtc="2026-03-17T16:44:00Z">
+              <w:rPr>
+                <w:b/>
+                <w:i/>
+                <w:noProof/>
+                <w:sz w:val="22"/>
+                <w:szCs w:val="22"/>
+              </w:rPr>
+            </w:rPrChange>
+          </w:rPr>
+          <w:t>1</w:t>
+        </w:r>
+      </w:ins>
+      <w:del w:id="20" w:author="Matt Parson" w:date="2026-03-17T12:44:00Z" w16du:dateUtc="2026-03-17T16:44:00Z">
+        <w:r>
+          <w:delText>Figure 1</w:delText>
+        </w:r>
+      </w:del>
       <w:r>
         <w:fldChar w:fldCharType="end"/>
       </w:r>
@@ -4920,134 +4906,26 @@
       <w:pPr>
         <w:pStyle w:val="Heading3"/>
       </w:pPr>
-      <w:commentRangeStart w:id="17"/>
-      <w:commentRangeStart w:id="18"/>
-      <w:r>
-        <w:t xml:space="preserve">Documented records, including evidence of decisions and actions taken, shall be maintained to ensure and demonstrate the effective planning, operation and control of </w:t>
-      </w:r>
-      <w:r>
-        <w:t>this</w:t>
-      </w:r>
-      <w:r>
-        <w:t xml:space="preserve"> </w:t>
-      </w:r>
-      <w:r>
-        <w:t xml:space="preserve">process. </w:t>
-      </w:r>
-      <w:commentRangeEnd w:id="17"/>
-      <w:r>
-        <w:rPr>
-          <w:rStyle w:val="CommentReference"/>
-          <w:rFonts w:ascii="Arial" w:hAnsi="Arial"/>
-          <w:lang w:val="en-GB"/>
-        </w:rPr>
-        <w:commentReference w:id="17"/>
-      </w:r>
-      <w:commentRangeEnd w:id="18"/>
-      <w:r>
-        <w:rPr>
-          <w:rStyle w:val="CommentReference"/>
-          <w:rFonts w:ascii="Arial" w:hAnsi="Arial"/>
-          <w:lang w:val="en-GB"/>
-        </w:rPr>
-        <w:commentReference w:id="18"/>
-      </w:r>
-    </w:p>
-    <w:p>
-      <w:pPr>
-        <w:pStyle w:val="Heading3"/>
-      </w:pPr>
-      <w:commentRangeStart w:id="19"/>
-      <w:commentRangeStart w:id="20"/>
-      <w:r>
-        <w:t>Persons performing risk management tasks shall have the knowledge and experience appropriate to the tasks assigned to them.  These shall include, where appropriate, knowledge and experience of the particular combination product (or similar products) and its use, the technologies involved, or the risk management techniques.  Appropriate competence and training</w:t>
-      </w:r>
-      <w:r>
-        <w:t xml:space="preserve"> program</w:t>
-      </w:r>
-      <w:r>
-        <w:t xml:space="preserve"> </w:t>
-      </w:r>
-      <w:r>
-        <w:t xml:space="preserve">requirements </w:t>
-      </w:r>
-      <w:r>
-        <w:t xml:space="preserve">are </w:t>
-      </w:r>
-      <w:r>
-        <w:t xml:space="preserve">described in </w:t>
-      </w:r>
-      <w:r>
-        <w:t>QA-019</w:t>
-      </w:r>
-      <w:r>
-        <w:t xml:space="preserve">, Training </w:t>
-      </w:r>
-      <w:r>
-        <w:t>Program [</w:t>
-      </w:r>
-      <w:r>
-        <w:t>8</w:t>
-      </w:r>
-      <w:r>
-        <w:t>]</w:t>
-      </w:r>
-      <w:r>
-        <w:t>.</w:t>
-      </w:r>
-      <w:commentRangeEnd w:id="19"/>
-      <w:r>
-        <w:rPr>
-          <w:rStyle w:val="CommentReference"/>
-          <w:rFonts w:ascii="Arial" w:hAnsi="Arial"/>
-          <w:lang w:val="en-GB"/>
-        </w:rPr>
-        <w:commentReference w:id="19"/>
-      </w:r>
-      <w:commentRangeEnd w:id="20"/>
-      <w:r>
-        <w:rPr>
-          <w:rStyle w:val="CommentReference"/>
-          <w:rFonts w:ascii="Arial" w:hAnsi="Arial"/>
-          <w:lang w:val="en-GB"/>
-        </w:rPr>
-        <w:commentReference w:id="20"/>
-      </w:r>
-    </w:p>
-    <w:p>
-      <w:pPr>
-        <w:pStyle w:val="Heading3"/>
-      </w:pPr>
-      <w:r>
-        <w:t>Risk management tasks may be performed by representatives of several functions, each contributing their specialist knowledge.</w:t>
-      </w:r>
-    </w:p>
-    <w:p>
-      <w:pPr>
-        <w:pStyle w:val="Heading3"/>
-      </w:pPr>
-      <w:r>
-        <w:t>Risk management activities shall be communicated during the product development phases as part of the design review process, and as part of the production and post-production process during the commercialization phase.</w:t>
-      </w:r>
-    </w:p>
-    <w:p>
-      <w:pPr>
-        <w:pStyle w:val="Heading3"/>
-      </w:pPr>
       <w:commentRangeStart w:id="21"/>
       <w:commentRangeStart w:id="22"/>
       <w:r>
-        <w:t xml:space="preserve">Major </w:t>
-      </w:r>
-      <w:r>
-        <w:t xml:space="preserve">risks </w:t>
+        <w:t xml:space="preserve">Documented records, including evidence of decisions and actions taken, shall be maintained to ensure and demonstrate the effective planning, operation and control of </w:t>
+      </w:r>
+      <w:r>
+        <w:t>this</w:t>
+      </w:r>
+      <w:r>
+        <w:t xml:space="preserve"> </w:t>
+      </w:r>
+      <w:r>
+        <w:t xml:space="preserve">process. </w:t>
       </w:r>
       <w:commentRangeEnd w:id="21"/>
       <w:r>
         <w:rPr>
           <w:rStyle w:val="CommentReference"/>
-          <w:rFonts w:ascii="Arial" w:hAnsi="Arial"/>
-          <w:lang w:val="en-GB"/>
+          <w:sz w:val="24"/>
+          <w:szCs w:val="20"/>
         </w:rPr>
         <w:commentReference w:id="21"/>
       </w:r>
@@ -5055,19 +4933,10 @@
       <w:r>
         <w:rPr>
           <w:rStyle w:val="CommentReference"/>
-          <w:rFonts w:ascii="Arial" w:hAnsi="Arial"/>
-          <w:lang w:val="en-GB"/>
+          <w:sz w:val="24"/>
+          <w:szCs w:val="20"/>
         </w:rPr>
         <w:commentReference w:id="22"/>
-      </w:r>
-      <w:r>
-        <w:t>shall be communicated to Senior</w:t>
-      </w:r>
-      <w:r>
-        <w:t xml:space="preserve"> Product Development and Quality Assurance</w:t>
-      </w:r>
-      <w:r>
-        <w:t xml:space="preserve"> Management.</w:t>
       </w:r>
     </w:p>
     <w:p>
@@ -5076,9 +4945,126 @@
       </w:pPr>
       <w:commentRangeStart w:id="23"/>
       <w:commentRangeStart w:id="24"/>
+      <w:r>
+        <w:t>Persons performing risk management tasks shall have the knowledge and experience appropriate to the tasks assigned to them.  These shall include, where appropriate, knowledge and experience of the particular combination product (or similar products) and its use, the technologies involved, or the risk management techniques.  Appropriate competence and training</w:t>
+      </w:r>
+      <w:r>
+        <w:t xml:space="preserve"> program</w:t>
+      </w:r>
+      <w:r>
+        <w:t xml:space="preserve"> </w:t>
+      </w:r>
+      <w:r>
+        <w:t xml:space="preserve">requirements </w:t>
+      </w:r>
+      <w:r>
+        <w:t xml:space="preserve">are </w:t>
+      </w:r>
+      <w:r>
+        <w:t xml:space="preserve">described in </w:t>
+      </w:r>
+      <w:r>
+        <w:t>QA-019</w:t>
+      </w:r>
+      <w:r>
+        <w:t xml:space="preserve">, Training </w:t>
+      </w:r>
+      <w:r>
+        <w:t>Program [</w:t>
+      </w:r>
+      <w:r>
+        <w:t>8</w:t>
+      </w:r>
+      <w:r>
+        <w:t>]</w:t>
+      </w:r>
+      <w:r>
+        <w:t>.</w:t>
+      </w:r>
+      <w:commentRangeEnd w:id="23"/>
+      <w:r>
+        <w:rPr>
+          <w:rStyle w:val="CommentReference"/>
+          <w:sz w:val="24"/>
+          <w:szCs w:val="20"/>
+        </w:rPr>
+        <w:commentReference w:id="23"/>
+      </w:r>
+      <w:commentRangeEnd w:id="24"/>
+      <w:r>
+        <w:rPr>
+          <w:rStyle w:val="CommentReference"/>
+          <w:sz w:val="24"/>
+          <w:szCs w:val="20"/>
+        </w:rPr>
+        <w:commentReference w:id="24"/>
+      </w:r>
+    </w:p>
+    <w:p>
+      <w:pPr>
+        <w:pStyle w:val="Heading3"/>
+      </w:pPr>
+      <w:r>
+        <w:t>Risk management tasks may be performed by representatives of several functions, each contributing their specialist knowledge.</w:t>
+      </w:r>
+    </w:p>
+    <w:p>
+      <w:pPr>
+        <w:pStyle w:val="Heading3"/>
+      </w:pPr>
+      <w:r>
+        <w:t>Risk management activities shall be communicated during the product development phases as part of the design review process, and as part of the production and post-production process during the commercialization phase.</w:t>
+      </w:r>
+    </w:p>
+    <w:p>
+      <w:pPr>
+        <w:pStyle w:val="Heading3"/>
+      </w:pPr>
       <w:commentRangeStart w:id="25"/>
       <w:commentRangeStart w:id="26"/>
       <w:r>
+        <w:t xml:space="preserve">Major </w:t>
+      </w:r>
+      <w:r>
+        <w:t xml:space="preserve">risks </w:t>
+      </w:r>
+      <w:commentRangeEnd w:id="25"/>
+      <w:r>
+        <w:rPr>
+          <w:rStyle w:val="CommentReference"/>
+          <w:sz w:val="24"/>
+          <w:szCs w:val="20"/>
+        </w:rPr>
+        <w:commentReference w:id="25"/>
+      </w:r>
+      <w:commentRangeEnd w:id="26"/>
+      <w:r>
+        <w:rPr>
+          <w:rStyle w:val="CommentReference"/>
+          <w:sz w:val="24"/>
+          <w:szCs w:val="20"/>
+        </w:rPr>
+        <w:commentReference w:id="26"/>
+      </w:r>
+      <w:r>
+        <w:t>shall be communicated to Senior</w:t>
+      </w:r>
+      <w:r>
+        <w:t xml:space="preserve"> Product Development and Quality Assurance</w:t>
+      </w:r>
+      <w:r>
+        <w:t xml:space="preserve"> Management.</w:t>
+      </w:r>
+    </w:p>
+    <w:p>
+      <w:pPr>
+        <w:pStyle w:val="Heading3"/>
+      </w:pPr>
+      <w:commentRangeStart w:id="27"/>
+      <w:commentRangeStart w:id="28"/>
+      <w:commentRangeStart w:id="29"/>
+      <w:commentRangeStart w:id="30"/>
+      <w:r>
         <w:t xml:space="preserve">A risk profile for </w:t>
       </w:r>
       <w:r>
@@ -5087,41 +5073,41 @@
       <w:r>
         <w:t xml:space="preserve"> product shall be established and reviewed periodically. </w:t>
       </w:r>
-      <w:commentRangeEnd w:id="23"/>
+      <w:commentRangeEnd w:id="27"/>
       <w:r>
         <w:rPr>
           <w:rStyle w:val="CommentReference"/>
-          <w:rFonts w:ascii="Arial" w:hAnsi="Arial"/>
-          <w:lang w:val="en-GB"/>
-        </w:rPr>
-        <w:commentReference w:id="23"/>
-      </w:r>
-      <w:commentRangeEnd w:id="24"/>
+          <w:sz w:val="24"/>
+          <w:szCs w:val="20"/>
+        </w:rPr>
+        <w:commentReference w:id="27"/>
+      </w:r>
+      <w:commentRangeEnd w:id="28"/>
       <w:r>
         <w:rPr>
           <w:rStyle w:val="CommentReference"/>
-          <w:rFonts w:ascii="Arial" w:hAnsi="Arial"/>
-          <w:lang w:val="en-GB"/>
-        </w:rPr>
-        <w:commentReference w:id="24"/>
-      </w:r>
-      <w:commentRangeEnd w:id="25"/>
+          <w:sz w:val="24"/>
+          <w:szCs w:val="20"/>
+        </w:rPr>
+        <w:commentReference w:id="28"/>
+      </w:r>
+      <w:commentRangeEnd w:id="29"/>
       <w:r>
         <w:rPr>
           <w:rStyle w:val="CommentReference"/>
-          <w:rFonts w:ascii="Arial" w:hAnsi="Arial"/>
-          <w:lang w:val="en-GB"/>
-        </w:rPr>
-        <w:commentReference w:id="25"/>
-      </w:r>
-      <w:commentRangeEnd w:id="26"/>
+          <w:sz w:val="24"/>
+          <w:szCs w:val="20"/>
+        </w:rPr>
+        <w:commentReference w:id="29"/>
+      </w:r>
+      <w:commentRangeEnd w:id="30"/>
       <w:r>
         <w:rPr>
           <w:rStyle w:val="CommentReference"/>
-          <w:rFonts w:ascii="Arial" w:hAnsi="Arial"/>
-          <w:lang w:val="en-GB"/>
-        </w:rPr>
-        <w:commentReference w:id="26"/>
+          <w:sz w:val="24"/>
+          <w:szCs w:val="20"/>
+        </w:rPr>
+        <w:commentReference w:id="30"/>
       </w:r>
     </w:p>
     <w:p>
@@ -5155,11 +5141,11 @@
                     <pic:cNvPicPr/>
                   </pic:nvPicPr>
                   <pic:blipFill>
-                    <a:blip r:embed="rId17">
+                    <a:blip r:embed="rId20">
                       <a:extLst>
                         <a:ext uri="{BEBA8EAE-BF5A-486C-A8C5-ECC9F3942E4B}">
                           <a14:imgProps xmlns:a14="http://schemas.microsoft.com/office/drawing/2010/main">
-                            <a14:imgLayer r:embed="rId18">
+                            <a14:imgLayer r:embed="rId21">
                               <a14:imgEffect>
                                 <a14:saturation sat="0"/>
                               </a14:imgEffect>
@@ -5197,7 +5183,7 @@
           <w:color w:val="auto"/>
         </w:rPr>
       </w:pPr>
-      <w:bookmarkStart w:id="27" w:name="_Ref40886545"/>
+      <w:bookmarkStart w:id="31" w:name="_Ref40886545"/>
       <w:r>
         <w:rPr>
           <w:rFonts w:ascii="Times New Roman" w:hAnsi="Times New Roman" w:cs="Times New Roman"/>
@@ -5259,7 +5245,7 @@
         </w:rPr>
         <w:fldChar w:fldCharType="end"/>
       </w:r>
-      <w:bookmarkEnd w:id="27"/>
+      <w:bookmarkEnd w:id="31"/>
       <w:r>
         <w:rPr>
           <w:rFonts w:ascii="Times New Roman" w:hAnsi="Times New Roman" w:cs="Times New Roman"/>
@@ -5271,9 +5257,9 @@
         </w:rPr>
         <w:t xml:space="preserve"> – Schematic Representation of the Risk Management </w:t>
       </w:r>
-      <w:commentRangeStart w:id="28"/>
-      <w:commentRangeStart w:id="29"/>
-      <w:commentRangeStart w:id="30"/>
+      <w:commentRangeStart w:id="32"/>
+      <w:commentRangeStart w:id="33"/>
+      <w:commentRangeStart w:id="34"/>
       <w:r>
         <w:rPr>
           <w:rFonts w:ascii="Times New Roman" w:hAnsi="Times New Roman" w:cs="Times New Roman"/>
@@ -5285,41 +5271,35 @@
         </w:rPr>
         <w:t>Process</w:t>
       </w:r>
-      <w:commentRangeEnd w:id="28"/>
+      <w:commentRangeEnd w:id="32"/>
       <w:r>
         <w:rPr>
           <w:rStyle w:val="CommentReference"/>
-          <w:rFonts w:ascii="Arial" w:eastAsia="Times New Roman" w:hAnsi="Arial" w:cs="Times New Roman"/>
-          <w:i w:val="0"/>
-          <w:iCs w:val="0"/>
           <w:color w:val="auto"/>
-          <w:lang w:val="en-GB"/>
-        </w:rPr>
-        <w:commentReference w:id="28"/>
-      </w:r>
-      <w:commentRangeEnd w:id="29"/>
+          <w:sz w:val="18"/>
+          <w:szCs w:val="18"/>
+        </w:rPr>
+        <w:commentReference w:id="32"/>
+      </w:r>
+      <w:commentRangeEnd w:id="33"/>
       <w:r>
         <w:rPr>
           <w:rStyle w:val="CommentReference"/>
-          <w:rFonts w:ascii="Arial" w:eastAsia="Times New Roman" w:hAnsi="Arial" w:cs="Times New Roman"/>
-          <w:i w:val="0"/>
-          <w:iCs w:val="0"/>
           <w:color w:val="auto"/>
-          <w:lang w:val="en-GB"/>
-        </w:rPr>
-        <w:commentReference w:id="29"/>
-      </w:r>
-      <w:commentRangeEnd w:id="30"/>
+          <w:sz w:val="18"/>
+          <w:szCs w:val="18"/>
+        </w:rPr>
+        <w:commentReference w:id="33"/>
+      </w:r>
+      <w:commentRangeEnd w:id="34"/>
       <w:r>
         <w:rPr>
           <w:rStyle w:val="CommentReference"/>
-          <w:rFonts w:ascii="Arial" w:eastAsia="Times New Roman" w:hAnsi="Arial" w:cs="Times New Roman"/>
-          <w:i w:val="0"/>
-          <w:iCs w:val="0"/>
           <w:color w:val="auto"/>
-          <w:lang w:val="en-GB"/>
-        </w:rPr>
-        <w:commentReference w:id="30"/>
+          <w:sz w:val="18"/>
+          <w:szCs w:val="18"/>
+        </w:rPr>
+        <w:commentReference w:id="34"/>
       </w:r>
     </w:p>
     <w:p>
@@ -5342,7 +5322,7 @@
       <w:pPr>
         <w:pStyle w:val="Heading3"/>
       </w:pPr>
-      <w:commentRangeStart w:id="31"/>
+      <w:commentRangeStart w:id="35"/>
       <w:r>
         <w:lastRenderedPageBreak/>
         <w:t xml:space="preserve">Risk management activities shall be planned.  </w:t>
@@ -5373,18 +5353,18 @@
       <w:r>
         <w:t xml:space="preserve">lan shall be documented and </w:t>
       </w:r>
-      <w:commentRangeStart w:id="32"/>
+      <w:commentRangeStart w:id="36"/>
       <w:r>
         <w:t>shall include the following</w:t>
       </w:r>
-      <w:commentRangeEnd w:id="32"/>
+      <w:commentRangeEnd w:id="36"/>
       <w:r>
         <w:rPr>
           <w:rStyle w:val="CommentReference"/>
-          <w:rFonts w:ascii="Arial" w:hAnsi="Arial"/>
-          <w:lang w:val="en-GB"/>
-        </w:rPr>
-        <w:commentReference w:id="32"/>
+          <w:sz w:val="24"/>
+          <w:szCs w:val="20"/>
+        </w:rPr>
+        <w:commentReference w:id="36"/>
       </w:r>
       <w:r>
         <w:t>, at a minimum</w:t>
@@ -5392,14 +5372,14 @@
       <w:r>
         <w:t>:</w:t>
       </w:r>
-      <w:commentRangeEnd w:id="31"/>
+      <w:commentRangeEnd w:id="35"/>
       <w:r>
         <w:rPr>
           <w:rStyle w:val="CommentReference"/>
-          <w:rFonts w:ascii="Arial" w:hAnsi="Arial"/>
-          <w:lang w:val="en-GB"/>
-        </w:rPr>
-        <w:commentReference w:id="31"/>
+          <w:sz w:val="24"/>
+          <w:szCs w:val="20"/>
+        </w:rPr>
+        <w:commentReference w:id="35"/>
       </w:r>
     </w:p>
     <w:p>
@@ -5620,7 +5600,7 @@
       <w:pPr>
         <w:pStyle w:val="Heading3"/>
       </w:pPr>
-      <w:commentRangeStart w:id="33"/>
+      <w:commentRangeStart w:id="37"/>
       <w:r>
         <w:t xml:space="preserve">Categories of risk and criteria for risk acceptability, in accordance with this procedure, including criteria for accepting risks when the probability of occurrence of harm cannot be estimated. The risk acceptance criteria is based on the following </w:t>
       </w:r>
@@ -5628,14 +5608,14 @@
         <w:lastRenderedPageBreak/>
         <w:t>decisions:</w:t>
       </w:r>
-      <w:commentRangeEnd w:id="33"/>
+      <w:commentRangeEnd w:id="37"/>
       <w:r>
         <w:rPr>
           <w:rStyle w:val="CommentReference"/>
-          <w:rFonts w:ascii="Arial" w:hAnsi="Arial"/>
-          <w:lang w:val="en-GB"/>
-        </w:rPr>
-        <w:commentReference w:id="33"/>
+          <w:sz w:val="24"/>
+          <w:szCs w:val="20"/>
+        </w:rPr>
+        <w:commentReference w:id="37"/>
       </w:r>
     </w:p>
     <w:p>
@@ -5714,7 +5694,7 @@
       <w:pPr>
         <w:pStyle w:val="Heading3"/>
       </w:pPr>
-      <w:commentRangeStart w:id="34"/>
+      <w:commentRangeStart w:id="38"/>
       <w:r>
         <w:t>The evaluation method and criteria for acceptability for the overall residual risk, considering all the impact of all risks together, shall be clearly defined and documented</w:t>
       </w:r>
@@ -5724,32 +5704,32 @@
       <w:r>
         <w:t>.</w:t>
       </w:r>
-      <w:commentRangeEnd w:id="34"/>
+      <w:commentRangeEnd w:id="38"/>
       <w:r>
         <w:rPr>
           <w:rStyle w:val="CommentReference"/>
-          <w:rFonts w:ascii="Arial" w:hAnsi="Arial"/>
-          <w:lang w:val="en-GB"/>
-        </w:rPr>
-        <w:commentReference w:id="34"/>
+          <w:sz w:val="24"/>
+          <w:szCs w:val="20"/>
+        </w:rPr>
+        <w:commentReference w:id="38"/>
       </w:r>
     </w:p>
     <w:p>
       <w:pPr>
         <w:pStyle w:val="Heading3"/>
       </w:pPr>
-      <w:commentRangeStart w:id="35"/>
+      <w:commentRangeStart w:id="39"/>
       <w:r>
         <w:t>Verification and/or validation activities required to verify effectiveness of risk control measures</w:t>
       </w:r>
-      <w:commentRangeEnd w:id="35"/>
+      <w:commentRangeEnd w:id="39"/>
       <w:r>
         <w:rPr>
           <w:rStyle w:val="CommentReference"/>
-          <w:rFonts w:ascii="Arial" w:hAnsi="Arial"/>
-          <w:lang w:val="en-GB"/>
-        </w:rPr>
-        <w:commentReference w:id="35"/>
+          <w:sz w:val="24"/>
+          <w:szCs w:val="20"/>
+        </w:rPr>
+        <w:commentReference w:id="39"/>
       </w:r>
       <w:r>
         <w:t>.</w:t>
@@ -5818,18 +5798,18 @@
       <w:pPr>
         <w:pStyle w:val="Heading3"/>
       </w:pPr>
-      <w:commentRangeStart w:id="36"/>
+      <w:commentRangeStart w:id="40"/>
       <w:r>
         <w:t xml:space="preserve">Method(s) for obtaining and reviewing relevant product-specific production and post-production information, including requirements for documentation of decisions, based on a risk analysis, with regards to post-market surveillance activities appropriate for the product. </w:t>
       </w:r>
-      <w:commentRangeEnd w:id="36"/>
+      <w:commentRangeEnd w:id="40"/>
       <w:r>
         <w:rPr>
           <w:rStyle w:val="CommentReference"/>
-          <w:rFonts w:ascii="Arial" w:hAnsi="Arial"/>
-          <w:lang w:val="en-GB"/>
-        </w:rPr>
-        <w:commentReference w:id="36"/>
+          <w:sz w:val="24"/>
+          <w:szCs w:val="20"/>
+        </w:rPr>
+        <w:commentReference w:id="40"/>
       </w:r>
     </w:p>
     <w:p>
@@ -5843,8 +5823,8 @@
       <w:r>
         <w:t xml:space="preserve">At a minimum, data from the </w:t>
       </w:r>
-      <w:commentRangeStart w:id="37"/>
-      <w:commentRangeStart w:id="38"/>
+      <w:commentRangeStart w:id="41"/>
+      <w:commentRangeStart w:id="42"/>
       <w:r>
         <w:t>complaint handling process</w:t>
       </w:r>
@@ -5854,23 +5834,23 @@
       <w:r>
         <w:t xml:space="preserve"> </w:t>
       </w:r>
-      <w:commentRangeEnd w:id="37"/>
+      <w:commentRangeEnd w:id="41"/>
       <w:r>
         <w:rPr>
           <w:rStyle w:val="CommentReference"/>
-          <w:rFonts w:ascii="Arial" w:hAnsi="Arial"/>
-          <w:lang w:val="en-GB"/>
-        </w:rPr>
-        <w:commentReference w:id="37"/>
-      </w:r>
-      <w:commentRangeEnd w:id="38"/>
+          <w:sz w:val="24"/>
+          <w:szCs w:val="20"/>
+        </w:rPr>
+        <w:commentReference w:id="41"/>
+      </w:r>
+      <w:commentRangeEnd w:id="42"/>
       <w:r>
         <w:rPr>
           <w:rStyle w:val="CommentReference"/>
-          <w:rFonts w:ascii="Arial" w:hAnsi="Arial"/>
-          <w:lang w:val="en-GB"/>
-        </w:rPr>
-        <w:commentReference w:id="38"/>
+          <w:sz w:val="24"/>
+          <w:szCs w:val="20"/>
+        </w:rPr>
+        <w:commentReference w:id="42"/>
       </w:r>
       <w:r>
         <w:t>shall be used as part of the residual risk analysis. Potential sources of post-production information may include, but are not limited to:</w:t>
@@ -5931,38 +5911,38 @@
       <w:r>
         <w:t xml:space="preserve">The risk management plan should include documentation of decisions, based on risk analysis, about </w:t>
       </w:r>
-      <w:commentRangeStart w:id="39"/>
-      <w:commentRangeStart w:id="40"/>
-      <w:commentRangeStart w:id="41"/>
+      <w:commentRangeStart w:id="43"/>
+      <w:commentRangeStart w:id="44"/>
+      <w:commentRangeStart w:id="45"/>
       <w:r>
         <w:t xml:space="preserve">what sort of post-market surveillance </w:t>
       </w:r>
-      <w:commentRangeEnd w:id="39"/>
+      <w:commentRangeEnd w:id="43"/>
       <w:r>
         <w:rPr>
           <w:rStyle w:val="CommentReference"/>
-          <w:rFonts w:ascii="Arial" w:hAnsi="Arial"/>
-          <w:lang w:val="en-GB"/>
-        </w:rPr>
-        <w:commentReference w:id="39"/>
-      </w:r>
-      <w:commentRangeEnd w:id="40"/>
+          <w:sz w:val="24"/>
+          <w:szCs w:val="20"/>
+        </w:rPr>
+        <w:commentReference w:id="43"/>
+      </w:r>
+      <w:commentRangeEnd w:id="44"/>
       <w:r>
         <w:rPr>
           <w:rStyle w:val="CommentReference"/>
-          <w:rFonts w:ascii="Arial" w:hAnsi="Arial"/>
-          <w:lang w:val="en-GB"/>
-        </w:rPr>
-        <w:commentReference w:id="40"/>
-      </w:r>
-      <w:commentRangeEnd w:id="41"/>
+          <w:sz w:val="24"/>
+          <w:szCs w:val="20"/>
+        </w:rPr>
+        <w:commentReference w:id="44"/>
+      </w:r>
+      <w:commentRangeEnd w:id="45"/>
       <w:r>
         <w:rPr>
           <w:rStyle w:val="CommentReference"/>
-          <w:rFonts w:ascii="Arial" w:hAnsi="Arial"/>
-          <w:lang w:val="en-GB"/>
-        </w:rPr>
-        <w:commentReference w:id="41"/>
+          <w:sz w:val="24"/>
+          <w:szCs w:val="20"/>
+        </w:rPr>
+        <w:commentReference w:id="45"/>
       </w:r>
       <w:r>
         <w:t>is appropriate for the  combination product. For example, whether reactive surveillance is adequate or whether proactive studies are needed.</w:t>
@@ -5992,18 +5972,18 @@
       <w:pPr>
         <w:pStyle w:val="Heading3"/>
       </w:pPr>
-      <w:commentRangeStart w:id="42"/>
+      <w:commentRangeStart w:id="46"/>
       <w:r>
         <w:t>The risk management plan shall be reviewed periodically at specified time intervals.  The review shall be conducted to ensure the plan content is accurate, current and compliant with requirements in this procedure, and that the risk management plan has been implemented appropriately.</w:t>
       </w:r>
-      <w:commentRangeEnd w:id="42"/>
+      <w:commentRangeEnd w:id="46"/>
       <w:r>
         <w:rPr>
           <w:rStyle w:val="CommentReference"/>
-          <w:rFonts w:ascii="Arial" w:hAnsi="Arial"/>
-          <w:lang w:val="en-GB"/>
-        </w:rPr>
-        <w:commentReference w:id="42"/>
+          <w:sz w:val="24"/>
+          <w:szCs w:val="20"/>
+        </w:rPr>
+        <w:commentReference w:id="46"/>
       </w:r>
     </w:p>
     <w:p>
@@ -6322,25 +6302,25 @@
       <w:r>
         <w:t xml:space="preserve">. </w:t>
       </w:r>
-      <w:commentRangeStart w:id="43"/>
-      <w:commentRangeStart w:id="44"/>
-      <w:commentRangeEnd w:id="43"/>
+      <w:commentRangeStart w:id="47"/>
+      <w:commentRangeStart w:id="48"/>
+      <w:commentRangeEnd w:id="47"/>
       <w:r>
         <w:rPr>
           <w:rStyle w:val="CommentReference"/>
-          <w:rFonts w:ascii="Arial" w:hAnsi="Arial"/>
-          <w:lang w:val="en-GB"/>
-        </w:rPr>
-        <w:commentReference w:id="43"/>
-      </w:r>
-      <w:commentRangeEnd w:id="44"/>
+          <w:sz w:val="24"/>
+          <w:szCs w:val="20"/>
+        </w:rPr>
+        <w:commentReference w:id="47"/>
+      </w:r>
+      <w:commentRangeEnd w:id="48"/>
       <w:r>
         <w:rPr>
           <w:rStyle w:val="CommentReference"/>
-          <w:rFonts w:ascii="Arial" w:hAnsi="Arial"/>
-          <w:lang w:val="en-GB"/>
-        </w:rPr>
-        <w:commentReference w:id="44"/>
+          <w:sz w:val="24"/>
+          <w:szCs w:val="20"/>
+        </w:rPr>
+        <w:commentReference w:id="48"/>
       </w:r>
     </w:p>
     <w:p>
@@ -6922,7 +6902,7 @@
       <w:r>
         <w:t xml:space="preserve">.  </w:t>
       </w:r>
-      <w:commentRangeStart w:id="45"/>
+      <w:commentRangeStart w:id="49"/>
       <w:r>
         <w:t>Any alternative definitions shall be documented</w:t>
       </w:r>
@@ -6932,14 +6912,14 @@
       <w:r>
         <w:t>.</w:t>
       </w:r>
-      <w:commentRangeEnd w:id="45"/>
+      <w:commentRangeEnd w:id="49"/>
       <w:r>
         <w:rPr>
           <w:rStyle w:val="CommentReference"/>
-          <w:rFonts w:ascii="Arial" w:hAnsi="Arial"/>
-          <w:lang w:val="en-GB"/>
-        </w:rPr>
-        <w:commentReference w:id="45"/>
+          <w:sz w:val="24"/>
+          <w:szCs w:val="20"/>
+        </w:rPr>
+        <w:commentReference w:id="49"/>
       </w:r>
     </w:p>
     <w:p>
@@ -6965,7 +6945,7 @@
         <w:ind w:left="2347" w:right="-274"/>
         <w:contextualSpacing w:val="0"/>
       </w:pPr>
-      <w:commentRangeStart w:id="46"/>
+      <w:commentRangeStart w:id="50"/>
       <w:r>
         <w:t xml:space="preserve">For the </w:t>
       </w:r>
@@ -6975,14 +6955,14 @@
       <w:r>
         <w:t xml:space="preserve"> product being considered, the Applicant shall document the intended use and reasonably foreseeable misuse.  </w:t>
       </w:r>
-      <w:commentRangeEnd w:id="46"/>
+      <w:commentRangeEnd w:id="50"/>
       <w:r>
         <w:rPr>
           <w:rStyle w:val="CommentReference"/>
-          <w:rFonts w:ascii="Arial" w:hAnsi="Arial"/>
-          <w:lang w:val="en-GB"/>
-        </w:rPr>
-        <w:commentReference w:id="46"/>
+          <w:sz w:val="24"/>
+          <w:szCs w:val="20"/>
+        </w:rPr>
+        <w:commentReference w:id="50"/>
       </w:r>
       <w:r>
         <w:t xml:space="preserve">The intended use should </w:t>
@@ -7024,18 +7004,18 @@
       <w:r>
         <w:t>The Applicant shall identify and</w:t>
       </w:r>
-      <w:commentRangeStart w:id="47"/>
+      <w:commentRangeStart w:id="51"/>
       <w:r>
         <w:t xml:space="preserve"> document </w:t>
       </w:r>
-      <w:commentRangeEnd w:id="47"/>
+      <w:commentRangeEnd w:id="51"/>
       <w:r>
         <w:rPr>
           <w:rStyle w:val="CommentReference"/>
-          <w:rFonts w:ascii="Arial" w:hAnsi="Arial"/>
-          <w:lang w:val="en-GB"/>
-        </w:rPr>
-        <w:commentReference w:id="47"/>
+          <w:sz w:val="24"/>
+          <w:szCs w:val="20"/>
+        </w:rPr>
+        <w:commentReference w:id="51"/>
       </w:r>
       <w:r>
         <w:t xml:space="preserve">those qualitative and quantitative characteristics that could affect the safety of </w:t>
@@ -7068,14 +7048,14 @@
       <w:r>
         <w:t xml:space="preserve">of </w:t>
       </w:r>
-      <w:bookmarkStart w:id="48" w:name="_Hlk118151576"/>
+      <w:bookmarkStart w:id="52" w:name="_Hlk118151576"/>
       <w:r>
         <w:t>ISO</w:t>
       </w:r>
       <w:r>
         <w:t xml:space="preserve"> 24971</w:t>
       </w:r>
-      <w:bookmarkEnd w:id="48"/>
+      <w:bookmarkEnd w:id="52"/>
       <w:r>
         <w:t>:20</w:t>
       </w:r>
@@ -7095,63 +7075,63 @@
       <w:r>
         <w:t xml:space="preserve"> safety such as those relating to use that can serve as a </w:t>
       </w:r>
-      <w:commentRangeStart w:id="49"/>
-      <w:commentRangeStart w:id="50"/>
-      <w:commentRangeStart w:id="51"/>
-      <w:commentRangeStart w:id="52"/>
+      <w:commentRangeStart w:id="53"/>
+      <w:commentRangeStart w:id="54"/>
+      <w:commentRangeStart w:id="55"/>
+      <w:commentRangeStart w:id="56"/>
       <w:r>
         <w:t xml:space="preserve">guide </w:t>
       </w:r>
-      <w:commentRangeEnd w:id="49"/>
+      <w:commentRangeEnd w:id="53"/>
       <w:r>
         <w:rPr>
           <w:rStyle w:val="CommentReference"/>
-          <w:rFonts w:ascii="Arial" w:hAnsi="Arial"/>
-          <w:lang w:val="en-GB"/>
-        </w:rPr>
-        <w:commentReference w:id="49"/>
-      </w:r>
-      <w:commentRangeEnd w:id="50"/>
+          <w:sz w:val="24"/>
+          <w:szCs w:val="20"/>
+        </w:rPr>
+        <w:commentReference w:id="53"/>
+      </w:r>
+      <w:commentRangeEnd w:id="54"/>
       <w:r>
         <w:rPr>
           <w:rStyle w:val="CommentReference"/>
-          <w:rFonts w:ascii="Arial" w:hAnsi="Arial"/>
-          <w:lang w:val="en-GB"/>
-        </w:rPr>
-        <w:commentReference w:id="50"/>
-      </w:r>
-      <w:commentRangeEnd w:id="51"/>
+          <w:sz w:val="24"/>
+          <w:szCs w:val="20"/>
+        </w:rPr>
+        <w:commentReference w:id="54"/>
+      </w:r>
+      <w:commentRangeEnd w:id="55"/>
       <w:r>
         <w:rPr>
           <w:rStyle w:val="CommentReference"/>
-          <w:rFonts w:ascii="Arial" w:hAnsi="Arial"/>
-          <w:lang w:val="en-GB"/>
-        </w:rPr>
-        <w:commentReference w:id="51"/>
-      </w:r>
-      <w:commentRangeEnd w:id="52"/>
+          <w:sz w:val="24"/>
+          <w:szCs w:val="20"/>
+        </w:rPr>
+        <w:commentReference w:id="55"/>
+      </w:r>
+      <w:commentRangeEnd w:id="56"/>
       <w:r>
         <w:rPr>
           <w:rStyle w:val="CommentReference"/>
-          <w:rFonts w:ascii="Arial" w:hAnsi="Arial"/>
-          <w:lang w:val="en-GB"/>
-        </w:rPr>
-        <w:commentReference w:id="52"/>
+          <w:sz w:val="24"/>
+          <w:szCs w:val="20"/>
+        </w:rPr>
+        <w:commentReference w:id="56"/>
       </w:r>
       <w:r>
         <w:t>in identifying combination product characteristics that could have an impact on safety.</w:t>
       </w:r>
-      <w:ins w:id="53" w:author="Sandra Regnell [2]" w:date="2023-02-08T11:06:00Z">
+      <w:ins w:id="57" w:author="Sandra Regnell [2]" w:date="2023-02-08T11:06:00Z">
         <w:r>
           <w:t xml:space="preserve"> </w:t>
         </w:r>
       </w:ins>
-      <w:ins w:id="54" w:author="Sandra Regnell [2]" w:date="2023-02-08T20:09:00Z">
+      <w:ins w:id="58" w:author="Sandra Regnell [2]" w:date="2023-02-08T20:09:00Z">
         <w:r>
           <w:t>Considerations for Safety</w:t>
         </w:r>
       </w:ins>
-      <w:ins w:id="55" w:author="Sandra Regnell [2]" w:date="2023-02-08T11:07:00Z">
+      <w:ins w:id="59" w:author="Sandra Regnell [2]" w:date="2023-02-08T11:07:00Z">
         <w:r>
           <w:t xml:space="preserve"> are listed in Appendix A.</w:t>
         </w:r>
@@ -7159,37 +7139,37 @@
       <w:r>
         <w:t xml:space="preserve"> </w:t>
       </w:r>
-      <w:ins w:id="56" w:author="Sandra Regnell [2]" w:date="2023-02-08T21:01:00Z">
+      <w:ins w:id="60" w:author="Sandra Regnell [2]" w:date="2023-02-08T21:01:00Z">
         <w:r>
           <w:t xml:space="preserve">Examples of Hazards </w:t>
         </w:r>
       </w:ins>
-      <w:ins w:id="57" w:author="Sandra Regnell [2]" w:date="2023-02-09T11:57:00Z">
+      <w:ins w:id="61" w:author="Sandra Regnell [2]" w:date="2023-02-09T11:57:00Z">
         <w:r>
           <w:t>from ISO 14971</w:t>
         </w:r>
       </w:ins>
-      <w:ins w:id="58" w:author="Sandra Regnell [2]" w:date="2023-02-09T11:58:00Z">
+      <w:ins w:id="62" w:author="Sandra Regnell [2]" w:date="2023-02-09T11:58:00Z">
         <w:r>
           <w:t xml:space="preserve">:2019, </w:t>
         </w:r>
       </w:ins>
-      <w:ins w:id="59" w:author="Sandra Regnell [2]" w:date="2023-02-15T09:39:00Z">
+      <w:ins w:id="63" w:author="Sandra Regnell [2]" w:date="2023-02-15T09:39:00Z">
         <w:r>
           <w:t>Annex</w:t>
         </w:r>
       </w:ins>
-      <w:ins w:id="60" w:author="Sandra Regnell [2]" w:date="2023-02-09T11:58:00Z">
+      <w:ins w:id="64" w:author="Sandra Regnell [2]" w:date="2023-02-09T11:58:00Z">
         <w:r>
           <w:t xml:space="preserve"> C </w:t>
         </w:r>
       </w:ins>
-      <w:ins w:id="61" w:author="Sandra Regnell [2]" w:date="2023-02-08T21:01:00Z">
+      <w:ins w:id="65" w:author="Sandra Regnell [2]" w:date="2023-02-08T21:01:00Z">
         <w:r>
           <w:t>are listed in Appendix B.</w:t>
         </w:r>
       </w:ins>
-      <w:ins w:id="62" w:author="Sandra Regnell [2]" w:date="2023-02-09T11:58:00Z">
+      <w:ins w:id="66" w:author="Sandra Regnell [2]" w:date="2023-02-09T11:58:00Z">
         <w:r>
           <w:t xml:space="preserve">  Both appendices are modified, removing items that are not relevant to our devices. </w:t>
         </w:r>
@@ -7234,28 +7214,28 @@
       <w:r>
         <w:t>The risk analysis shall identify and</w:t>
       </w:r>
-      <w:commentRangeStart w:id="63"/>
-      <w:commentRangeStart w:id="64"/>
+      <w:commentRangeStart w:id="67"/>
+      <w:commentRangeStart w:id="68"/>
       <w:r>
         <w:t xml:space="preserve"> document </w:t>
       </w:r>
-      <w:commentRangeEnd w:id="63"/>
+      <w:commentRangeEnd w:id="67"/>
       <w:r>
         <w:rPr>
           <w:rStyle w:val="CommentReference"/>
-          <w:rFonts w:ascii="Arial" w:hAnsi="Arial"/>
-          <w:lang w:val="en-GB"/>
-        </w:rPr>
-        <w:commentReference w:id="63"/>
-      </w:r>
-      <w:commentRangeEnd w:id="64"/>
+          <w:sz w:val="24"/>
+          <w:szCs w:val="20"/>
+        </w:rPr>
+        <w:commentReference w:id="67"/>
+      </w:r>
+      <w:commentRangeEnd w:id="68"/>
       <w:r>
         <w:rPr>
           <w:rStyle w:val="CommentReference"/>
-          <w:rFonts w:ascii="Arial" w:hAnsi="Arial"/>
-          <w:lang w:val="en-GB"/>
-        </w:rPr>
-        <w:commentReference w:id="64"/>
+          <w:sz w:val="24"/>
+          <w:szCs w:val="20"/>
+        </w:rPr>
+        <w:commentReference w:id="68"/>
       </w:r>
       <w:r>
         <w:t>the known and foreseeable hazards associated with the combination product based on the intended use, reasonably foreseeable misuse and the characteristics related to safety in both normal and fault conditions.</w:t>
@@ -7292,18 +7272,18 @@
       <w:r>
         <w:t xml:space="preserve">For each identified hazard, the reasonably foreseeable sequences or combinations of events that can result in a hazardous situation shall be considered and the hazardous situations shall be identified </w:t>
       </w:r>
-      <w:commentRangeStart w:id="65"/>
+      <w:commentRangeStart w:id="69"/>
       <w:r>
         <w:t xml:space="preserve">and documented </w:t>
       </w:r>
-      <w:commentRangeEnd w:id="65"/>
+      <w:commentRangeEnd w:id="69"/>
       <w:r>
         <w:rPr>
           <w:rStyle w:val="CommentReference"/>
-          <w:rFonts w:ascii="Arial" w:hAnsi="Arial"/>
-          <w:lang w:val="en-GB"/>
-        </w:rPr>
-        <w:commentReference w:id="65"/>
+          <w:sz w:val="24"/>
+          <w:szCs w:val="20"/>
+        </w:rPr>
+        <w:commentReference w:id="69"/>
       </w:r>
       <w:r>
         <w:t xml:space="preserve">in the </w:t>
@@ -7552,23 +7532,23 @@
       <w:r>
         <w:t xml:space="preserve">A reasonably foreseeable sequence of events or cause(s) is the process that results in a hazardous situation (exposure to a hazard).  The risk analysis shall identify and </w:t>
       </w:r>
-      <w:commentRangeStart w:id="66"/>
+      <w:commentRangeStart w:id="70"/>
       <w:r>
         <w:t xml:space="preserve">document </w:t>
       </w:r>
-      <w:commentRangeEnd w:id="66"/>
+      <w:commentRangeEnd w:id="70"/>
       <w:r>
         <w:rPr>
           <w:rStyle w:val="CommentReference"/>
-          <w:rFonts w:ascii="Arial" w:hAnsi="Arial"/>
-          <w:lang w:val="en-GB"/>
-        </w:rPr>
-        <w:commentReference w:id="66"/>
+          <w:sz w:val="24"/>
+          <w:szCs w:val="20"/>
+        </w:rPr>
+        <w:commentReference w:id="70"/>
       </w:r>
       <w:r>
         <w:t>sequences of events or cause(s) for each hazard that could result in a hazardous situation.</w:t>
       </w:r>
-      <w:ins w:id="67" w:author="Sandra Regnell [2]" w:date="2022-11-28T21:20:00Z">
+      <w:ins w:id="71" w:author="Sandra Regnell [2]" w:date="2022-11-28T21:20:00Z">
         <w:r>
           <w:t xml:space="preserve"> </w:t>
         </w:r>
@@ -7696,18 +7676,18 @@
       <w:r>
         <w:t xml:space="preserve">For each identified hazardous situation, the associated risk(s) shall be estimated using available information or data.  For hazardous situations for which the probability of the occurrence of harm cannot be estimated, the possible consequences shall be listed for use in risk evaluation and risk control.  The results of these activities shall be </w:t>
       </w:r>
-      <w:commentRangeStart w:id="68"/>
+      <w:commentRangeStart w:id="72"/>
       <w:r>
         <w:t>recorded</w:t>
       </w:r>
-      <w:commentRangeEnd w:id="68"/>
+      <w:commentRangeEnd w:id="72"/>
       <w:r>
         <w:rPr>
           <w:rStyle w:val="CommentReference"/>
-          <w:rFonts w:ascii="Arial" w:hAnsi="Arial"/>
-          <w:lang w:val="en-GB"/>
-        </w:rPr>
-        <w:commentReference w:id="68"/>
+          <w:sz w:val="24"/>
+          <w:szCs w:val="20"/>
+        </w:rPr>
+        <w:commentReference w:id="72"/>
       </w:r>
       <w:r>
         <w:t xml:space="preserve"> in </w:t>
@@ -8145,7 +8125,7 @@
           <w:szCs w:val="22"/>
         </w:rPr>
       </w:pPr>
-      <w:bookmarkStart w:id="69" w:name="_Hlk126069837"/>
+      <w:bookmarkStart w:id="73" w:name="_Hlk126069837"/>
       <w:r>
         <w:rPr>
           <w:rFonts w:ascii="Times New Roman" w:hAnsi="Times New Roman" w:cs="Times New Roman"/>
@@ -9011,7 +8991,7 @@
           </w:p>
         </w:tc>
       </w:tr>
-      <w:bookmarkEnd w:id="69"/>
+      <w:bookmarkEnd w:id="73"/>
     </w:tbl>
     <w:p/>
     <w:p>
@@ -9079,7 +9059,7 @@
           <w:szCs w:val="22"/>
         </w:rPr>
       </w:pPr>
-      <w:bookmarkStart w:id="70" w:name="_Hlk126069870"/>
+      <w:bookmarkStart w:id="74" w:name="_Hlk126069870"/>
       <w:r>
         <w:rPr>
           <w:rFonts w:ascii="Times New Roman" w:hAnsi="Times New Roman" w:cs="Times New Roman"/>
@@ -9294,7 +9274,6 @@
               <w:bottom w:val="single" w:sz="4" w:space="0" w:color="auto"/>
               <w:right w:val="single" w:sz="4" w:space="0" w:color="auto"/>
             </w:tcBorders>
-            <w:shd w:val="clear" w:color="auto" w:fill="auto"/>
             <w:noWrap/>
             <w:vAlign w:val="center"/>
             <w:hideMark/>
@@ -9325,7 +9304,6 @@
               <w:bottom w:val="single" w:sz="4" w:space="0" w:color="auto"/>
               <w:right w:val="single" w:sz="4" w:space="0" w:color="auto"/>
             </w:tcBorders>
-            <w:shd w:val="clear" w:color="auto" w:fill="auto"/>
             <w:noWrap/>
             <w:vAlign w:val="center"/>
             <w:hideMark/>
@@ -9348,7 +9326,6 @@
               <w:bottom w:val="single" w:sz="4" w:space="0" w:color="auto"/>
               <w:right w:val="single" w:sz="8" w:space="0" w:color="auto"/>
             </w:tcBorders>
-            <w:shd w:val="clear" w:color="auto" w:fill="auto"/>
             <w:noWrap/>
             <w:vAlign w:val="bottom"/>
             <w:hideMark/>
@@ -9383,7 +9360,6 @@
               <w:bottom w:val="single" w:sz="4" w:space="0" w:color="auto"/>
               <w:right w:val="single" w:sz="4" w:space="0" w:color="auto"/>
             </w:tcBorders>
-            <w:shd w:val="clear" w:color="auto" w:fill="auto"/>
             <w:noWrap/>
             <w:vAlign w:val="center"/>
             <w:hideMark/>
@@ -9414,7 +9390,6 @@
               <w:bottom w:val="single" w:sz="4" w:space="0" w:color="auto"/>
               <w:right w:val="single" w:sz="4" w:space="0" w:color="auto"/>
             </w:tcBorders>
-            <w:shd w:val="clear" w:color="auto" w:fill="auto"/>
             <w:noWrap/>
             <w:vAlign w:val="center"/>
             <w:hideMark/>
@@ -9437,27 +9412,26 @@
               <w:bottom w:val="single" w:sz="4" w:space="0" w:color="auto"/>
               <w:right w:val="single" w:sz="8" w:space="0" w:color="auto"/>
             </w:tcBorders>
-            <w:shd w:val="clear" w:color="auto" w:fill="auto"/>
             <w:noWrap/>
             <w:vAlign w:val="bottom"/>
             <w:hideMark/>
           </w:tcPr>
           <w:p>
-            <w:commentRangeStart w:id="71"/>
+            <w:commentRangeStart w:id="75"/>
             <w:r>
               <w:t xml:space="preserve">Critical - Results in permanent impairment or </w:t>
             </w:r>
             <w:r>
               <w:t>irreversible injury</w:t>
             </w:r>
-            <w:commentRangeEnd w:id="71"/>
+            <w:commentRangeEnd w:id="75"/>
             <w:r>
               <w:rPr>
                 <w:rStyle w:val="CommentReference"/>
-                <w:rFonts w:ascii="Arial" w:hAnsi="Arial"/>
-                <w:lang w:val="en-GB"/>
-              </w:rPr>
-              <w:commentReference w:id="71"/>
+                <w:sz w:val="24"/>
+                <w:szCs w:val="20"/>
+              </w:rPr>
+              <w:commentReference w:id="75"/>
             </w:r>
           </w:p>
         </w:tc>
@@ -9476,7 +9450,6 @@
               <w:bottom w:val="single" w:sz="4" w:space="0" w:color="auto"/>
               <w:right w:val="single" w:sz="4" w:space="0" w:color="auto"/>
             </w:tcBorders>
-            <w:shd w:val="clear" w:color="auto" w:fill="auto"/>
             <w:noWrap/>
             <w:vAlign w:val="center"/>
             <w:hideMark/>
@@ -9507,7 +9480,6 @@
               <w:bottom w:val="single" w:sz="4" w:space="0" w:color="auto"/>
               <w:right w:val="single" w:sz="4" w:space="0" w:color="auto"/>
             </w:tcBorders>
-            <w:shd w:val="clear" w:color="auto" w:fill="auto"/>
             <w:noWrap/>
             <w:vAlign w:val="center"/>
             <w:hideMark/>
@@ -9530,7 +9502,6 @@
               <w:bottom w:val="single" w:sz="4" w:space="0" w:color="auto"/>
               <w:right w:val="single" w:sz="8" w:space="0" w:color="auto"/>
             </w:tcBorders>
-            <w:shd w:val="clear" w:color="auto" w:fill="auto"/>
             <w:noWrap/>
             <w:vAlign w:val="bottom"/>
             <w:hideMark/>
@@ -9556,7 +9527,6 @@
               <w:bottom w:val="single" w:sz="4" w:space="0" w:color="auto"/>
               <w:right w:val="single" w:sz="4" w:space="0" w:color="auto"/>
             </w:tcBorders>
-            <w:shd w:val="clear" w:color="auto" w:fill="auto"/>
             <w:noWrap/>
             <w:vAlign w:val="center"/>
             <w:hideMark/>
@@ -9587,7 +9557,6 @@
               <w:bottom w:val="single" w:sz="4" w:space="0" w:color="auto"/>
               <w:right w:val="single" w:sz="4" w:space="0" w:color="auto"/>
             </w:tcBorders>
-            <w:shd w:val="clear" w:color="auto" w:fill="auto"/>
             <w:noWrap/>
             <w:vAlign w:val="center"/>
             <w:hideMark/>
@@ -9610,7 +9579,6 @@
               <w:bottom w:val="single" w:sz="4" w:space="0" w:color="auto"/>
               <w:right w:val="single" w:sz="8" w:space="0" w:color="auto"/>
             </w:tcBorders>
-            <w:shd w:val="clear" w:color="auto" w:fill="auto"/>
             <w:noWrap/>
             <w:vAlign w:val="bottom"/>
             <w:hideMark/>
@@ -9636,7 +9604,6 @@
               <w:bottom w:val="single" w:sz="8" w:space="0" w:color="auto"/>
               <w:right w:val="single" w:sz="4" w:space="0" w:color="auto"/>
             </w:tcBorders>
-            <w:shd w:val="clear" w:color="auto" w:fill="auto"/>
             <w:noWrap/>
             <w:vAlign w:val="center"/>
             <w:hideMark/>
@@ -9667,7 +9634,6 @@
               <w:bottom w:val="single" w:sz="8" w:space="0" w:color="auto"/>
               <w:right w:val="single" w:sz="4" w:space="0" w:color="auto"/>
             </w:tcBorders>
-            <w:shd w:val="clear" w:color="auto" w:fill="auto"/>
             <w:noWrap/>
             <w:vAlign w:val="center"/>
             <w:hideMark/>
@@ -9690,7 +9656,6 @@
               <w:bottom w:val="single" w:sz="8" w:space="0" w:color="auto"/>
               <w:right w:val="single" w:sz="8" w:space="0" w:color="auto"/>
             </w:tcBorders>
-            <w:shd w:val="clear" w:color="auto" w:fill="auto"/>
             <w:noWrap/>
             <w:vAlign w:val="bottom"/>
             <w:hideMark/>
@@ -9702,7 +9667,7 @@
           </w:p>
         </w:tc>
       </w:tr>
-      <w:bookmarkEnd w:id="70"/>
+      <w:bookmarkEnd w:id="74"/>
     </w:tbl>
     <w:p>
       <w:pPr>
@@ -9754,34 +9719,6 @@
     <w:p>
       <w:pPr>
         <w:rPr>
-          <w:ins w:id="72" w:author="Sandra Regnell [2]" w:date="2023-02-09T11:59:00Z"/>
-        </w:rPr>
-      </w:pPr>
-    </w:p>
-    <w:p>
-      <w:pPr>
-        <w:rPr>
-          <w:ins w:id="73" w:author="Sandra Regnell [2]" w:date="2023-02-09T11:59:00Z"/>
-        </w:rPr>
-      </w:pPr>
-    </w:p>
-    <w:p>
-      <w:pPr>
-        <w:rPr>
-          <w:ins w:id="74" w:author="Sandra Regnell [2]" w:date="2023-02-09T11:59:00Z"/>
-        </w:rPr>
-      </w:pPr>
-    </w:p>
-    <w:p>
-      <w:pPr>
-        <w:rPr>
-          <w:ins w:id="75" w:author="Sandra Regnell [2]" w:date="2023-02-09T11:59:00Z"/>
-        </w:rPr>
-      </w:pPr>
-    </w:p>
-    <w:p>
-      <w:pPr>
-        <w:rPr>
           <w:ins w:id="76" w:author="Sandra Regnell [2]" w:date="2023-02-09T11:59:00Z"/>
         </w:rPr>
       </w:pPr>
@@ -9797,6 +9734,34 @@
       <w:pPr>
         <w:rPr>
           <w:ins w:id="78" w:author="Sandra Regnell [2]" w:date="2023-02-09T11:59:00Z"/>
+        </w:rPr>
+      </w:pPr>
+    </w:p>
+    <w:p>
+      <w:pPr>
+        <w:rPr>
+          <w:ins w:id="79" w:author="Sandra Regnell [2]" w:date="2023-02-09T11:59:00Z"/>
+        </w:rPr>
+      </w:pPr>
+    </w:p>
+    <w:p>
+      <w:pPr>
+        <w:rPr>
+          <w:ins w:id="80" w:author="Sandra Regnell [2]" w:date="2023-02-09T11:59:00Z"/>
+        </w:rPr>
+      </w:pPr>
+    </w:p>
+    <w:p>
+      <w:pPr>
+        <w:rPr>
+          <w:ins w:id="81" w:author="Sandra Regnell [2]" w:date="2023-02-09T11:59:00Z"/>
+        </w:rPr>
+      </w:pPr>
+    </w:p>
+    <w:p>
+      <w:pPr>
+        <w:rPr>
+          <w:ins w:id="82" w:author="Sandra Regnell [2]" w:date="2023-02-09T11:59:00Z"/>
         </w:rPr>
       </w:pPr>
     </w:p>
@@ -9818,8 +9783,8 @@
           <w:highlight w:val="yellow"/>
         </w:rPr>
       </w:pPr>
-      <w:bookmarkStart w:id="79" w:name="_Hlk126071039"/>
-      <w:bookmarkStart w:id="80" w:name="_Hlk115347639"/>
+      <w:bookmarkStart w:id="83" w:name="_Hlk126071039"/>
+      <w:bookmarkStart w:id="84" w:name="_Hlk115347639"/>
       <w:r>
         <w:rPr>
           <w:rFonts w:ascii="Times New Roman" w:hAnsi="Times New Roman" w:cs="Times New Roman"/>
@@ -9899,7 +9864,7 @@
         </w:rPr>
         <w:t xml:space="preserve"> – </w:t>
       </w:r>
-      <w:commentRangeStart w:id="81"/>
+      <w:commentRangeStart w:id="85"/>
       <w:r>
         <w:rPr>
           <w:rFonts w:ascii="Times New Roman" w:hAnsi="Times New Roman" w:cs="Times New Roman"/>
@@ -9911,9 +9876,9 @@
         </w:rPr>
         <w:t xml:space="preserve">Example Risk Index </w:t>
       </w:r>
-      <w:commentRangeStart w:id="82"/>
-      <w:commentRangeStart w:id="83"/>
-      <w:commentRangeStart w:id="84"/>
+      <w:commentRangeStart w:id="86"/>
+      <w:commentRangeStart w:id="87"/>
+      <w:commentRangeStart w:id="88"/>
       <w:r>
         <w:rPr>
           <w:rFonts w:ascii="Times New Roman" w:hAnsi="Times New Roman" w:cs="Times New Roman"/>
@@ -9925,56 +9890,64 @@
         </w:rPr>
         <w:t>Determination</w:t>
       </w:r>
-      <w:commentRangeEnd w:id="82"/>
+      <w:commentRangeEnd w:id="86"/>
       <w:r>
         <w:rPr>
           <w:rStyle w:val="CommentReference"/>
-          <w:rFonts w:ascii="Arial" w:eastAsia="Times New Roman" w:hAnsi="Arial" w:cs="Times New Roman"/>
+          <w:rFonts w:ascii="Times New Roman" w:hAnsi="Times New Roman" w:cs="Times New Roman"/>
+          <w:b/>
           <w:i w:val="0"/>
-          <w:iCs w:val="0"/>
           <w:color w:val="auto"/>
-          <w:lang w:val="en-GB"/>
-        </w:rPr>
-        <w:commentReference w:id="82"/>
-      </w:r>
-      <w:commentRangeEnd w:id="83"/>
+          <w:sz w:val="22"/>
+          <w:szCs w:val="22"/>
+          <w:highlight w:val="yellow"/>
+        </w:rPr>
+        <w:commentReference w:id="86"/>
+      </w:r>
+      <w:commentRangeEnd w:id="87"/>
       <w:r>
         <w:rPr>
           <w:rStyle w:val="CommentReference"/>
-          <w:rFonts w:ascii="Arial" w:eastAsia="Times New Roman" w:hAnsi="Arial" w:cs="Times New Roman"/>
+          <w:rFonts w:ascii="Times New Roman" w:hAnsi="Times New Roman" w:cs="Times New Roman"/>
+          <w:b/>
           <w:i w:val="0"/>
-          <w:iCs w:val="0"/>
           <w:color w:val="auto"/>
-          <w:lang w:val="en-GB"/>
-        </w:rPr>
-        <w:commentReference w:id="83"/>
-      </w:r>
-      <w:commentRangeEnd w:id="84"/>
+          <w:sz w:val="22"/>
+          <w:szCs w:val="22"/>
+          <w:highlight w:val="yellow"/>
+        </w:rPr>
+        <w:commentReference w:id="87"/>
+      </w:r>
+      <w:commentRangeEnd w:id="88"/>
       <w:r>
         <w:rPr>
           <w:rStyle w:val="CommentReference"/>
-          <w:rFonts w:ascii="Arial" w:eastAsia="Times New Roman" w:hAnsi="Arial" w:cs="Times New Roman"/>
+          <w:rFonts w:ascii="Times New Roman" w:hAnsi="Times New Roman" w:cs="Times New Roman"/>
+          <w:b/>
           <w:i w:val="0"/>
-          <w:iCs w:val="0"/>
           <w:color w:val="auto"/>
-          <w:lang w:val="en-GB"/>
-        </w:rPr>
-        <w:commentReference w:id="84"/>
-      </w:r>
-      <w:commentRangeEnd w:id="81"/>
+          <w:sz w:val="22"/>
+          <w:szCs w:val="22"/>
+          <w:highlight w:val="yellow"/>
+        </w:rPr>
+        <w:commentReference w:id="88"/>
+      </w:r>
+      <w:commentRangeEnd w:id="85"/>
       <w:r>
         <w:rPr>
           <w:rStyle w:val="CommentReference"/>
-          <w:rFonts w:ascii="Arial" w:eastAsia="Times New Roman" w:hAnsi="Arial" w:cs="Times New Roman"/>
+          <w:rFonts w:ascii="Times New Roman" w:hAnsi="Times New Roman" w:cs="Times New Roman"/>
+          <w:b/>
           <w:i w:val="0"/>
-          <w:iCs w:val="0"/>
           <w:color w:val="auto"/>
-          <w:lang w:val="en-GB"/>
-        </w:rPr>
-        <w:commentReference w:id="81"/>
-      </w:r>
-    </w:p>
-    <w:bookmarkEnd w:id="79"/>
+          <w:sz w:val="22"/>
+          <w:szCs w:val="22"/>
+          <w:highlight w:val="yellow"/>
+        </w:rPr>
+        <w:commentReference w:id="85"/>
+      </w:r>
+    </w:p>
+    <w:bookmarkEnd w:id="83"/>
     <w:tbl>
       <w:tblPr>
         <w:tblW w:w="7465" w:type="dxa"/>
@@ -11235,7 +11208,7 @@
           </w:p>
         </w:tc>
       </w:tr>
-      <w:bookmarkEnd w:id="80"/>
+      <w:bookmarkEnd w:id="84"/>
     </w:tbl>
     <w:p>
       <w:pPr>
@@ -11408,31 +11381,31 @@
       <w:r>
         <w:t xml:space="preserve">Risk reduction </w:t>
       </w:r>
-      <w:commentRangeStart w:id="85"/>
-      <w:commentRangeStart w:id="86"/>
+      <w:commentRangeStart w:id="89"/>
+      <w:commentRangeStart w:id="90"/>
       <w:r>
         <w:t>measures</w:t>
       </w:r>
       <w:r>
         <w:t xml:space="preserve"> </w:t>
       </w:r>
-      <w:commentRangeEnd w:id="85"/>
+      <w:commentRangeEnd w:id="89"/>
       <w:r>
         <w:rPr>
           <w:rStyle w:val="CommentReference"/>
-          <w:rFonts w:ascii="Arial" w:hAnsi="Arial"/>
-          <w:lang w:val="en-GB"/>
-        </w:rPr>
-        <w:commentReference w:id="85"/>
-      </w:r>
-      <w:commentRangeEnd w:id="86"/>
+          <w:sz w:val="24"/>
+          <w:szCs w:val="20"/>
+        </w:rPr>
+        <w:commentReference w:id="89"/>
+      </w:r>
+      <w:commentRangeEnd w:id="90"/>
       <w:r>
         <w:rPr>
           <w:rStyle w:val="CommentReference"/>
-          <w:rFonts w:ascii="Arial" w:hAnsi="Arial"/>
-          <w:lang w:val="en-GB"/>
-        </w:rPr>
-        <w:commentReference w:id="86"/>
+          <w:sz w:val="24"/>
+          <w:szCs w:val="20"/>
+        </w:rPr>
+        <w:commentReference w:id="90"/>
       </w:r>
       <w:r>
         <w:t>shall be defined, when possible, to reduce identified risks.  Risk reduction and/or risk control measures shall be documented</w:t>
@@ -11456,28 +11429,28 @@
         <w:ind w:left="2340" w:right="-270"/>
         <w:contextualSpacing w:val="0"/>
       </w:pPr>
-      <w:commentRangeStart w:id="87"/>
-      <w:commentRangeStart w:id="88"/>
+      <w:commentRangeStart w:id="91"/>
+      <w:commentRangeStart w:id="92"/>
       <w:r>
         <w:t xml:space="preserve">Risks shall be reviewed </w:t>
       </w:r>
-      <w:commentRangeEnd w:id="87"/>
+      <w:commentRangeEnd w:id="91"/>
       <w:r>
         <w:rPr>
           <w:rStyle w:val="CommentReference"/>
-          <w:rFonts w:ascii="Arial" w:hAnsi="Arial"/>
-          <w:lang w:val="en-GB"/>
-        </w:rPr>
-        <w:commentReference w:id="87"/>
-      </w:r>
-      <w:commentRangeEnd w:id="88"/>
+          <w:sz w:val="24"/>
+          <w:szCs w:val="20"/>
+        </w:rPr>
+        <w:commentReference w:id="91"/>
+      </w:r>
+      <w:commentRangeEnd w:id="92"/>
       <w:r>
         <w:rPr>
           <w:rStyle w:val="CommentReference"/>
-          <w:rFonts w:ascii="Arial" w:hAnsi="Arial"/>
-          <w:lang w:val="en-GB"/>
-        </w:rPr>
-        <w:commentReference w:id="88"/>
+          <w:sz w:val="24"/>
+          <w:szCs w:val="20"/>
+        </w:rPr>
+        <w:commentReference w:id="92"/>
       </w:r>
       <w:r>
         <w:t xml:space="preserve">after risk reduction actions are implemented, or </w:t>
@@ -11674,28 +11647,28 @@
       <w:r>
         <w:t xml:space="preserve">The </w:t>
       </w:r>
-      <w:commentRangeStart w:id="89"/>
-      <w:commentRangeStart w:id="90"/>
+      <w:commentRangeStart w:id="93"/>
+      <w:commentRangeStart w:id="94"/>
       <w:r>
         <w:t xml:space="preserve">risk control measure(s) selected </w:t>
       </w:r>
-      <w:commentRangeEnd w:id="89"/>
+      <w:commentRangeEnd w:id="93"/>
       <w:r>
         <w:rPr>
           <w:rStyle w:val="CommentReference"/>
-          <w:rFonts w:ascii="Arial" w:hAnsi="Arial"/>
-          <w:lang w:val="en-GB"/>
-        </w:rPr>
-        <w:commentReference w:id="89"/>
-      </w:r>
-      <w:commentRangeEnd w:id="90"/>
+          <w:sz w:val="24"/>
+          <w:szCs w:val="20"/>
+        </w:rPr>
+        <w:commentReference w:id="93"/>
+      </w:r>
+      <w:commentRangeEnd w:id="94"/>
       <w:r>
         <w:rPr>
           <w:rStyle w:val="CommentReference"/>
-          <w:rFonts w:ascii="Arial" w:hAnsi="Arial"/>
-          <w:lang w:val="en-GB"/>
-        </w:rPr>
-        <w:commentReference w:id="90"/>
+          <w:sz w:val="24"/>
+          <w:szCs w:val="20"/>
+        </w:rPr>
+        <w:commentReference w:id="94"/>
       </w:r>
       <w:r>
         <w:t xml:space="preserve">shall be recorded in the </w:t>
@@ -11743,28 +11716,28 @@
       <w:r>
         <w:t>Implementation of each risk control measure(s) shall be verified</w:t>
       </w:r>
-      <w:commentRangeStart w:id="91"/>
-      <w:commentRangeStart w:id="92"/>
+      <w:commentRangeStart w:id="95"/>
+      <w:commentRangeStart w:id="96"/>
       <w:r>
         <w:t xml:space="preserve">, and the results shall be recorded in </w:t>
       </w:r>
-      <w:commentRangeEnd w:id="91"/>
+      <w:commentRangeEnd w:id="95"/>
       <w:r>
         <w:rPr>
           <w:rStyle w:val="CommentReference"/>
-          <w:rFonts w:ascii="Arial" w:hAnsi="Arial"/>
-          <w:lang w:val="en-GB"/>
-        </w:rPr>
-        <w:commentReference w:id="91"/>
-      </w:r>
-      <w:commentRangeEnd w:id="92"/>
+          <w:sz w:val="24"/>
+          <w:szCs w:val="20"/>
+        </w:rPr>
+        <w:commentReference w:id="95"/>
+      </w:r>
+      <w:commentRangeEnd w:id="96"/>
       <w:r>
         <w:rPr>
           <w:rStyle w:val="CommentReference"/>
-          <w:rFonts w:ascii="Arial" w:hAnsi="Arial"/>
-          <w:lang w:val="en-GB"/>
-        </w:rPr>
-        <w:commentReference w:id="92"/>
+          <w:sz w:val="24"/>
+          <w:szCs w:val="20"/>
+        </w:rPr>
+        <w:commentReference w:id="96"/>
       </w:r>
       <w:r>
         <w:t xml:space="preserve">the </w:t>
@@ -11856,19 +11829,52 @@
       <w:r>
         <w:fldChar w:fldCharType="separate"/>
       </w:r>
-      <w:r>
-        <w:rPr>
-          <w:b/>
-        </w:rPr>
-        <w:t xml:space="preserve">Table </w:t>
-      </w:r>
-      <w:r>
-        <w:rPr>
-          <w:b/>
-          <w:noProof/>
-        </w:rPr>
-        <w:t>4</w:t>
-      </w:r>
+      <w:ins w:id="97" w:author="Matt Parson" w:date="2026-03-17T12:44:00Z" w16du:dateUtc="2026-03-17T16:44:00Z">
+        <w:r>
+          <w:rPr>
+            <w:b/>
+            <w:rPrChange w:id="98" w:author="Matt Parson" w:date="2026-03-17T12:44:00Z" w16du:dateUtc="2026-03-17T16:44:00Z">
+              <w:rPr>
+                <w:b/>
+                <w:sz w:val="22"/>
+                <w:szCs w:val="22"/>
+              </w:rPr>
+            </w:rPrChange>
+          </w:rPr>
+          <w:t xml:space="preserve">Table </w:t>
+        </w:r>
+        <w:r>
+          <w:rPr>
+            <w:b/>
+            <w:noProof/>
+            <w:rPrChange w:id="99" w:author="Matt Parson" w:date="2026-03-17T12:44:00Z" w16du:dateUtc="2026-03-17T16:44:00Z">
+              <w:rPr>
+                <w:b/>
+                <w:i/>
+                <w:noProof/>
+                <w:sz w:val="22"/>
+                <w:szCs w:val="22"/>
+              </w:rPr>
+            </w:rPrChange>
+          </w:rPr>
+          <w:t>4</w:t>
+        </w:r>
+      </w:ins>
+      <w:del w:id="100" w:author="Matt Parson" w:date="2026-03-17T12:44:00Z" w16du:dateUtc="2026-03-17T16:44:00Z">
+        <w:r>
+          <w:rPr>
+            <w:b/>
+          </w:rPr>
+          <w:delText xml:space="preserve">Table </w:delText>
+        </w:r>
+        <w:r>
+          <w:rPr>
+            <w:b/>
+            <w:noProof/>
+          </w:rPr>
+          <w:delText>4</w:delText>
+        </w:r>
+      </w:del>
       <w:r>
         <w:fldChar w:fldCharType="end"/>
       </w:r>
@@ -11898,7 +11904,7 @@
           <w:szCs w:val="22"/>
         </w:rPr>
       </w:pPr>
-      <w:bookmarkStart w:id="93" w:name="_Ref40942360"/>
+      <w:bookmarkStart w:id="101" w:name="_Ref40942360"/>
       <w:r>
         <w:rPr>
           <w:rFonts w:ascii="Times New Roman" w:hAnsi="Times New Roman" w:cs="Times New Roman"/>
@@ -11966,7 +11972,7 @@
         </w:rPr>
         <w:fldChar w:fldCharType="end"/>
       </w:r>
-      <w:bookmarkEnd w:id="93"/>
+      <w:bookmarkEnd w:id="101"/>
       <w:r>
         <w:rPr>
           <w:rFonts w:ascii="Times New Roman" w:hAnsi="Times New Roman" w:cs="Times New Roman"/>
@@ -12531,38 +12537,38 @@
         <w:ind w:left="2340" w:right="-270"/>
         <w:contextualSpacing w:val="0"/>
       </w:pPr>
-      <w:commentRangeStart w:id="94"/>
-      <w:commentRangeStart w:id="95"/>
-      <w:commentRangeStart w:id="96"/>
+      <w:commentRangeStart w:id="102"/>
+      <w:commentRangeStart w:id="103"/>
+      <w:commentRangeStart w:id="104"/>
       <w:r>
         <w:t>Any new or increased risks shall be managed in accordance with this procedure.</w:t>
       </w:r>
-      <w:commentRangeEnd w:id="94"/>
+      <w:commentRangeEnd w:id="102"/>
       <w:r>
         <w:rPr>
           <w:rStyle w:val="CommentReference"/>
-          <w:rFonts w:ascii="Arial" w:hAnsi="Arial"/>
-          <w:lang w:val="en-GB"/>
-        </w:rPr>
-        <w:commentReference w:id="94"/>
-      </w:r>
-      <w:commentRangeEnd w:id="95"/>
+          <w:sz w:val="24"/>
+          <w:szCs w:val="20"/>
+        </w:rPr>
+        <w:commentReference w:id="102"/>
+      </w:r>
+      <w:commentRangeEnd w:id="103"/>
       <w:r>
         <w:rPr>
           <w:rStyle w:val="CommentReference"/>
-          <w:rFonts w:ascii="Arial" w:hAnsi="Arial"/>
-          <w:lang w:val="en-GB"/>
-        </w:rPr>
-        <w:commentReference w:id="95"/>
-      </w:r>
-      <w:commentRangeEnd w:id="96"/>
+          <w:sz w:val="24"/>
+          <w:szCs w:val="20"/>
+        </w:rPr>
+        <w:commentReference w:id="103"/>
+      </w:r>
+      <w:commentRangeEnd w:id="104"/>
       <w:r>
         <w:rPr>
           <w:rStyle w:val="CommentReference"/>
-          <w:rFonts w:ascii="Arial" w:hAnsi="Arial"/>
-          <w:lang w:val="en-GB"/>
-        </w:rPr>
-        <w:commentReference w:id="96"/>
+          <w:sz w:val="24"/>
+          <w:szCs w:val="20"/>
+        </w:rPr>
+        <w:commentReference w:id="104"/>
       </w:r>
     </w:p>
     <w:p>
@@ -12577,28 +12583,28 @@
         <w:ind w:left="2340" w:right="-270"/>
         <w:contextualSpacing w:val="0"/>
       </w:pPr>
-      <w:commentRangeStart w:id="97"/>
-      <w:commentRangeStart w:id="98"/>
+      <w:commentRangeStart w:id="105"/>
+      <w:commentRangeStart w:id="106"/>
       <w:r>
         <w:t xml:space="preserve">The results of this review shall be recorded </w:t>
       </w:r>
-      <w:commentRangeEnd w:id="97"/>
+      <w:commentRangeEnd w:id="105"/>
       <w:r>
         <w:rPr>
           <w:rStyle w:val="CommentReference"/>
-          <w:rFonts w:ascii="Arial" w:hAnsi="Arial"/>
-          <w:lang w:val="en-GB"/>
-        </w:rPr>
-        <w:commentReference w:id="97"/>
-      </w:r>
-      <w:commentRangeEnd w:id="98"/>
+          <w:sz w:val="24"/>
+          <w:szCs w:val="20"/>
+        </w:rPr>
+        <w:commentReference w:id="105"/>
+      </w:r>
+      <w:commentRangeEnd w:id="106"/>
       <w:r>
         <w:rPr>
           <w:rStyle w:val="CommentReference"/>
-          <w:rFonts w:ascii="Arial" w:hAnsi="Arial"/>
-          <w:lang w:val="en-GB"/>
-        </w:rPr>
-        <w:commentReference w:id="98"/>
+          <w:sz w:val="24"/>
+          <w:szCs w:val="20"/>
+        </w:rPr>
+        <w:commentReference w:id="106"/>
       </w:r>
       <w:r>
         <w:t>in the risk management file.</w:t>
@@ -12646,28 +12652,28 @@
         <w:ind w:left="2340" w:right="-270"/>
         <w:contextualSpacing w:val="0"/>
       </w:pPr>
-      <w:commentRangeStart w:id="99"/>
-      <w:commentRangeStart w:id="100"/>
+      <w:commentRangeStart w:id="107"/>
+      <w:commentRangeStart w:id="108"/>
       <w:r>
         <w:t xml:space="preserve">The results of this activity shall be recorded </w:t>
       </w:r>
-      <w:commentRangeEnd w:id="99"/>
+      <w:commentRangeEnd w:id="107"/>
       <w:r>
         <w:rPr>
           <w:rStyle w:val="CommentReference"/>
-          <w:rFonts w:ascii="Arial" w:hAnsi="Arial"/>
-          <w:lang w:val="en-GB"/>
-        </w:rPr>
-        <w:commentReference w:id="99"/>
-      </w:r>
-      <w:commentRangeEnd w:id="100"/>
+          <w:sz w:val="24"/>
+          <w:szCs w:val="20"/>
+        </w:rPr>
+        <w:commentReference w:id="107"/>
+      </w:r>
+      <w:commentRangeEnd w:id="108"/>
       <w:r>
         <w:rPr>
           <w:rStyle w:val="CommentReference"/>
-          <w:rFonts w:ascii="Arial" w:hAnsi="Arial"/>
-          <w:lang w:val="en-GB"/>
-        </w:rPr>
-        <w:commentReference w:id="100"/>
+          <w:sz w:val="24"/>
+          <w:szCs w:val="20"/>
+        </w:rPr>
+        <w:commentReference w:id="108"/>
       </w:r>
       <w:r>
         <w:t xml:space="preserve">in the </w:t>
@@ -12747,9 +12753,9 @@
           <w:b/>
         </w:rPr>
       </w:pPr>
-      <w:commentRangeStart w:id="101"/>
-      <w:commentRangeStart w:id="102"/>
-      <w:commentRangeStart w:id="103"/>
+      <w:commentRangeStart w:id="109"/>
+      <w:commentRangeStart w:id="110"/>
+      <w:commentRangeStart w:id="111"/>
       <w:r>
         <w:t xml:space="preserve">Prior to release for </w:t>
       </w:r>
@@ -12759,32 +12765,32 @@
       <w:r>
         <w:t xml:space="preserve">commercial production </w:t>
       </w:r>
-      <w:commentRangeEnd w:id="101"/>
+      <w:commentRangeEnd w:id="109"/>
       <w:r>
         <w:rPr>
           <w:rStyle w:val="CommentReference"/>
-          <w:rFonts w:ascii="Arial" w:hAnsi="Arial"/>
-          <w:lang w:val="en-GB"/>
-        </w:rPr>
-        <w:commentReference w:id="101"/>
-      </w:r>
-      <w:commentRangeEnd w:id="102"/>
+          <w:sz w:val="24"/>
+          <w:szCs w:val="20"/>
+        </w:rPr>
+        <w:commentReference w:id="109"/>
+      </w:r>
+      <w:commentRangeEnd w:id="110"/>
       <w:r>
         <w:rPr>
           <w:rStyle w:val="CommentReference"/>
-          <w:rFonts w:ascii="Arial" w:hAnsi="Arial"/>
-          <w:lang w:val="en-GB"/>
-        </w:rPr>
-        <w:commentReference w:id="102"/>
-      </w:r>
-      <w:commentRangeEnd w:id="103"/>
+          <w:sz w:val="24"/>
+          <w:szCs w:val="20"/>
+        </w:rPr>
+        <w:commentReference w:id="110"/>
+      </w:r>
+      <w:commentRangeEnd w:id="111"/>
       <w:r>
         <w:rPr>
           <w:rStyle w:val="CommentReference"/>
-          <w:rFonts w:ascii="Arial" w:hAnsi="Arial"/>
-          <w:lang w:val="en-GB"/>
-        </w:rPr>
-        <w:commentReference w:id="103"/>
+          <w:sz w:val="24"/>
+          <w:szCs w:val="20"/>
+        </w:rPr>
+        <w:commentReference w:id="111"/>
       </w:r>
       <w:r>
         <w:t>of the combination product, the Applicant shall review the execution of the</w:t>
@@ -12918,38 +12924,38 @@
       <w:pPr>
         <w:pStyle w:val="Heading3"/>
       </w:pPr>
-      <w:commentRangeStart w:id="104"/>
-      <w:commentRangeStart w:id="105"/>
-      <w:commentRangeStart w:id="106"/>
+      <w:commentRangeStart w:id="112"/>
+      <w:commentRangeStart w:id="113"/>
+      <w:commentRangeStart w:id="114"/>
       <w:r>
         <w:t xml:space="preserve">Information </w:t>
       </w:r>
-      <w:commentRangeEnd w:id="104"/>
+      <w:commentRangeEnd w:id="112"/>
       <w:r>
         <w:rPr>
           <w:rStyle w:val="CommentReference"/>
-          <w:rFonts w:ascii="Arial" w:hAnsi="Arial"/>
-          <w:lang w:val="en-GB"/>
-        </w:rPr>
-        <w:commentReference w:id="104"/>
-      </w:r>
-      <w:commentRangeEnd w:id="105"/>
+          <w:sz w:val="24"/>
+          <w:szCs w:val="20"/>
+        </w:rPr>
+        <w:commentReference w:id="112"/>
+      </w:r>
+      <w:commentRangeEnd w:id="113"/>
       <w:r>
         <w:rPr>
           <w:rStyle w:val="CommentReference"/>
-          <w:rFonts w:ascii="Arial" w:hAnsi="Arial"/>
-          <w:lang w:val="en-GB"/>
-        </w:rPr>
-        <w:commentReference w:id="105"/>
-      </w:r>
-      <w:commentRangeEnd w:id="106"/>
+          <w:sz w:val="24"/>
+          <w:szCs w:val="20"/>
+        </w:rPr>
+        <w:commentReference w:id="113"/>
+      </w:r>
+      <w:commentRangeEnd w:id="114"/>
       <w:r>
         <w:rPr>
           <w:rStyle w:val="CommentReference"/>
-          <w:rFonts w:ascii="Arial" w:hAnsi="Arial"/>
-          <w:lang w:val="en-GB"/>
-        </w:rPr>
-        <w:commentReference w:id="106"/>
+          <w:sz w:val="24"/>
+          <w:szCs w:val="20"/>
+        </w:rPr>
+        <w:commentReference w:id="114"/>
       </w:r>
       <w:r>
         <w:t xml:space="preserve">relevant to the combination product shall be actively collected and </w:t>
@@ -13305,8 +13311,8 @@
       <w:r>
         <w:t xml:space="preserve"> as a post market </w:t>
       </w:r>
-      <w:commentRangeStart w:id="107"/>
-      <w:commentRangeStart w:id="108"/>
+      <w:commentRangeStart w:id="115"/>
+      <w:commentRangeStart w:id="116"/>
       <w:r>
         <w:t xml:space="preserve">activity </w:t>
       </w:r>
@@ -13322,23 +13328,23 @@
       <w:r>
         <w:t xml:space="preserve"> </w:t>
       </w:r>
-      <w:commentRangeEnd w:id="107"/>
+      <w:commentRangeEnd w:id="115"/>
       <w:r>
         <w:rPr>
           <w:rStyle w:val="CommentReference"/>
-          <w:rFonts w:ascii="Arial" w:hAnsi="Arial"/>
-          <w:lang w:val="en-GB"/>
-        </w:rPr>
-        <w:commentReference w:id="107"/>
-      </w:r>
-      <w:commentRangeEnd w:id="108"/>
+          <w:sz w:val="24"/>
+          <w:szCs w:val="24"/>
+        </w:rPr>
+        <w:commentReference w:id="115"/>
+      </w:r>
+      <w:commentRangeEnd w:id="116"/>
       <w:r>
         <w:rPr>
           <w:rStyle w:val="CommentReference"/>
-          <w:rFonts w:ascii="Arial" w:hAnsi="Arial"/>
-          <w:lang w:val="en-GB"/>
-        </w:rPr>
-        <w:commentReference w:id="108"/>
+          <w:sz w:val="24"/>
+          <w:szCs w:val="24"/>
+        </w:rPr>
+        <w:commentReference w:id="116"/>
       </w:r>
       <w:r>
         <w:t xml:space="preserve">when events that may impact the original risk management decision occur.  </w:t>
@@ -13400,8 +13406,8 @@
       <w:r>
         <w:t xml:space="preserve"> </w:t>
       </w:r>
-      <w:commentRangeStart w:id="109"/>
-      <w:commentRangeStart w:id="110"/>
+      <w:commentRangeStart w:id="117"/>
+      <w:commentRangeStart w:id="118"/>
       <w:r>
         <w:t>Management Re</w:t>
       </w:r>
@@ -13417,23 +13423,23 @@
       <w:r>
         <w:t xml:space="preserve">].  </w:t>
       </w:r>
-      <w:commentRangeEnd w:id="109"/>
+      <w:commentRangeEnd w:id="117"/>
       <w:r>
         <w:rPr>
           <w:rStyle w:val="CommentReference"/>
-          <w:rFonts w:ascii="Arial" w:hAnsi="Arial"/>
-          <w:lang w:val="en-GB"/>
-        </w:rPr>
-        <w:commentReference w:id="109"/>
-      </w:r>
-      <w:commentRangeEnd w:id="110"/>
+          <w:sz w:val="24"/>
+          <w:szCs w:val="24"/>
+        </w:rPr>
+        <w:commentReference w:id="117"/>
+      </w:r>
+      <w:commentRangeEnd w:id="118"/>
       <w:r>
         <w:rPr>
           <w:rStyle w:val="CommentReference"/>
-          <w:rFonts w:ascii="Arial" w:hAnsi="Arial"/>
-          <w:lang w:val="en-GB"/>
-        </w:rPr>
-        <w:commentReference w:id="110"/>
+          <w:sz w:val="24"/>
+          <w:szCs w:val="24"/>
+        </w:rPr>
+        <w:commentReference w:id="118"/>
       </w:r>
       <w:r>
         <w:t>At a minimum, the review shall include the following.</w:t>
@@ -13565,8 +13571,8 @@
           <w:szCs w:val="24"/>
         </w:rPr>
       </w:pPr>
-      <w:commentRangeStart w:id="111"/>
-      <w:commentRangeStart w:id="112"/>
+      <w:commentRangeStart w:id="119"/>
+      <w:commentRangeStart w:id="120"/>
       <w:r>
         <w:rPr>
           <w:rFonts w:eastAsia="SimSun"/>
@@ -13683,23 +13689,29 @@
         </w:rPr>
         <w:t>Risk Management Report Template</w:t>
       </w:r>
-      <w:commentRangeEnd w:id="111"/>
+      <w:commentRangeEnd w:id="119"/>
       <w:r>
         <w:rPr>
           <w:rStyle w:val="CommentReference"/>
-          <w:rFonts w:ascii="Arial" w:hAnsi="Arial"/>
-          <w:lang w:val="en-GB"/>
-        </w:rPr>
-        <w:commentReference w:id="111"/>
-      </w:r>
-      <w:commentRangeEnd w:id="112"/>
+          <w:rFonts w:eastAsia="SimSun"/>
+          <w:b/>
+          <w:bCs/>
+          <w:sz w:val="24"/>
+          <w:szCs w:val="24"/>
+        </w:rPr>
+        <w:commentReference w:id="119"/>
+      </w:r>
+      <w:commentRangeEnd w:id="120"/>
       <w:r>
         <w:rPr>
           <w:rStyle w:val="CommentReference"/>
-          <w:rFonts w:ascii="Arial" w:hAnsi="Arial"/>
-          <w:lang w:val="en-GB"/>
-        </w:rPr>
-        <w:commentReference w:id="112"/>
+          <w:rFonts w:eastAsia="SimSun"/>
+          <w:b/>
+          <w:bCs/>
+          <w:sz w:val="24"/>
+          <w:szCs w:val="24"/>
+        </w:rPr>
+        <w:commentReference w:id="120"/>
       </w:r>
     </w:p>
     <w:p>
@@ -14720,7 +14732,7 @@
               <w:spacing w:before="168"/>
               <w:ind w:left="403"/>
               <w:rPr>
-                <w:del w:id="113" w:author="Leigh Shepherd" w:date="2023-02-09T12:47:00Z"/>
+                <w:del w:id="121" w:author="Leigh Shepherd" w:date="2023-02-09T12:47:00Z"/>
                 <w:szCs w:val="24"/>
               </w:rPr>
             </w:pPr>
@@ -14861,7 +14873,7 @@
               </w:rPr>
               <w:t>or</w:t>
             </w:r>
-            <w:ins w:id="114" w:author="Leigh Shepherd" w:date="2023-02-09T12:47:00Z">
+            <w:ins w:id="122" w:author="Leigh Shepherd" w:date="2023-02-09T12:47:00Z">
               <w:r>
                 <w:rPr>
                   <w:spacing w:val="-5"/>
@@ -15013,7 +15025,7 @@
               </w:rPr>
               <w:t>(e.g.</w:t>
             </w:r>
-            <w:ins w:id="115" w:author="Leigh Shepherd" w:date="2023-02-09T12:36:00Z">
+            <w:ins w:id="123" w:author="Leigh Shepherd" w:date="2023-02-09T12:36:00Z">
               <w:r>
                 <w:rPr>
                   <w:szCs w:val="24"/>
@@ -15491,7 +15503,7 @@
                 <w:szCs w:val="24"/>
               </w:rPr>
             </w:pPr>
-            <w:del w:id="116" w:author="Leigh Shepherd" w:date="2023-02-09T12:36:00Z">
+            <w:del w:id="124" w:author="Leigh Shepherd" w:date="2023-02-09T12:36:00Z">
               <w:r>
                 <w:rPr>
                   <w:rFonts w:ascii="Times New Roman" w:hAnsi="Times New Roman" w:cs="Times New Roman"/>
@@ -15803,7 +15815,7 @@
               </w:rPr>
               <w:t>Factors that should be considered include the nature of the intended contact, i.e.</w:t>
             </w:r>
-            <w:ins w:id="117" w:author="Leigh Shepherd" w:date="2023-02-09T12:36:00Z">
+            <w:ins w:id="125" w:author="Leigh Shepherd" w:date="2023-02-09T12:36:00Z">
               <w:r>
                 <w:rPr>
                   <w:rFonts w:ascii="Times New Roman" w:hAnsi="Times New Roman"/>
@@ -22286,7 +22298,7 @@
               </w:rPr>
               <w:t>(e.g.</w:t>
             </w:r>
-            <w:ins w:id="118" w:author="Leigh Shepherd" w:date="2023-02-09T12:42:00Z">
+            <w:ins w:id="126" w:author="Leigh Shepherd" w:date="2023-02-09T12:42:00Z">
               <w:r>
                 <w:rPr>
                   <w:rFonts w:ascii="Times New Roman" w:hAnsi="Times New Roman"/>
@@ -25255,12 +25267,12 @@
               </w:rPr>
               <w:t>combination product</w:t>
             </w:r>
-            <w:del w:id="119" w:author="Leigh Shepherd" w:date="2023-02-09T12:44:00Z">
+            <w:del w:id="127" w:author="Leigh Shepherd" w:date="2023-02-09T12:44:00Z">
               <w:r>
                 <w:rPr>
                   <w:color w:val="231F20"/>
                   <w:szCs w:val="24"/>
-                  <w:rPrChange w:id="120" w:author="Leigh Shepherd" w:date="2023-02-09T12:47:00Z">
+                  <w:rPrChange w:id="128" w:author="Leigh Shepherd" w:date="2023-02-09T12:47:00Z">
                     <w:rPr>
                       <w:color w:val="231F20"/>
                       <w:sz w:val="22"/>
@@ -28188,7 +28200,7 @@
               </w:rPr>
               <w:t>to patients, e.g.</w:t>
             </w:r>
-            <w:ins w:id="121" w:author="Leigh Shepherd" w:date="2023-02-09T12:45:00Z">
+            <w:ins w:id="129" w:author="Leigh Shepherd" w:date="2023-02-09T12:45:00Z">
               <w:r>
                 <w:rPr>
                   <w:rFonts w:ascii="Times New Roman" w:hAnsi="Times New Roman"/>
@@ -29875,7 +29887,7 @@
 </file>
 
 <file path=word/comments.xml><?xml version="1.0" encoding="utf-8"?>
-<w:comments xmlns:wpc="http://schemas.microsoft.com/office/word/2010/wordprocessingCanvas" xmlns:cx="http://schemas.microsoft.com/office/drawing/2014/chartex" xmlns:cx1="http://schemas.microsoft.com/office/drawing/2015/9/8/chartex" xmlns:cx2="http://schemas.microsoft.com/office/drawing/2015/10/21/chartex" xmlns:cx3="http://schemas.microsoft.com/office/drawing/2016/5/9/chartex" xmlns:cx4="http://schemas.microsoft.com/office/drawing/2016/5/10/chartex" xmlns:cx5="http://schemas.microsoft.com/office/drawing/2016/5/11/chartex" xmlns:cx6="http://schemas.microsoft.com/office/drawing/2016/5/12/chartex" xmlns:cx7="http://schemas.microsoft.com/office/drawing/2016/5/13/chartex" xmlns:cx8="http://schemas.microsoft.com/office/drawing/2016/5/14/chartex" xmlns:mc="http://schemas.openxmlformats.org/markup-compatibility/2006" xmlns:aink="http://schemas.microsoft.com/office/drawing/2016/ink" xmlns:am3d="http://schemas.microsoft.com/office/drawing/2017/model3d" xmlns:o="urn:schemas-microsoft-com:office:office" xmlns:oel="http://schemas.microsoft.com/office/2019/extlst" xmlns:r="http://schemas.openxmlformats.org/officeDocument/2006/relationships" xmlns:m="http://schemas.openxmlformats.org/officeDocument/2006/math" xmlns:v="urn:schemas-microsoft-com:vml" xmlns:wp14="http://schemas.microsoft.com/office/word/2010/wordprocessingDrawing" xmlns:wp="http://schemas.openxmlformats.org/drawingml/2006/wordprocessingDrawing" xmlns:w10="urn:schemas-microsoft-com:office:word" xmlns:w="http://schemas.openxmlformats.org/wordprocessingml/2006/main" xmlns:w14="http://schemas.microsoft.com/office/word/2010/wordml" xmlns:w15="http://schemas.microsoft.com/office/word/2012/wordml" xmlns:w16cex="http://schemas.microsoft.com/office/word/2018/wordml/cex" xmlns:w16cid="http://schemas.microsoft.com/office/word/2016/wordml/cid" xmlns:w16="http://schemas.microsoft.com/office/word/2018/wordml" xmlns:w16sdtdh="http://schemas.microsoft.com/office/word/2020/wordml/sdtdatahash" xmlns:w16se="http://schemas.microsoft.com/office/word/2015/wordml/symex" xmlns:wpg="http://schemas.microsoft.com/office/word/2010/wordprocessingGroup" xmlns:wpi="http://schemas.microsoft.com/office/word/2010/wordprocessingInk" xmlns:wne="http://schemas.microsoft.com/office/word/2006/wordml" xmlns:wps="http://schemas.microsoft.com/office/word/2010/wordprocessingShape" mc:Ignorable="w14 w15 w16se w16cid w16 w16cex w16sdtdh wp14">
+<w:comments xmlns:wpc="http://schemas.microsoft.com/office/word/2010/wordprocessingCanvas" xmlns:cx="http://schemas.microsoft.com/office/drawing/2014/chartex" xmlns:cx1="http://schemas.microsoft.com/office/drawing/2015/9/8/chartex" xmlns:cx2="http://schemas.microsoft.com/office/drawing/2015/10/21/chartex" xmlns:cx3="http://schemas.microsoft.com/office/drawing/2016/5/9/chartex" xmlns:cx4="http://schemas.microsoft.com/office/drawing/2016/5/10/chartex" xmlns:cx5="http://schemas.microsoft.com/office/drawing/2016/5/11/chartex" xmlns:cx6="http://schemas.microsoft.com/office/drawing/2016/5/12/chartex" xmlns:cx7="http://schemas.microsoft.com/office/drawing/2016/5/13/chartex" xmlns:cx8="http://schemas.microsoft.com/office/drawing/2016/5/14/chartex" xmlns:mc="http://schemas.openxmlformats.org/markup-compatibility/2006" xmlns:aink="http://schemas.microsoft.com/office/drawing/2016/ink" xmlns:am3d="http://schemas.microsoft.com/office/drawing/2017/model3d" xmlns:o="urn:schemas-microsoft-com:office:office" xmlns:oel="http://schemas.microsoft.com/office/2019/extlst" xmlns:r="http://schemas.openxmlformats.org/officeDocument/2006/relationships" xmlns:m="http://schemas.openxmlformats.org/officeDocument/2006/math" xmlns:v="urn:schemas-microsoft-com:vml" xmlns:wp14="http://schemas.microsoft.com/office/word/2010/wordprocessingDrawing" xmlns:wp="http://schemas.openxmlformats.org/drawingml/2006/wordprocessingDrawing" xmlns:w10="urn:schemas-microsoft-com:office:word" xmlns:w="http://schemas.openxmlformats.org/wordprocessingml/2006/main" xmlns:w14="http://schemas.microsoft.com/office/word/2010/wordml" xmlns:w15="http://schemas.microsoft.com/office/word/2012/wordml" xmlns:w16cex="http://schemas.microsoft.com/office/word/2018/wordml/cex" xmlns:w16cid="http://schemas.microsoft.com/office/word/2016/wordml/cid" xmlns:w16="http://schemas.microsoft.com/office/word/2018/wordml" xmlns:w16du="http://schemas.microsoft.com/office/word/2023/wordml/word16du" xmlns:w16sdtdh="http://schemas.microsoft.com/office/word/2020/wordml/sdtdatahash" xmlns:w16sdtfl="http://schemas.microsoft.com/office/word/2024/wordml/sdtformatlock" xmlns:w16se="http://schemas.microsoft.com/office/word/2015/wordml/symex" xmlns:wpg="http://schemas.microsoft.com/office/word/2010/wordprocessingGroup" xmlns:wpi="http://schemas.microsoft.com/office/word/2010/wordprocessingInk" xmlns:wne="http://schemas.microsoft.com/office/word/2006/wordml" xmlns:wps="http://schemas.microsoft.com/office/word/2010/wordprocessingShape" mc:Ignorable="w14 w15 w16se w16cid w16 w16cex w16sdtdh w16sdtfl w16du wp14">
   <w:comment w:id="2" w:author="Leigh Shepherd" w:date="2022-11-04T13:53:00Z" w:initials="LS">
     <w:p>
       <w:pPr>
@@ -29982,7 +29994,7 @@
       </w:r>
     </w:p>
   </w:comment>
-  <w:comment w:id="8" w:author="Leigh Shepherd" w:date="2023-01-13T11:40:00Z" w:initials="LS">
+  <w:comment w:id="10" w:author="Leigh Shepherd" w:date="2023-01-13T11:40:00Z" w:initials="LS">
     <w:p>
       <w:pPr>
         <w:pStyle w:val="CommentText"/>
@@ -29998,7 +30010,7 @@
       </w:r>
     </w:p>
   </w:comment>
-  <w:comment w:id="9" w:author="Sandra Regnell [2]" w:date="2023-02-06T09:08:00Z" w:initials="SR">
+  <w:comment w:id="11" w:author="Sandra Regnell [2]" w:date="2023-02-06T09:08:00Z" w:initials="SR">
     <w:p>
       <w:pPr>
         <w:pStyle w:val="CommentText"/>
@@ -30014,7 +30026,7 @@
       </w:r>
     </w:p>
   </w:comment>
-  <w:comment w:id="10" w:author="Leigh Shepherd" w:date="2022-10-05T11:39:00Z" w:initials="LS">
+  <w:comment w:id="8" w:author="Leigh Shepherd" w:date="2022-10-05T11:39:00Z" w:initials="LS">
     <w:p>
       <w:pPr>
         <w:pStyle w:val="CommentText"/>
@@ -30030,7 +30042,7 @@
       </w:r>
     </w:p>
   </w:comment>
-  <w:comment w:id="11" w:author="Jonathan Amaya-Hodges" w:date="2022-11-29T07:33:00Z" w:initials="JAH">
+  <w:comment w:id="9" w:author="Jonathan Amaya-Hodges" w:date="2022-11-29T07:33:00Z" w:initials="JAH">
     <w:p>
       <w:pPr>
         <w:pStyle w:val="CommentText"/>
@@ -30088,7 +30100,7 @@
       </w:r>
     </w:p>
   </w:comment>
-  <w:comment w:id="17" w:author="Leigh Shepherd" w:date="2022-10-05T11:58:00Z" w:initials="LS">
+  <w:comment w:id="21" w:author="Leigh Shepherd" w:date="2022-10-05T11:58:00Z" w:initials="LS">
     <w:p>
       <w:pPr>
         <w:pStyle w:val="CommentText"/>
@@ -30104,7 +30116,7 @@
       </w:r>
     </w:p>
   </w:comment>
-  <w:comment w:id="18" w:author="Jonathan Amaya-Hodges" w:date="2022-11-29T07:37:00Z" w:initials="JAH">
+  <w:comment w:id="22" w:author="Jonathan Amaya-Hodges" w:date="2022-11-29T07:37:00Z" w:initials="JAH">
     <w:p>
       <w:pPr>
         <w:pStyle w:val="CommentText"/>
@@ -30120,7 +30132,7 @@
       </w:r>
     </w:p>
   </w:comment>
-  <w:comment w:id="19" w:author="Leigh Shepherd" w:date="2022-10-05T11:57:00Z" w:initials="LS">
+  <w:comment w:id="23" w:author="Leigh Shepherd" w:date="2022-10-05T11:57:00Z" w:initials="LS">
     <w:p>
       <w:pPr>
         <w:pStyle w:val="CommentText"/>
@@ -30136,7 +30148,7 @@
       </w:r>
     </w:p>
   </w:comment>
-  <w:comment w:id="20" w:author="Jonathan Amaya-Hodges" w:date="2022-11-29T07:39:00Z" w:initials="JAH">
+  <w:comment w:id="24" w:author="Jonathan Amaya-Hodges" w:date="2022-11-29T07:39:00Z" w:initials="JAH">
     <w:p>
       <w:pPr>
         <w:pStyle w:val="CommentText"/>
@@ -30156,7 +30168,7 @@
       </w:r>
     </w:p>
   </w:comment>
-  <w:comment w:id="21" w:author="Leigh Shepherd" w:date="2023-01-13T11:54:00Z" w:initials="LS">
+  <w:comment w:id="25" w:author="Leigh Shepherd" w:date="2023-01-13T11:54:00Z" w:initials="LS">
     <w:p>
       <w:pPr>
         <w:pStyle w:val="CommentText"/>
@@ -30172,7 +30184,7 @@
       </w:r>
     </w:p>
   </w:comment>
-  <w:comment w:id="22" w:author="Sandra Regnell [2]" w:date="2023-02-06T09:11:00Z" w:initials="SR">
+  <w:comment w:id="26" w:author="Sandra Regnell [2]" w:date="2023-02-06T09:11:00Z" w:initials="SR">
     <w:p>
       <w:pPr>
         <w:pStyle w:val="CommentText"/>
@@ -30188,7 +30200,7 @@
       </w:r>
     </w:p>
   </w:comment>
-  <w:comment w:id="23" w:author="Leigh Shepherd" w:date="2022-10-05T12:00:00Z" w:initials="LS">
+  <w:comment w:id="27" w:author="Leigh Shepherd" w:date="2022-10-05T12:00:00Z" w:initials="LS">
     <w:p>
       <w:pPr>
         <w:pStyle w:val="CommentText"/>
@@ -30204,7 +30216,7 @@
       </w:r>
     </w:p>
   </w:comment>
-  <w:comment w:id="24" w:author="Sandra Regnell [2]" w:date="2022-11-28T21:36:00Z" w:initials="SR">
+  <w:comment w:id="28" w:author="Sandra Regnell [2]" w:date="2022-11-28T21:36:00Z" w:initials="SR">
     <w:p>
       <w:pPr>
         <w:pStyle w:val="CommentText"/>
@@ -30302,7 +30314,7 @@
       </w:pPr>
     </w:p>
   </w:comment>
-  <w:comment w:id="25" w:author="Sandra Regnell [2]" w:date="2022-11-28T21:37:00Z" w:initials="SR">
+  <w:comment w:id="29" w:author="Sandra Regnell [2]" w:date="2022-11-28T21:37:00Z" w:initials="SR">
     <w:p>
       <w:pPr>
         <w:pStyle w:val="CommentText"/>
@@ -30318,7 +30330,7 @@
       </w:r>
     </w:p>
   </w:comment>
-  <w:comment w:id="26" w:author="Jonathan Amaya-Hodges" w:date="2022-11-29T07:45:00Z" w:initials="JAH">
+  <w:comment w:id="30" w:author="Jonathan Amaya-Hodges" w:date="2022-11-29T07:45:00Z" w:initials="JAH">
     <w:p>
       <w:pPr>
         <w:pStyle w:val="CommentText"/>
@@ -30341,7 +30353,7 @@
       </w:r>
     </w:p>
   </w:comment>
-  <w:comment w:id="28" w:author="Bo Li" w:date="2022-10-31T13:43:00Z" w:initials="BL">
+  <w:comment w:id="32" w:author="Bo Li" w:date="2022-10-31T13:43:00Z" w:initials="BL">
     <w:p>
       <w:pPr>
         <w:pStyle w:val="CommentText"/>
@@ -30357,7 +30369,7 @@
       </w:r>
     </w:p>
   </w:comment>
-  <w:comment w:id="29" w:author="Jonathan Amaya-Hodges" w:date="2022-11-29T07:46:00Z" w:initials="JAH">
+  <w:comment w:id="33" w:author="Jonathan Amaya-Hodges" w:date="2022-11-29T07:46:00Z" w:initials="JAH">
     <w:p>
       <w:pPr>
         <w:pStyle w:val="CommentText"/>
@@ -30377,7 +30389,7 @@
       </w:r>
     </w:p>
   </w:comment>
-  <w:comment w:id="30" w:author="Bo Li" w:date="2022-12-18T23:28:00Z" w:initials="BL">
+  <w:comment w:id="34" w:author="Bo Li" w:date="2022-12-18T23:28:00Z" w:initials="BL">
     <w:p>
       <w:pPr>
         <w:pStyle w:val="CommentText"/>
@@ -30393,7 +30405,7 @@
       </w:r>
     </w:p>
   </w:comment>
-  <w:comment w:id="32" w:author="David Plescia" w:date="2022-09-28T09:50:00Z" w:initials="DP">
+  <w:comment w:id="36" w:author="David Plescia" w:date="2022-09-28T09:50:00Z" w:initials="DP">
     <w:p>
       <w:pPr>
         <w:pStyle w:val="CommentText"/>
@@ -30409,7 +30421,7 @@
       </w:r>
     </w:p>
   </w:comment>
-  <w:comment w:id="31" w:author="Leigh Shepherd" w:date="2022-10-05T13:31:00Z" w:initials="LS">
+  <w:comment w:id="35" w:author="Leigh Shepherd" w:date="2022-10-05T13:31:00Z" w:initials="LS">
     <w:p>
       <w:pPr>
         <w:pStyle w:val="CommentText"/>
@@ -30425,7 +30437,7 @@
       </w:r>
     </w:p>
   </w:comment>
-  <w:comment w:id="33" w:author="Leigh Shepherd" w:date="2022-10-05T13:37:00Z" w:initials="LS">
+  <w:comment w:id="37" w:author="Leigh Shepherd" w:date="2022-10-05T13:37:00Z" w:initials="LS">
     <w:p>
       <w:pPr>
         <w:pStyle w:val="CommentText"/>
@@ -30441,7 +30453,7 @@
       </w:r>
     </w:p>
   </w:comment>
-  <w:comment w:id="34" w:author="Leigh Shepherd" w:date="2022-10-05T13:38:00Z" w:initials="LS">
+  <w:comment w:id="38" w:author="Leigh Shepherd" w:date="2022-10-05T13:38:00Z" w:initials="LS">
     <w:p>
       <w:pPr>
         <w:pStyle w:val="CommentText"/>
@@ -30457,7 +30469,7 @@
       </w:r>
     </w:p>
   </w:comment>
-  <w:comment w:id="35" w:author="Leigh Shepherd" w:date="2022-10-05T13:39:00Z" w:initials="LS">
+  <w:comment w:id="39" w:author="Leigh Shepherd" w:date="2022-10-05T13:39:00Z" w:initials="LS">
     <w:p>
       <w:pPr>
         <w:pStyle w:val="CommentText"/>
@@ -30473,7 +30485,7 @@
       </w:r>
     </w:p>
   </w:comment>
-  <w:comment w:id="36" w:author="Leigh Shepherd" w:date="2022-10-05T13:40:00Z" w:initials="LS">
+  <w:comment w:id="40" w:author="Leigh Shepherd" w:date="2022-10-05T13:40:00Z" w:initials="LS">
     <w:p>
       <w:pPr>
         <w:pStyle w:val="CommentText"/>
@@ -30489,7 +30501,7 @@
       </w:r>
     </w:p>
   </w:comment>
-  <w:comment w:id="37" w:author="Leigh Shepherd" w:date="2022-10-05T13:41:00Z" w:initials="LS">
+  <w:comment w:id="41" w:author="Leigh Shepherd" w:date="2022-10-05T13:41:00Z" w:initials="LS">
     <w:p>
       <w:pPr>
         <w:pStyle w:val="CommentText"/>
@@ -30505,7 +30517,7 @@
       </w:r>
     </w:p>
   </w:comment>
-  <w:comment w:id="38" w:author="Jonathan Amaya-Hodges" w:date="2022-11-29T07:47:00Z" w:initials="JAH">
+  <w:comment w:id="42" w:author="Jonathan Amaya-Hodges" w:date="2022-11-29T07:47:00Z" w:initials="JAH">
     <w:p>
       <w:pPr>
         <w:pStyle w:val="CommentText"/>
@@ -30521,7 +30533,7 @@
       </w:r>
     </w:p>
   </w:comment>
-  <w:comment w:id="39" w:author="Bo Li" w:date="2022-10-31T13:56:00Z" w:initials="BL">
+  <w:comment w:id="43" w:author="Bo Li" w:date="2022-10-31T13:56:00Z" w:initials="BL">
     <w:p>
       <w:pPr>
         <w:pStyle w:val="CommentText"/>
@@ -30537,7 +30549,7 @@
       </w:r>
     </w:p>
   </w:comment>
-  <w:comment w:id="40" w:author="Sandra Regnell [2]" w:date="2022-11-28T21:31:00Z" w:initials="SR">
+  <w:comment w:id="44" w:author="Sandra Regnell [2]" w:date="2022-11-28T21:31:00Z" w:initials="SR">
     <w:p>
       <w:pPr>
         <w:pStyle w:val="CommentText"/>
@@ -30592,7 +30604,7 @@
       </w:r>
     </w:p>
   </w:comment>
-  <w:comment w:id="41" w:author="Jonathan Amaya-Hodges" w:date="2022-11-29T08:19:00Z" w:initials="JAH">
+  <w:comment w:id="45" w:author="Jonathan Amaya-Hodges" w:date="2022-11-29T08:19:00Z" w:initials="JAH">
     <w:p>
       <w:pPr>
         <w:pStyle w:val="CommentText"/>
@@ -30612,7 +30624,7 @@
       </w:r>
     </w:p>
   </w:comment>
-  <w:comment w:id="42" w:author="Leigh Shepherd" w:date="2022-10-05T13:43:00Z" w:initials="LS">
+  <w:comment w:id="46" w:author="Leigh Shepherd" w:date="2022-10-05T13:43:00Z" w:initials="LS">
     <w:p>
       <w:pPr>
         <w:pStyle w:val="CommentText"/>
@@ -30628,7 +30640,7 @@
       </w:r>
     </w:p>
   </w:comment>
-  <w:comment w:id="43" w:author="Leigh Shepherd" w:date="2022-10-05T13:44:00Z" w:initials="LS">
+  <w:comment w:id="47" w:author="Leigh Shepherd" w:date="2022-10-05T13:44:00Z" w:initials="LS">
     <w:p>
       <w:pPr>
         <w:pStyle w:val="CommentText"/>
@@ -30644,7 +30656,7 @@
       </w:r>
     </w:p>
   </w:comment>
-  <w:comment w:id="44" w:author="Jonathan Amaya-Hodges" w:date="2022-11-29T08:19:00Z" w:initials="JAH">
+  <w:comment w:id="48" w:author="Jonathan Amaya-Hodges" w:date="2022-11-29T08:19:00Z" w:initials="JAH">
     <w:p>
       <w:pPr>
         <w:pStyle w:val="CommentText"/>
@@ -30660,7 +30672,7 @@
       </w:r>
     </w:p>
   </w:comment>
-  <w:comment w:id="45" w:author="Leigh Shepherd" w:date="2022-10-05T13:52:00Z" w:initials="LS">
+  <w:comment w:id="49" w:author="Leigh Shepherd" w:date="2022-10-05T13:52:00Z" w:initials="LS">
     <w:p>
       <w:pPr>
         <w:pStyle w:val="CommentText"/>
@@ -30676,7 +30688,7 @@
       </w:r>
     </w:p>
   </w:comment>
-  <w:comment w:id="46" w:author="Leigh Shepherd" w:date="2022-10-05T13:53:00Z" w:initials="LS">
+  <w:comment w:id="50" w:author="Leigh Shepherd" w:date="2022-10-05T13:53:00Z" w:initials="LS">
     <w:p>
       <w:pPr>
         <w:pStyle w:val="CommentText"/>
@@ -30692,7 +30704,7 @@
       </w:r>
     </w:p>
   </w:comment>
-  <w:comment w:id="47" w:author="Leigh Shepherd" w:date="2022-10-05T13:54:00Z" w:initials="LS">
+  <w:comment w:id="51" w:author="Leigh Shepherd" w:date="2022-10-05T13:54:00Z" w:initials="LS">
     <w:p>
       <w:pPr>
         <w:pStyle w:val="CommentText"/>
@@ -30708,7 +30720,7 @@
       </w:r>
     </w:p>
   </w:comment>
-  <w:comment w:id="49" w:author="Bo Li" w:date="2022-10-31T23:37:00Z" w:initials="BL">
+  <w:comment w:id="53" w:author="Bo Li" w:date="2022-10-31T23:37:00Z" w:initials="BL">
     <w:p>
       <w:pPr>
         <w:pStyle w:val="CommentText"/>
@@ -30724,7 +30736,7 @@
       </w:r>
     </w:p>
   </w:comment>
-  <w:comment w:id="50" w:author="Jonathan Amaya-Hodges" w:date="2022-11-29T08:22:00Z" w:initials="JAH">
+  <w:comment w:id="54" w:author="Jonathan Amaya-Hodges" w:date="2022-11-29T08:22:00Z" w:initials="JAH">
     <w:p>
       <w:pPr>
         <w:pStyle w:val="CommentText"/>
@@ -30740,7 +30752,7 @@
       </w:r>
     </w:p>
   </w:comment>
-  <w:comment w:id="51" w:author="Sandra Regnell [2]" w:date="2023-02-02T09:01:00Z" w:initials="SR">
+  <w:comment w:id="55" w:author="Sandra Regnell [2]" w:date="2023-02-02T09:01:00Z" w:initials="SR">
     <w:p>
       <w:pPr>
         <w:pStyle w:val="CommentText"/>
@@ -30756,7 +30768,7 @@
       </w:r>
     </w:p>
   </w:comment>
-  <w:comment w:id="52" w:author="Sandra Regnell [2]" w:date="2023-02-06T09:14:00Z" w:initials="SR">
+  <w:comment w:id="56" w:author="Sandra Regnell [2]" w:date="2023-02-06T09:14:00Z" w:initials="SR">
     <w:p>
       <w:pPr>
         <w:pStyle w:val="CommentText"/>
@@ -30772,7 +30784,7 @@
       </w:r>
     </w:p>
   </w:comment>
-  <w:comment w:id="63" w:author="Leigh Shepherd" w:date="2022-10-05T13:55:00Z" w:initials="LS">
+  <w:comment w:id="67" w:author="Leigh Shepherd" w:date="2022-10-05T13:55:00Z" w:initials="LS">
     <w:p>
       <w:pPr>
         <w:pStyle w:val="CommentText"/>
@@ -30788,7 +30800,7 @@
       </w:r>
     </w:p>
   </w:comment>
-  <w:comment w:id="64" w:author="Jonathan Amaya-Hodges" w:date="2022-11-29T08:21:00Z" w:initials="JAH">
+  <w:comment w:id="68" w:author="Jonathan Amaya-Hodges" w:date="2022-11-29T08:21:00Z" w:initials="JAH">
     <w:p>
       <w:pPr>
         <w:pStyle w:val="CommentText"/>
@@ -30808,7 +30820,7 @@
       </w:r>
     </w:p>
   </w:comment>
-  <w:comment w:id="65" w:author="Leigh Shepherd" w:date="2022-10-05T13:56:00Z" w:initials="LS">
+  <w:comment w:id="69" w:author="Leigh Shepherd" w:date="2022-10-05T13:56:00Z" w:initials="LS">
     <w:p>
       <w:pPr>
         <w:pStyle w:val="CommentText"/>
@@ -30824,7 +30836,7 @@
       </w:r>
     </w:p>
   </w:comment>
-  <w:comment w:id="66" w:author="Leigh Shepherd" w:date="2022-10-05T13:59:00Z" w:initials="LS">
+  <w:comment w:id="70" w:author="Leigh Shepherd" w:date="2022-10-05T13:59:00Z" w:initials="LS">
     <w:p>
       <w:pPr>
         <w:pStyle w:val="CommentText"/>
@@ -30840,7 +30852,7 @@
       </w:r>
     </w:p>
   </w:comment>
-  <w:comment w:id="68" w:author="Leigh Shepherd" w:date="2022-10-05T14:01:00Z" w:initials="LS">
+  <w:comment w:id="72" w:author="Leigh Shepherd" w:date="2022-10-05T14:01:00Z" w:initials="LS">
     <w:p>
       <w:pPr>
         <w:pStyle w:val="CommentText"/>
@@ -30856,7 +30868,7 @@
       </w:r>
     </w:p>
   </w:comment>
-  <w:comment w:id="71" w:author="Jonathan Amaya-Hodges" w:date="2022-09-28T00:21:00Z" w:initials="JAH">
+  <w:comment w:id="75" w:author="Jonathan Amaya-Hodges" w:date="2022-09-28T00:21:00Z" w:initials="JAH">
     <w:p>
       <w:pPr>
         <w:pStyle w:val="CommentText"/>
@@ -30872,7 +30884,7 @@
       </w:r>
     </w:p>
   </w:comment>
-  <w:comment w:id="82" w:author="Bo Li" w:date="2022-11-01T00:28:00Z" w:initials="BL">
+  <w:comment w:id="86" w:author="Bo Li" w:date="2022-11-01T00:28:00Z" w:initials="BL">
     <w:p>
       <w:pPr>
         <w:pStyle w:val="CommentText"/>
@@ -30917,7 +30929,7 @@
       </w:r>
     </w:p>
   </w:comment>
-  <w:comment w:id="83" w:author="Jonathan Amaya-Hodges" w:date="2022-11-29T08:23:00Z" w:initials="JAH">
+  <w:comment w:id="87" w:author="Jonathan Amaya-Hodges" w:date="2022-11-29T08:23:00Z" w:initials="JAH">
     <w:p>
       <w:pPr>
         <w:pStyle w:val="CommentText"/>
@@ -30933,7 +30945,7 @@
       </w:r>
     </w:p>
   </w:comment>
-  <w:comment w:id="84" w:author="Sandra Regnell [2]" w:date="2022-11-29T15:17:00Z" w:initials="SR">
+  <w:comment w:id="88" w:author="Sandra Regnell [2]" w:date="2022-11-29T15:17:00Z" w:initials="SR">
     <w:p>
       <w:pPr>
         <w:pStyle w:val="CommentText"/>
@@ -30962,7 +30974,7 @@
       </w:r>
     </w:p>
   </w:comment>
-  <w:comment w:id="81" w:author="Jonathan Amaya-Hodges" w:date="2022-11-30T15:01:00Z" w:initials="JAH">
+  <w:comment w:id="85" w:author="Jonathan Amaya-Hodges" w:date="2022-11-30T15:01:00Z" w:initials="JAH">
     <w:p>
       <w:pPr>
         <w:pStyle w:val="CommentText"/>
@@ -30991,7 +31003,7 @@
       </w:r>
     </w:p>
   </w:comment>
-  <w:comment w:id="85" w:author="Bo Li" w:date="2022-11-01T14:03:00Z" w:initials="BL">
+  <w:comment w:id="89" w:author="Bo Li" w:date="2022-11-01T14:03:00Z" w:initials="BL">
     <w:p>
       <w:pPr>
         <w:pStyle w:val="CommentText"/>
@@ -31007,7 +31019,7 @@
       </w:r>
     </w:p>
   </w:comment>
-  <w:comment w:id="86" w:author="Jonathan Amaya-Hodges" w:date="2022-11-29T08:24:00Z" w:initials="JAH">
+  <w:comment w:id="90" w:author="Jonathan Amaya-Hodges" w:date="2022-11-29T08:24:00Z" w:initials="JAH">
     <w:p>
       <w:pPr>
         <w:pStyle w:val="CommentText"/>
@@ -31023,7 +31035,7 @@
       </w:r>
     </w:p>
   </w:comment>
-  <w:comment w:id="87" w:author="Leigh Shepherd" w:date="2022-10-05T14:06:00Z" w:initials="LS">
+  <w:comment w:id="91" w:author="Leigh Shepherd" w:date="2022-10-05T14:06:00Z" w:initials="LS">
     <w:p>
       <w:pPr>
         <w:pStyle w:val="CommentText"/>
@@ -31039,7 +31051,7 @@
       </w:r>
     </w:p>
   </w:comment>
-  <w:comment w:id="88" w:author="Sandra Regnell [2]" w:date="2022-11-29T14:49:00Z" w:initials="SR">
+  <w:comment w:id="92" w:author="Sandra Regnell [2]" w:date="2022-11-29T14:49:00Z" w:initials="SR">
     <w:p>
       <w:pPr>
         <w:pStyle w:val="CommentText"/>
@@ -31055,7 +31067,7 @@
       </w:r>
     </w:p>
   </w:comment>
-  <w:comment w:id="89" w:author="Leigh Shepherd" w:date="2022-10-05T14:11:00Z" w:initials="LS">
+  <w:comment w:id="93" w:author="Leigh Shepherd" w:date="2022-10-05T14:11:00Z" w:initials="LS">
     <w:p>
       <w:pPr>
         <w:pStyle w:val="CommentText"/>
@@ -31071,7 +31083,7 @@
       </w:r>
     </w:p>
   </w:comment>
-  <w:comment w:id="90" w:author="Jonathan Amaya-Hodges" w:date="2022-11-29T08:28:00Z" w:initials="JAH">
+  <w:comment w:id="94" w:author="Jonathan Amaya-Hodges" w:date="2022-11-29T08:28:00Z" w:initials="JAH">
     <w:p>
       <w:pPr>
         <w:pStyle w:val="CommentText"/>
@@ -31087,7 +31099,7 @@
       </w:r>
     </w:p>
   </w:comment>
-  <w:comment w:id="91" w:author="Leigh Shepherd" w:date="2022-10-05T14:11:00Z" w:initials="LS">
+  <w:comment w:id="95" w:author="Leigh Shepherd" w:date="2022-10-05T14:11:00Z" w:initials="LS">
     <w:p>
       <w:pPr>
         <w:pStyle w:val="CommentText"/>
@@ -31103,7 +31115,7 @@
       </w:r>
     </w:p>
   </w:comment>
-  <w:comment w:id="92" w:author="Jonathan Amaya-Hodges" w:date="2022-11-29T08:29:00Z" w:initials="JAH">
+  <w:comment w:id="96" w:author="Jonathan Amaya-Hodges" w:date="2022-11-29T08:29:00Z" w:initials="JAH">
     <w:p>
       <w:pPr>
         <w:pStyle w:val="CommentText"/>
@@ -31119,7 +31131,7 @@
       </w:r>
     </w:p>
   </w:comment>
-  <w:comment w:id="94" w:author="Leigh Shepherd" w:date="2022-10-05T14:15:00Z" w:initials="LS">
+  <w:comment w:id="102" w:author="Leigh Shepherd" w:date="2022-10-05T14:15:00Z" w:initials="LS">
     <w:p>
       <w:pPr>
         <w:pStyle w:val="CommentText"/>
@@ -31135,7 +31147,7 @@
       </w:r>
     </w:p>
   </w:comment>
-  <w:comment w:id="95" w:author="Jonathan Amaya-Hodges" w:date="2022-11-29T13:51:00Z" w:initials="JAH">
+  <w:comment w:id="103" w:author="Jonathan Amaya-Hodges" w:date="2022-11-29T13:51:00Z" w:initials="JAH">
     <w:p>
       <w:pPr>
         <w:pStyle w:val="CommentText"/>
@@ -31187,7 +31199,7 @@
       </w:r>
     </w:p>
   </w:comment>
-  <w:comment w:id="96" w:author="Sandra Regnell [2]" w:date="2022-11-29T15:39:00Z" w:initials="SR">
+  <w:comment w:id="104" w:author="Sandra Regnell [2]" w:date="2022-11-29T15:39:00Z" w:initials="SR">
     <w:p>
       <w:pPr>
         <w:pStyle w:val="CommentText"/>
@@ -31203,7 +31215,7 @@
       </w:r>
     </w:p>
   </w:comment>
-  <w:comment w:id="97" w:author="Leigh Shepherd" w:date="2022-10-05T14:15:00Z" w:initials="LS">
+  <w:comment w:id="105" w:author="Leigh Shepherd" w:date="2022-10-05T14:15:00Z" w:initials="LS">
     <w:p>
       <w:pPr>
         <w:pStyle w:val="CommentText"/>
@@ -31222,7 +31234,7 @@
       </w:r>
     </w:p>
   </w:comment>
-  <w:comment w:id="98" w:author="Jonathan Amaya-Hodges" w:date="2022-11-29T13:52:00Z" w:initials="JAH">
+  <w:comment w:id="106" w:author="Jonathan Amaya-Hodges" w:date="2022-11-29T13:52:00Z" w:initials="JAH">
     <w:p>
       <w:pPr>
         <w:pStyle w:val="CommentText"/>
@@ -31238,7 +31250,7 @@
       </w:r>
     </w:p>
   </w:comment>
-  <w:comment w:id="99" w:author="Leigh Shepherd" w:date="2022-10-05T14:16:00Z" w:initials="LS">
+  <w:comment w:id="107" w:author="Leigh Shepherd" w:date="2022-10-05T14:16:00Z" w:initials="LS">
     <w:p>
       <w:pPr>
         <w:pStyle w:val="CommentText"/>
@@ -31254,7 +31266,7 @@
       </w:r>
     </w:p>
   </w:comment>
-  <w:comment w:id="100" w:author="Jonathan Amaya-Hodges" w:date="2022-11-29T13:52:00Z" w:initials="JAH">
+  <w:comment w:id="108" w:author="Jonathan Amaya-Hodges" w:date="2022-11-29T13:52:00Z" w:initials="JAH">
     <w:p>
       <w:pPr>
         <w:pStyle w:val="CommentText"/>
@@ -31270,7 +31282,7 @@
       </w:r>
     </w:p>
   </w:comment>
-  <w:comment w:id="101" w:author="Bo Li" w:date="2022-11-01T23:10:00Z" w:initials="BL">
+  <w:comment w:id="109" w:author="Bo Li" w:date="2022-11-01T23:10:00Z" w:initials="BL">
     <w:p>
       <w:pPr>
         <w:pStyle w:val="CommentText"/>
@@ -31286,7 +31298,7 @@
       </w:r>
     </w:p>
   </w:comment>
-  <w:comment w:id="102" w:author="Jonathan Amaya-Hodges" w:date="2022-11-29T13:56:00Z" w:initials="JAH">
+  <w:comment w:id="110" w:author="Jonathan Amaya-Hodges" w:date="2022-11-29T13:56:00Z" w:initials="JAH">
     <w:p>
       <w:pPr>
         <w:pStyle w:val="CommentText"/>
@@ -31302,7 +31314,7 @@
       </w:r>
     </w:p>
   </w:comment>
-  <w:comment w:id="103" w:author="Sandra Regnell [2]" w:date="2022-11-29T15:46:00Z" w:initials="SR">
+  <w:comment w:id="111" w:author="Sandra Regnell [2]" w:date="2022-11-29T15:46:00Z" w:initials="SR">
     <w:p>
       <w:pPr>
         <w:pStyle w:val="CommentText"/>
@@ -31357,7 +31369,7 @@
       </w:r>
     </w:p>
   </w:comment>
-  <w:comment w:id="104" w:author="Bo Li" w:date="2022-11-01T23:59:00Z" w:initials="BL">
+  <w:comment w:id="112" w:author="Bo Li" w:date="2022-11-01T23:59:00Z" w:initials="BL">
     <w:p>
       <w:pPr>
         <w:pStyle w:val="CommentText"/>
@@ -31373,7 +31385,7 @@
       </w:r>
     </w:p>
   </w:comment>
-  <w:comment w:id="105" w:author="Jonathan Amaya-Hodges" w:date="2022-11-29T13:58:00Z" w:initials="JAH">
+  <w:comment w:id="113" w:author="Jonathan Amaya-Hodges" w:date="2022-11-29T13:58:00Z" w:initials="JAH">
     <w:p>
       <w:pPr>
         <w:pStyle w:val="CommentText"/>
@@ -31402,7 +31414,7 @@
       </w:r>
     </w:p>
   </w:comment>
-  <w:comment w:id="106" w:author="Sandra Regnell [2]" w:date="2022-11-29T16:05:00Z" w:initials="SR">
+  <w:comment w:id="114" w:author="Sandra Regnell [2]" w:date="2022-11-29T16:05:00Z" w:initials="SR">
     <w:p>
       <w:pPr>
         <w:pStyle w:val="CommentText"/>
@@ -31418,7 +31430,7 @@
       </w:r>
     </w:p>
   </w:comment>
-  <w:comment w:id="107" w:author="Leigh Shepherd" w:date="2023-02-03T20:36:00Z" w:initials="LS">
+  <w:comment w:id="115" w:author="Leigh Shepherd" w:date="2023-02-03T20:36:00Z" w:initials="LS">
     <w:p>
       <w:pPr>
         <w:pStyle w:val="CommentText"/>
@@ -31434,7 +31446,7 @@
       </w:r>
     </w:p>
   </w:comment>
-  <w:comment w:id="108" w:author="Sandra Regnell [2]" w:date="2023-02-06T09:17:00Z" w:initials="SR">
+  <w:comment w:id="116" w:author="Sandra Regnell [2]" w:date="2023-02-06T09:17:00Z" w:initials="SR">
     <w:p>
       <w:pPr>
         <w:pStyle w:val="CommentText"/>
@@ -31450,7 +31462,7 @@
       </w:r>
     </w:p>
   </w:comment>
-  <w:comment w:id="109" w:author="Leigh Shepherd" w:date="2022-10-05T14:22:00Z" w:initials="LS">
+  <w:comment w:id="117" w:author="Leigh Shepherd" w:date="2022-10-05T14:22:00Z" w:initials="LS">
     <w:p>
       <w:pPr>
         <w:pStyle w:val="CommentText"/>
@@ -31466,7 +31478,7 @@
       </w:r>
     </w:p>
   </w:comment>
-  <w:comment w:id="110" w:author="Jonathan Amaya-Hodges" w:date="2022-11-29T14:02:00Z" w:initials="JAH">
+  <w:comment w:id="118" w:author="Jonathan Amaya-Hodges" w:date="2022-11-29T14:02:00Z" w:initials="JAH">
     <w:p>
       <w:pPr>
         <w:pStyle w:val="CommentText"/>
@@ -31482,7 +31494,7 @@
       </w:r>
     </w:p>
   </w:comment>
-  <w:comment w:id="111" w:author="Leigh Shepherd" w:date="2022-10-05T16:27:00Z" w:initials="LS">
+  <w:comment w:id="119" w:author="Leigh Shepherd" w:date="2022-10-05T16:27:00Z" w:initials="LS">
     <w:p>
       <w:pPr>
         <w:pStyle w:val="CommentText"/>
@@ -31498,7 +31510,7 @@
       </w:r>
     </w:p>
   </w:comment>
-  <w:comment w:id="112" w:author="Jonathan Amaya-Hodges" w:date="2022-11-29T14:02:00Z" w:initials="JAH">
+  <w:comment w:id="120" w:author="Jonathan Amaya-Hodges" w:date="2022-11-29T14:02:00Z" w:initials="JAH">
     <w:p>
       <w:pPr>
         <w:pStyle w:val="CommentText"/>
@@ -31518,7 +31530,7 @@
 </file>
 
 <file path=word/commentsExtended.xml><?xml version="1.0" encoding="utf-8"?>
-<w15:commentsEx xmlns:wpc="http://schemas.microsoft.com/office/word/2010/wordprocessingCanvas" xmlns:cx="http://schemas.microsoft.com/office/drawing/2014/chartex" xmlns:cx1="http://schemas.microsoft.com/office/drawing/2015/9/8/chartex" xmlns:cx2="http://schemas.microsoft.com/office/drawing/2015/10/21/chartex" xmlns:cx3="http://schemas.microsoft.com/office/drawing/2016/5/9/chartex" xmlns:cx4="http://schemas.microsoft.com/office/drawing/2016/5/10/chartex" xmlns:cx5="http://schemas.microsoft.com/office/drawing/2016/5/11/chartex" xmlns:cx6="http://schemas.microsoft.com/office/drawing/2016/5/12/chartex" xmlns:cx7="http://schemas.microsoft.com/office/drawing/2016/5/13/chartex" xmlns:cx8="http://schemas.microsoft.com/office/drawing/2016/5/14/chartex" xmlns:mc="http://schemas.openxmlformats.org/markup-compatibility/2006" xmlns:aink="http://schemas.microsoft.com/office/drawing/2016/ink" xmlns:am3d="http://schemas.microsoft.com/office/drawing/2017/model3d" xmlns:o="urn:schemas-microsoft-com:office:office" xmlns:oel="http://schemas.microsoft.com/office/2019/extlst" xmlns:r="http://schemas.openxmlformats.org/officeDocument/2006/relationships" xmlns:m="http://schemas.openxmlformats.org/officeDocument/2006/math" xmlns:v="urn:schemas-microsoft-com:vml" xmlns:wp14="http://schemas.microsoft.com/office/word/2010/wordprocessingDrawing" xmlns:wp="http://schemas.openxmlformats.org/drawingml/2006/wordprocessingDrawing" xmlns:w10="urn:schemas-microsoft-com:office:word" xmlns:w="http://schemas.openxmlformats.org/wordprocessingml/2006/main" xmlns:w14="http://schemas.microsoft.com/office/word/2010/wordml" xmlns:w15="http://schemas.microsoft.com/office/word/2012/wordml" xmlns:w16cex="http://schemas.microsoft.com/office/word/2018/wordml/cex" xmlns:w16cid="http://schemas.microsoft.com/office/word/2016/wordml/cid" xmlns:w16="http://schemas.microsoft.com/office/word/2018/wordml" xmlns:w16sdtdh="http://schemas.microsoft.com/office/word/2020/wordml/sdtdatahash" xmlns:w16se="http://schemas.microsoft.com/office/word/2015/wordml/symex" xmlns:wpg="http://schemas.microsoft.com/office/word/2010/wordprocessingGroup" xmlns:wpi="http://schemas.microsoft.com/office/word/2010/wordprocessingInk" xmlns:wne="http://schemas.microsoft.com/office/word/2006/wordml" xmlns:wps="http://schemas.microsoft.com/office/word/2010/wordprocessingShape" mc:Ignorable="w14 w15 w16se w16cid w16 w16cex w16sdtdh wp14">
+<w15:commentsEx xmlns:wpc="http://schemas.microsoft.com/office/word/2010/wordprocessingCanvas" xmlns:cx="http://schemas.microsoft.com/office/drawing/2014/chartex" xmlns:cx1="http://schemas.microsoft.com/office/drawing/2015/9/8/chartex" xmlns:cx2="http://schemas.microsoft.com/office/drawing/2015/10/21/chartex" xmlns:cx3="http://schemas.microsoft.com/office/drawing/2016/5/9/chartex" xmlns:cx4="http://schemas.microsoft.com/office/drawing/2016/5/10/chartex" xmlns:cx5="http://schemas.microsoft.com/office/drawing/2016/5/11/chartex" xmlns:cx6="http://schemas.microsoft.com/office/drawing/2016/5/12/chartex" xmlns:cx7="http://schemas.microsoft.com/office/drawing/2016/5/13/chartex" xmlns:cx8="http://schemas.microsoft.com/office/drawing/2016/5/14/chartex" xmlns:mc="http://schemas.openxmlformats.org/markup-compatibility/2006" xmlns:aink="http://schemas.microsoft.com/office/drawing/2016/ink" xmlns:am3d="http://schemas.microsoft.com/office/drawing/2017/model3d" xmlns:o="urn:schemas-microsoft-com:office:office" xmlns:oel="http://schemas.microsoft.com/office/2019/extlst" xmlns:r="http://schemas.openxmlformats.org/officeDocument/2006/relationships" xmlns:m="http://schemas.openxmlformats.org/officeDocument/2006/math" xmlns:v="urn:schemas-microsoft-com:vml" xmlns:wp14="http://schemas.microsoft.com/office/word/2010/wordprocessingDrawing" xmlns:wp="http://schemas.openxmlformats.org/drawingml/2006/wordprocessingDrawing" xmlns:w10="urn:schemas-microsoft-com:office:word" xmlns:w="http://schemas.openxmlformats.org/wordprocessingml/2006/main" xmlns:w14="http://schemas.microsoft.com/office/word/2010/wordml" xmlns:w15="http://schemas.microsoft.com/office/word/2012/wordml" xmlns:w16cex="http://schemas.microsoft.com/office/word/2018/wordml/cex" xmlns:w16cid="http://schemas.microsoft.com/office/word/2016/wordml/cid" xmlns:w16="http://schemas.microsoft.com/office/word/2018/wordml" xmlns:w16du="http://schemas.microsoft.com/office/word/2023/wordml/word16du" xmlns:w16sdtdh="http://schemas.microsoft.com/office/word/2020/wordml/sdtdatahash" xmlns:w16sdtfl="http://schemas.microsoft.com/office/word/2024/wordml/sdtformatlock" xmlns:w16se="http://schemas.microsoft.com/office/word/2015/wordml/symex" xmlns:wpg="http://schemas.microsoft.com/office/word/2010/wordprocessingGroup" xmlns:wpi="http://schemas.microsoft.com/office/word/2010/wordprocessingInk" xmlns:wne="http://schemas.microsoft.com/office/word/2006/wordml" xmlns:wps="http://schemas.microsoft.com/office/word/2010/wordprocessingShape" mc:Ignorable="w14 w15 w16se w16cid w16 w16cex w16sdtdh w16sdtfl w16du wp14">
   <w15:commentEx w15:paraId="6D5FF374" w15:done="1"/>
   <w15:commentEx w15:paraId="2CC2B184" w15:done="1"/>
   <w15:commentEx w15:paraId="7D03FC18" w15:paraIdParent="2CC2B184" w15:done="1"/>
@@ -31606,7 +31618,7 @@
 </file>
 
 <file path=word/commentsExtensible.xml><?xml version="1.0" encoding="utf-8"?>
-<w16cex:commentsExtensible xmlns:wpc="http://schemas.microsoft.com/office/word/2010/wordprocessingCanvas" xmlns:cx="http://schemas.microsoft.com/office/drawing/2014/chartex" xmlns:cx1="http://schemas.microsoft.com/office/drawing/2015/9/8/chartex" xmlns:cx2="http://schemas.microsoft.com/office/drawing/2015/10/21/chartex" xmlns:cx3="http://schemas.microsoft.com/office/drawing/2016/5/9/chartex" xmlns:cx4="http://schemas.microsoft.com/office/drawing/2016/5/10/chartex" xmlns:cx5="http://schemas.microsoft.com/office/drawing/2016/5/11/chartex" xmlns:cx6="http://schemas.microsoft.com/office/drawing/2016/5/12/chartex" xmlns:cx7="http://schemas.microsoft.com/office/drawing/2016/5/13/chartex" xmlns:cx8="http://schemas.microsoft.com/office/drawing/2016/5/14/chartex" xmlns:mc="http://schemas.openxmlformats.org/markup-compatibility/2006" xmlns:aink="http://schemas.microsoft.com/office/drawing/2016/ink" xmlns:am3d="http://schemas.microsoft.com/office/drawing/2017/model3d" xmlns:o="urn:schemas-microsoft-com:office:office" xmlns:oel="http://schemas.microsoft.com/office/2019/extlst" xmlns:r="http://schemas.openxmlformats.org/officeDocument/2006/relationships" xmlns:m="http://schemas.openxmlformats.org/officeDocument/2006/math" xmlns:v="urn:schemas-microsoft-com:vml" xmlns:wp14="http://schemas.microsoft.com/office/word/2010/wordprocessingDrawing" xmlns:wp="http://schemas.openxmlformats.org/drawingml/2006/wordprocessingDrawing" xmlns:w10="urn:schemas-microsoft-com:office:word" xmlns:w="http://schemas.openxmlformats.org/wordprocessingml/2006/main" xmlns:w14="http://schemas.microsoft.com/office/word/2010/wordml" xmlns:w15="http://schemas.microsoft.com/office/word/2012/wordml" xmlns:w16cex="http://schemas.microsoft.com/office/word/2018/wordml/cex" xmlns:w16cid="http://schemas.microsoft.com/office/word/2016/wordml/cid" xmlns:w16="http://schemas.microsoft.com/office/word/2018/wordml" xmlns:w16sdtdh="http://schemas.microsoft.com/office/word/2020/wordml/sdtdatahash" xmlns:w16se="http://schemas.microsoft.com/office/word/2015/wordml/symex" xmlns:wpg="http://schemas.microsoft.com/office/word/2010/wordprocessingGroup" xmlns:wpi="http://schemas.microsoft.com/office/word/2010/wordprocessingInk" xmlns:wne="http://schemas.microsoft.com/office/word/2006/wordml" xmlns:wps="http://schemas.microsoft.com/office/word/2010/wordprocessingShape" mc:Ignorable="w14 w15 w16se w16cid w16 w16cex w16sdtdh wp14">
+<w16cex:commentsExtensible xmlns:wpc="http://schemas.microsoft.com/office/word/2010/wordprocessingCanvas" xmlns:cx="http://schemas.microsoft.com/office/drawing/2014/chartex" xmlns:cx1="http://schemas.microsoft.com/office/drawing/2015/9/8/chartex" xmlns:cx2="http://schemas.microsoft.com/office/drawing/2015/10/21/chartex" xmlns:cx3="http://schemas.microsoft.com/office/drawing/2016/5/9/chartex" xmlns:cx4="http://schemas.microsoft.com/office/drawing/2016/5/10/chartex" xmlns:cx5="http://schemas.microsoft.com/office/drawing/2016/5/11/chartex" xmlns:cx6="http://schemas.microsoft.com/office/drawing/2016/5/12/chartex" xmlns:cx7="http://schemas.microsoft.com/office/drawing/2016/5/13/chartex" xmlns:cx8="http://schemas.microsoft.com/office/drawing/2016/5/14/chartex" xmlns:cr="http://schemas.microsoft.com/office/comments/2020/reactions" xmlns:mc="http://schemas.openxmlformats.org/markup-compatibility/2006" xmlns:aink="http://schemas.microsoft.com/office/drawing/2016/ink" xmlns:am3d="http://schemas.microsoft.com/office/drawing/2017/model3d" xmlns:o="urn:schemas-microsoft-com:office:office" xmlns:oel="http://schemas.microsoft.com/office/2019/extlst" xmlns:r="http://schemas.openxmlformats.org/officeDocument/2006/relationships" xmlns:m="http://schemas.openxmlformats.org/officeDocument/2006/math" xmlns:v="urn:schemas-microsoft-com:vml" xmlns:wp14="http://schemas.microsoft.com/office/word/2010/wordprocessingDrawing" xmlns:wp="http://schemas.openxmlformats.org/drawingml/2006/wordprocessingDrawing" xmlns:w10="urn:schemas-microsoft-com:office:word" xmlns:w="http://schemas.openxmlformats.org/wordprocessingml/2006/main" xmlns:w14="http://schemas.microsoft.com/office/word/2010/wordml" xmlns:w15="http://schemas.microsoft.com/office/word/2012/wordml" xmlns:w16cex="http://schemas.microsoft.com/office/word/2018/wordml/cex" xmlns:w16cid="http://schemas.microsoft.com/office/word/2016/wordml/cid" xmlns:w16="http://schemas.microsoft.com/office/word/2018/wordml" xmlns:w16du="http://schemas.microsoft.com/office/word/2023/wordml/word16du" xmlns:w16sdtdh="http://schemas.microsoft.com/office/word/2020/wordml/sdtdatahash" xmlns:w16sdtfl="http://schemas.microsoft.com/office/word/2024/wordml/sdtformatlock" xmlns:w16se="http://schemas.microsoft.com/office/word/2015/wordml/symex" xmlns:wpg="http://schemas.microsoft.com/office/word/2010/wordprocessingGroup" xmlns:wpi="http://schemas.microsoft.com/office/word/2010/wordprocessingInk" xmlns:wne="http://schemas.microsoft.com/office/word/2006/wordml" xmlns:wps="http://schemas.microsoft.com/office/word/2010/wordprocessingShape" mc:Ignorable="w14 w15 w16se w16cid w16 w16cex w16sdtdh w16sdtfl cr w16du wp14">
   <w16cex:commentExtensible w16cex:durableId="270F97C1" w16cex:dateUtc="2022-11-04T17:53:00Z"/>
   <w16cex:commentExtensible w16cex:durableId="26E7EA05" w16cex:dateUtc="2022-10-05T15:33:00Z"/>
   <w16cex:commentExtensible w16cex:durableId="273033CB" w16cex:dateUtc="2022-11-29T12:31:00Z"/>
@@ -31694,7 +31706,7 @@
 </file>
 
 <file path=word/commentsIds.xml><?xml version="1.0" encoding="utf-8"?>
-<w16cid:commentsIds xmlns:wpc="http://schemas.microsoft.com/office/word/2010/wordprocessingCanvas" xmlns:cx="http://schemas.microsoft.com/office/drawing/2014/chartex" xmlns:cx1="http://schemas.microsoft.com/office/drawing/2015/9/8/chartex" xmlns:cx2="http://schemas.microsoft.com/office/drawing/2015/10/21/chartex" xmlns:cx3="http://schemas.microsoft.com/office/drawing/2016/5/9/chartex" xmlns:cx4="http://schemas.microsoft.com/office/drawing/2016/5/10/chartex" xmlns:cx5="http://schemas.microsoft.com/office/drawing/2016/5/11/chartex" xmlns:cx6="http://schemas.microsoft.com/office/drawing/2016/5/12/chartex" xmlns:cx7="http://schemas.microsoft.com/office/drawing/2016/5/13/chartex" xmlns:cx8="http://schemas.microsoft.com/office/drawing/2016/5/14/chartex" xmlns:mc="http://schemas.openxmlformats.org/markup-compatibility/2006" xmlns:aink="http://schemas.microsoft.com/office/drawing/2016/ink" xmlns:am3d="http://schemas.microsoft.com/office/drawing/2017/model3d" xmlns:o="urn:schemas-microsoft-com:office:office" xmlns:oel="http://schemas.microsoft.com/office/2019/extlst" xmlns:r="http://schemas.openxmlformats.org/officeDocument/2006/relationships" xmlns:m="http://schemas.openxmlformats.org/officeDocument/2006/math" xmlns:v="urn:schemas-microsoft-com:vml" xmlns:wp14="http://schemas.microsoft.com/office/word/2010/wordprocessingDrawing" xmlns:wp="http://schemas.openxmlformats.org/drawingml/2006/wordprocessingDrawing" xmlns:w10="urn:schemas-microsoft-com:office:word" xmlns:w="http://schemas.openxmlformats.org/wordprocessingml/2006/main" xmlns:w14="http://schemas.microsoft.com/office/word/2010/wordml" xmlns:w15="http://schemas.microsoft.com/office/word/2012/wordml" xmlns:w16cex="http://schemas.microsoft.com/office/word/2018/wordml/cex" xmlns:w16cid="http://schemas.microsoft.com/office/word/2016/wordml/cid" xmlns:w16="http://schemas.microsoft.com/office/word/2018/wordml" xmlns:w16sdtdh="http://schemas.microsoft.com/office/word/2020/wordml/sdtdatahash" xmlns:w16se="http://schemas.microsoft.com/office/word/2015/wordml/symex" xmlns:wpg="http://schemas.microsoft.com/office/word/2010/wordprocessingGroup" xmlns:wpi="http://schemas.microsoft.com/office/word/2010/wordprocessingInk" xmlns:wne="http://schemas.microsoft.com/office/word/2006/wordml" xmlns:wps="http://schemas.microsoft.com/office/word/2010/wordprocessingShape" mc:Ignorable="w14 w15 w16se w16cid w16 w16cex w16sdtdh wp14">
+<w16cid:commentsIds xmlns:wpc="http://schemas.microsoft.com/office/word/2010/wordprocessingCanvas" xmlns:cx="http://schemas.microsoft.com/office/drawing/2014/chartex" xmlns:cx1="http://schemas.microsoft.com/office/drawing/2015/9/8/chartex" xmlns:cx2="http://schemas.microsoft.com/office/drawing/2015/10/21/chartex" xmlns:cx3="http://schemas.microsoft.com/office/drawing/2016/5/9/chartex" xmlns:cx4="http://schemas.microsoft.com/office/drawing/2016/5/10/chartex" xmlns:cx5="http://schemas.microsoft.com/office/drawing/2016/5/11/chartex" xmlns:cx6="http://schemas.microsoft.com/office/drawing/2016/5/12/chartex" xmlns:cx7="http://schemas.microsoft.com/office/drawing/2016/5/13/chartex" xmlns:cx8="http://schemas.microsoft.com/office/drawing/2016/5/14/chartex" xmlns:mc="http://schemas.openxmlformats.org/markup-compatibility/2006" xmlns:aink="http://schemas.microsoft.com/office/drawing/2016/ink" xmlns:am3d="http://schemas.microsoft.com/office/drawing/2017/model3d" xmlns:o="urn:schemas-microsoft-com:office:office" xmlns:oel="http://schemas.microsoft.com/office/2019/extlst" xmlns:r="http://schemas.openxmlformats.org/officeDocument/2006/relationships" xmlns:m="http://schemas.openxmlformats.org/officeDocument/2006/math" xmlns:v="urn:schemas-microsoft-com:vml" xmlns:wp14="http://schemas.microsoft.com/office/word/2010/wordprocessingDrawing" xmlns:wp="http://schemas.openxmlformats.org/drawingml/2006/wordprocessingDrawing" xmlns:w10="urn:schemas-microsoft-com:office:word" xmlns:w="http://schemas.openxmlformats.org/wordprocessingml/2006/main" xmlns:w14="http://schemas.microsoft.com/office/word/2010/wordml" xmlns:w15="http://schemas.microsoft.com/office/word/2012/wordml" xmlns:w16cex="http://schemas.microsoft.com/office/word/2018/wordml/cex" xmlns:w16cid="http://schemas.microsoft.com/office/word/2016/wordml/cid" xmlns:w16="http://schemas.microsoft.com/office/word/2018/wordml" xmlns:w16du="http://schemas.microsoft.com/office/word/2023/wordml/word16du" xmlns:w16sdtdh="http://schemas.microsoft.com/office/word/2020/wordml/sdtdatahash" xmlns:w16sdtfl="http://schemas.microsoft.com/office/word/2024/wordml/sdtformatlock" xmlns:w16se="http://schemas.microsoft.com/office/word/2015/wordml/symex" xmlns:wpg="http://schemas.microsoft.com/office/word/2010/wordprocessingGroup" xmlns:wpi="http://schemas.microsoft.com/office/word/2010/wordprocessingInk" xmlns:wne="http://schemas.microsoft.com/office/word/2006/wordml" xmlns:wps="http://schemas.microsoft.com/office/word/2010/wordprocessingShape" mc:Ignorable="w14 w15 w16se w16cid w16 w16cex w16sdtdh w16sdtfl w16du wp14">
   <w16cid:commentId w16cid:paraId="6D5FF374" w16cid:durableId="270F97C1"/>
   <w16cid:commentId w16cid:paraId="2CC2B184" w16cid:durableId="26E7EA05"/>
   <w16cid:commentId w16cid:paraId="7D03FC18" w16cid:durableId="273033CB"/>
@@ -31782,7 +31794,7 @@
 </file>
 
 <file path=word/endnotes.xml><?xml version="1.0" encoding="utf-8"?>
-<w:endnotes xmlns:wpc="http://schemas.microsoft.com/office/word/2010/wordprocessingCanvas" xmlns:cx="http://schemas.microsoft.com/office/drawing/2014/chartex" xmlns:cx1="http://schemas.microsoft.com/office/drawing/2015/9/8/chartex" xmlns:cx2="http://schemas.microsoft.com/office/drawing/2015/10/21/chartex" xmlns:cx3="http://schemas.microsoft.com/office/drawing/2016/5/9/chartex" xmlns:cx4="http://schemas.microsoft.com/office/drawing/2016/5/10/chartex" xmlns:cx5="http://schemas.microsoft.com/office/drawing/2016/5/11/chartex" xmlns:cx6="http://schemas.microsoft.com/office/drawing/2016/5/12/chartex" xmlns:cx7="http://schemas.microsoft.com/office/drawing/2016/5/13/chartex" xmlns:cx8="http://schemas.microsoft.com/office/drawing/2016/5/14/chartex" xmlns:mc="http://schemas.openxmlformats.org/markup-compatibility/2006" xmlns:aink="http://schemas.microsoft.com/office/drawing/2016/ink" xmlns:am3d="http://schemas.microsoft.com/office/drawing/2017/model3d" xmlns:o="urn:schemas-microsoft-com:office:office" xmlns:oel="http://schemas.microsoft.com/office/2019/extlst" xmlns:r="http://schemas.openxmlformats.org/officeDocument/2006/relationships" xmlns:m="http://schemas.openxmlformats.org/officeDocument/2006/math" xmlns:v="urn:schemas-microsoft-com:vml" xmlns:wp14="http://schemas.microsoft.com/office/word/2010/wordprocessingDrawing" xmlns:wp="http://schemas.openxmlformats.org/drawingml/2006/wordprocessingDrawing" xmlns:w10="urn:schemas-microsoft-com:office:word" xmlns:w="http://schemas.openxmlformats.org/wordprocessingml/2006/main" xmlns:w14="http://schemas.microsoft.com/office/word/2010/wordml" xmlns:w15="http://schemas.microsoft.com/office/word/2012/wordml" xmlns:w16cex="http://schemas.microsoft.com/office/word/2018/wordml/cex" xmlns:w16cid="http://schemas.microsoft.com/office/word/2016/wordml/cid" xmlns:w16="http://schemas.microsoft.com/office/word/2018/wordml" xmlns:w16sdtdh="http://schemas.microsoft.com/office/word/2020/wordml/sdtdatahash" xmlns:w16se="http://schemas.microsoft.com/office/word/2015/wordml/symex" xmlns:wpg="http://schemas.microsoft.com/office/word/2010/wordprocessingGroup" xmlns:wpi="http://schemas.microsoft.com/office/word/2010/wordprocessingInk" xmlns:wne="http://schemas.microsoft.com/office/word/2006/wordml" xmlns:wps="http://schemas.microsoft.com/office/word/2010/wordprocessingShape" mc:Ignorable="w14 w15 w16se w16cid w16 w16cex w16sdtdh wp14">
+<w:endnotes xmlns:wpc="http://schemas.microsoft.com/office/word/2010/wordprocessingCanvas" xmlns:cx="http://schemas.microsoft.com/office/drawing/2014/chartex" xmlns:cx1="http://schemas.microsoft.com/office/drawing/2015/9/8/chartex" xmlns:cx2="http://schemas.microsoft.com/office/drawing/2015/10/21/chartex" xmlns:cx3="http://schemas.microsoft.com/office/drawing/2016/5/9/chartex" xmlns:cx4="http://schemas.microsoft.com/office/drawing/2016/5/10/chartex" xmlns:cx5="http://schemas.microsoft.com/office/drawing/2016/5/11/chartex" xmlns:cx6="http://schemas.microsoft.com/office/drawing/2016/5/12/chartex" xmlns:cx7="http://schemas.microsoft.com/office/drawing/2016/5/13/chartex" xmlns:cx8="http://schemas.microsoft.com/office/drawing/2016/5/14/chartex" xmlns:mc="http://schemas.openxmlformats.org/markup-compatibility/2006" xmlns:aink="http://schemas.microsoft.com/office/drawing/2016/ink" xmlns:am3d="http://schemas.microsoft.com/office/drawing/2017/model3d" xmlns:o="urn:schemas-microsoft-com:office:office" xmlns:oel="http://schemas.microsoft.com/office/2019/extlst" xmlns:r="http://schemas.openxmlformats.org/officeDocument/2006/relationships" xmlns:m="http://schemas.openxmlformats.org/officeDocument/2006/math" xmlns:v="urn:schemas-microsoft-com:vml" xmlns:wp14="http://schemas.microsoft.com/office/word/2010/wordprocessingDrawing" xmlns:wp="http://schemas.openxmlformats.org/drawingml/2006/wordprocessingDrawing" xmlns:w10="urn:schemas-microsoft-com:office:word" xmlns:w="http://schemas.openxmlformats.org/wordprocessingml/2006/main" xmlns:w14="http://schemas.microsoft.com/office/word/2010/wordml" xmlns:w15="http://schemas.microsoft.com/office/word/2012/wordml" xmlns:w16cex="http://schemas.microsoft.com/office/word/2018/wordml/cex" xmlns:w16cid="http://schemas.microsoft.com/office/word/2016/wordml/cid" xmlns:w16="http://schemas.microsoft.com/office/word/2018/wordml" xmlns:w16du="http://schemas.microsoft.com/office/word/2023/wordml/word16du" xmlns:w16sdtdh="http://schemas.microsoft.com/office/word/2020/wordml/sdtdatahash" xmlns:w16sdtfl="http://schemas.microsoft.com/office/word/2024/wordml/sdtformatlock" xmlns:w16se="http://schemas.microsoft.com/office/word/2015/wordml/symex" xmlns:wpg="http://schemas.microsoft.com/office/word/2010/wordprocessingGroup" xmlns:wpi="http://schemas.microsoft.com/office/word/2010/wordprocessingInk" xmlns:wne="http://schemas.microsoft.com/office/word/2006/wordml" xmlns:wps="http://schemas.microsoft.com/office/word/2010/wordprocessingShape" mc:Ignorable="w14 w15 w16se w16cid w16 w16cex w16sdtdh w16sdtfl w16du wp14">
   <w:endnote w:type="separator" w:id="-1">
     <w:p>
       <w:r>
@@ -31801,7 +31813,7 @@
 </file>
 
 <file path=word/footer1.xml><?xml version="1.0" encoding="utf-8"?>
-<w:ftr xmlns:wpc="http://schemas.microsoft.com/office/word/2010/wordprocessingCanvas" xmlns:cx="http://schemas.microsoft.com/office/drawing/2014/chartex" xmlns:cx1="http://schemas.microsoft.com/office/drawing/2015/9/8/chartex" xmlns:cx2="http://schemas.microsoft.com/office/drawing/2015/10/21/chartex" xmlns:cx3="http://schemas.microsoft.com/office/drawing/2016/5/9/chartex" xmlns:cx4="http://schemas.microsoft.com/office/drawing/2016/5/10/chartex" xmlns:cx5="http://schemas.microsoft.com/office/drawing/2016/5/11/chartex" xmlns:cx6="http://schemas.microsoft.com/office/drawing/2016/5/12/chartex" xmlns:cx7="http://schemas.microsoft.com/office/drawing/2016/5/13/chartex" xmlns:cx8="http://schemas.microsoft.com/office/drawing/2016/5/14/chartex" xmlns:mc="http://schemas.openxmlformats.org/markup-compatibility/2006" xmlns:aink="http://schemas.microsoft.com/office/drawing/2016/ink" xmlns:am3d="http://schemas.microsoft.com/office/drawing/2017/model3d" xmlns:o="urn:schemas-microsoft-com:office:office" xmlns:oel="http://schemas.microsoft.com/office/2019/extlst" xmlns:r="http://schemas.openxmlformats.org/officeDocument/2006/relationships" xmlns:m="http://schemas.openxmlformats.org/officeDocument/2006/math" xmlns:v="urn:schemas-microsoft-com:vml" xmlns:wp14="http://schemas.microsoft.com/office/word/2010/wordprocessingDrawing" xmlns:wp="http://schemas.openxmlformats.org/drawingml/2006/wordprocessingDrawing" xmlns:w10="urn:schemas-microsoft-com:office:word" xmlns:w="http://schemas.openxmlformats.org/wordprocessingml/2006/main" xmlns:w14="http://schemas.microsoft.com/office/word/2010/wordml" xmlns:w15="http://schemas.microsoft.com/office/word/2012/wordml" xmlns:w16cex="http://schemas.microsoft.com/office/word/2018/wordml/cex" xmlns:w16cid="http://schemas.microsoft.com/office/word/2016/wordml/cid" xmlns:w16="http://schemas.microsoft.com/office/word/2018/wordml" xmlns:w16sdtdh="http://schemas.microsoft.com/office/word/2020/wordml/sdtdatahash" xmlns:w16se="http://schemas.microsoft.com/office/word/2015/wordml/symex" xmlns:wpg="http://schemas.microsoft.com/office/word/2010/wordprocessingGroup" xmlns:wpi="http://schemas.microsoft.com/office/word/2010/wordprocessingInk" xmlns:wne="http://schemas.microsoft.com/office/word/2006/wordml" xmlns:wps="http://schemas.microsoft.com/office/word/2010/wordprocessingShape" mc:Ignorable="w14 w15 w16se w16cid w16 w16cex w16sdtdh wp14">
+<w:ftr xmlns:wpc="http://schemas.microsoft.com/office/word/2010/wordprocessingCanvas" xmlns:cx="http://schemas.microsoft.com/office/drawing/2014/chartex" xmlns:cx1="http://schemas.microsoft.com/office/drawing/2015/9/8/chartex" xmlns:cx2="http://schemas.microsoft.com/office/drawing/2015/10/21/chartex" xmlns:cx3="http://schemas.microsoft.com/office/drawing/2016/5/9/chartex" xmlns:cx4="http://schemas.microsoft.com/office/drawing/2016/5/10/chartex" xmlns:cx5="http://schemas.microsoft.com/office/drawing/2016/5/11/chartex" xmlns:cx6="http://schemas.microsoft.com/office/drawing/2016/5/12/chartex" xmlns:cx7="http://schemas.microsoft.com/office/drawing/2016/5/13/chartex" xmlns:cx8="http://schemas.microsoft.com/office/drawing/2016/5/14/chartex" xmlns:mc="http://schemas.openxmlformats.org/markup-compatibility/2006" xmlns:aink="http://schemas.microsoft.com/office/drawing/2016/ink" xmlns:am3d="http://schemas.microsoft.com/office/drawing/2017/model3d" xmlns:o="urn:schemas-microsoft-com:office:office" xmlns:oel="http://schemas.microsoft.com/office/2019/extlst" xmlns:r="http://schemas.openxmlformats.org/officeDocument/2006/relationships" xmlns:m="http://schemas.openxmlformats.org/officeDocument/2006/math" xmlns:v="urn:schemas-microsoft-com:vml" xmlns:wp14="http://schemas.microsoft.com/office/word/2010/wordprocessingDrawing" xmlns:wp="http://schemas.openxmlformats.org/drawingml/2006/wordprocessingDrawing" xmlns:w10="urn:schemas-microsoft-com:office:word" xmlns:w="http://schemas.openxmlformats.org/wordprocessingml/2006/main" xmlns:w14="http://schemas.microsoft.com/office/word/2010/wordml" xmlns:w15="http://schemas.microsoft.com/office/word/2012/wordml" xmlns:w16cex="http://schemas.microsoft.com/office/word/2018/wordml/cex" xmlns:w16cid="http://schemas.microsoft.com/office/word/2016/wordml/cid" xmlns:w16="http://schemas.microsoft.com/office/word/2018/wordml" xmlns:w16du="http://schemas.microsoft.com/office/word/2023/wordml/word16du" xmlns:w16sdtdh="http://schemas.microsoft.com/office/word/2020/wordml/sdtdatahash" xmlns:w16sdtfl="http://schemas.microsoft.com/office/word/2024/wordml/sdtformatlock" xmlns:w16se="http://schemas.microsoft.com/office/word/2015/wordml/symex" xmlns:wpg="http://schemas.microsoft.com/office/word/2010/wordprocessingGroup" xmlns:wpi="http://schemas.microsoft.com/office/word/2010/wordprocessingInk" xmlns:wne="http://schemas.microsoft.com/office/word/2006/wordml" xmlns:wps="http://schemas.microsoft.com/office/word/2010/wordprocessingShape" mc:Ignorable="w14 w15 w16se w16cid w16 w16cex w16sdtdh w16sdtfl w16du wp14">
   <w:p>
     <w:pPr>
       <w:pStyle w:val="Footer"/>
@@ -31846,7 +31858,7 @@
 </file>
 
 <file path=word/footer2.xml><?xml version="1.0" encoding="utf-8"?>
-<w:ftr xmlns:wpc="http://schemas.microsoft.com/office/word/2010/wordprocessingCanvas" xmlns:cx="http://schemas.microsoft.com/office/drawing/2014/chartex" xmlns:cx1="http://schemas.microsoft.com/office/drawing/2015/9/8/chartex" xmlns:cx2="http://schemas.microsoft.com/office/drawing/2015/10/21/chartex" xmlns:cx3="http://schemas.microsoft.com/office/drawing/2016/5/9/chartex" xmlns:cx4="http://schemas.microsoft.com/office/drawing/2016/5/10/chartex" xmlns:cx5="http://schemas.microsoft.com/office/drawing/2016/5/11/chartex" xmlns:cx6="http://schemas.microsoft.com/office/drawing/2016/5/12/chartex" xmlns:cx7="http://schemas.microsoft.com/office/drawing/2016/5/13/chartex" xmlns:cx8="http://schemas.microsoft.com/office/drawing/2016/5/14/chartex" xmlns:mc="http://schemas.openxmlformats.org/markup-compatibility/2006" xmlns:aink="http://schemas.microsoft.com/office/drawing/2016/ink" xmlns:am3d="http://schemas.microsoft.com/office/drawing/2017/model3d" xmlns:o="urn:schemas-microsoft-com:office:office" xmlns:oel="http://schemas.microsoft.com/office/2019/extlst" xmlns:r="http://schemas.openxmlformats.org/officeDocument/2006/relationships" xmlns:m="http://schemas.openxmlformats.org/officeDocument/2006/math" xmlns:v="urn:schemas-microsoft-com:vml" xmlns:wp14="http://schemas.microsoft.com/office/word/2010/wordprocessingDrawing" xmlns:wp="http://schemas.openxmlformats.org/drawingml/2006/wordprocessingDrawing" xmlns:w10="urn:schemas-microsoft-com:office:word" xmlns:w="http://schemas.openxmlformats.org/wordprocessingml/2006/main" xmlns:w14="http://schemas.microsoft.com/office/word/2010/wordml" xmlns:w15="http://schemas.microsoft.com/office/word/2012/wordml" xmlns:w16cex="http://schemas.microsoft.com/office/word/2018/wordml/cex" xmlns:w16cid="http://schemas.microsoft.com/office/word/2016/wordml/cid" xmlns:w16="http://schemas.microsoft.com/office/word/2018/wordml" xmlns:w16sdtdh="http://schemas.microsoft.com/office/word/2020/wordml/sdtdatahash" xmlns:w16se="http://schemas.microsoft.com/office/word/2015/wordml/symex" xmlns:wpg="http://schemas.microsoft.com/office/word/2010/wordprocessingGroup" xmlns:wpi="http://schemas.microsoft.com/office/word/2010/wordprocessingInk" xmlns:wne="http://schemas.microsoft.com/office/word/2006/wordml" xmlns:wps="http://schemas.microsoft.com/office/word/2010/wordprocessingShape" mc:Ignorable="w14 w15 w16se w16cid w16 w16cex w16sdtdh wp14">
+<w:ftr xmlns:wpc="http://schemas.microsoft.com/office/word/2010/wordprocessingCanvas" xmlns:cx="http://schemas.microsoft.com/office/drawing/2014/chartex" xmlns:cx1="http://schemas.microsoft.com/office/drawing/2015/9/8/chartex" xmlns:cx2="http://schemas.microsoft.com/office/drawing/2015/10/21/chartex" xmlns:cx3="http://schemas.microsoft.com/office/drawing/2016/5/9/chartex" xmlns:cx4="http://schemas.microsoft.com/office/drawing/2016/5/10/chartex" xmlns:cx5="http://schemas.microsoft.com/office/drawing/2016/5/11/chartex" xmlns:cx6="http://schemas.microsoft.com/office/drawing/2016/5/12/chartex" xmlns:cx7="http://schemas.microsoft.com/office/drawing/2016/5/13/chartex" xmlns:cx8="http://schemas.microsoft.com/office/drawing/2016/5/14/chartex" xmlns:mc="http://schemas.openxmlformats.org/markup-compatibility/2006" xmlns:aink="http://schemas.microsoft.com/office/drawing/2016/ink" xmlns:am3d="http://schemas.microsoft.com/office/drawing/2017/model3d" xmlns:o="urn:schemas-microsoft-com:office:office" xmlns:oel="http://schemas.microsoft.com/office/2019/extlst" xmlns:r="http://schemas.openxmlformats.org/officeDocument/2006/relationships" xmlns:m="http://schemas.openxmlformats.org/officeDocument/2006/math" xmlns:v="urn:schemas-microsoft-com:vml" xmlns:wp14="http://schemas.microsoft.com/office/word/2010/wordprocessingDrawing" xmlns:wp="http://schemas.openxmlformats.org/drawingml/2006/wordprocessingDrawing" xmlns:w10="urn:schemas-microsoft-com:office:word" xmlns:w="http://schemas.openxmlformats.org/wordprocessingml/2006/main" xmlns:w14="http://schemas.microsoft.com/office/word/2010/wordml" xmlns:w15="http://schemas.microsoft.com/office/word/2012/wordml" xmlns:w16cex="http://schemas.microsoft.com/office/word/2018/wordml/cex" xmlns:w16cid="http://schemas.microsoft.com/office/word/2016/wordml/cid" xmlns:w16="http://schemas.microsoft.com/office/word/2018/wordml" xmlns:w16du="http://schemas.microsoft.com/office/word/2023/wordml/word16du" xmlns:w16sdtdh="http://schemas.microsoft.com/office/word/2020/wordml/sdtdatahash" xmlns:w16sdtfl="http://schemas.microsoft.com/office/word/2024/wordml/sdtformatlock" xmlns:w16se="http://schemas.microsoft.com/office/word/2015/wordml/symex" xmlns:wpg="http://schemas.microsoft.com/office/word/2010/wordprocessingGroup" xmlns:wpi="http://schemas.microsoft.com/office/word/2010/wordprocessingInk" xmlns:wne="http://schemas.microsoft.com/office/word/2006/wordml" xmlns:wps="http://schemas.microsoft.com/office/word/2010/wordprocessingShape" mc:Ignorable="w14 w15 w16se w16cid w16 w16cex w16sdtdh w16sdtfl w16du wp14">
   <w:p>
     <w:pPr>
       <w:pStyle w:val="Footer"/>
@@ -32377,7 +32389,7 @@
 </file>
 
 <file path=word/footnotes.xml><?xml version="1.0" encoding="utf-8"?>
-<w:footnotes xmlns:wpc="http://schemas.microsoft.com/office/word/2010/wordprocessingCanvas" xmlns:cx="http://schemas.microsoft.com/office/drawing/2014/chartex" xmlns:cx1="http://schemas.microsoft.com/office/drawing/2015/9/8/chartex" xmlns:cx2="http://schemas.microsoft.com/office/drawing/2015/10/21/chartex" xmlns:cx3="http://schemas.microsoft.com/office/drawing/2016/5/9/chartex" xmlns:cx4="http://schemas.microsoft.com/office/drawing/2016/5/10/chartex" xmlns:cx5="http://schemas.microsoft.com/office/drawing/2016/5/11/chartex" xmlns:cx6="http://schemas.microsoft.com/office/drawing/2016/5/12/chartex" xmlns:cx7="http://schemas.microsoft.com/office/drawing/2016/5/13/chartex" xmlns:cx8="http://schemas.microsoft.com/office/drawing/2016/5/14/chartex" xmlns:mc="http://schemas.openxmlformats.org/markup-compatibility/2006" xmlns:aink="http://schemas.microsoft.com/office/drawing/2016/ink" xmlns:am3d="http://schemas.microsoft.com/office/drawing/2017/model3d" xmlns:o="urn:schemas-microsoft-com:office:office" xmlns:oel="http://schemas.microsoft.com/office/2019/extlst" xmlns:r="http://schemas.openxmlformats.org/officeDocument/2006/relationships" xmlns:m="http://schemas.openxmlformats.org/officeDocument/2006/math" xmlns:v="urn:schemas-microsoft-com:vml" xmlns:wp14="http://schemas.microsoft.com/office/word/2010/wordprocessingDrawing" xmlns:wp="http://schemas.openxmlformats.org/drawingml/2006/wordprocessingDrawing" xmlns:w10="urn:schemas-microsoft-com:office:word" xmlns:w="http://schemas.openxmlformats.org/wordprocessingml/2006/main" xmlns:w14="http://schemas.microsoft.com/office/word/2010/wordml" xmlns:w15="http://schemas.microsoft.com/office/word/2012/wordml" xmlns:w16cex="http://schemas.microsoft.com/office/word/2018/wordml/cex" xmlns:w16cid="http://schemas.microsoft.com/office/word/2016/wordml/cid" xmlns:w16="http://schemas.microsoft.com/office/word/2018/wordml" xmlns:w16sdtdh="http://schemas.microsoft.com/office/word/2020/wordml/sdtdatahash" xmlns:w16se="http://schemas.microsoft.com/office/word/2015/wordml/symex" xmlns:wpg="http://schemas.microsoft.com/office/word/2010/wordprocessingGroup" xmlns:wpi="http://schemas.microsoft.com/office/word/2010/wordprocessingInk" xmlns:wne="http://schemas.microsoft.com/office/word/2006/wordml" xmlns:wps="http://schemas.microsoft.com/office/word/2010/wordprocessingShape" mc:Ignorable="w14 w15 w16se w16cid w16 w16cex w16sdtdh wp14">
+<w:footnotes xmlns:wpc="http://schemas.microsoft.com/office/word/2010/wordprocessingCanvas" xmlns:cx="http://schemas.microsoft.com/office/drawing/2014/chartex" xmlns:cx1="http://schemas.microsoft.com/office/drawing/2015/9/8/chartex" xmlns:cx2="http://schemas.microsoft.com/office/drawing/2015/10/21/chartex" xmlns:cx3="http://schemas.microsoft.com/office/drawing/2016/5/9/chartex" xmlns:cx4="http://schemas.microsoft.com/office/drawing/2016/5/10/chartex" xmlns:cx5="http://schemas.microsoft.com/office/drawing/2016/5/11/chartex" xmlns:cx6="http://schemas.microsoft.com/office/drawing/2016/5/12/chartex" xmlns:cx7="http://schemas.microsoft.com/office/drawing/2016/5/13/chartex" xmlns:cx8="http://schemas.microsoft.com/office/drawing/2016/5/14/chartex" xmlns:mc="http://schemas.openxmlformats.org/markup-compatibility/2006" xmlns:aink="http://schemas.microsoft.com/office/drawing/2016/ink" xmlns:am3d="http://schemas.microsoft.com/office/drawing/2017/model3d" xmlns:o="urn:schemas-microsoft-com:office:office" xmlns:oel="http://schemas.microsoft.com/office/2019/extlst" xmlns:r="http://schemas.openxmlformats.org/officeDocument/2006/relationships" xmlns:m="http://schemas.openxmlformats.org/officeDocument/2006/math" xmlns:v="urn:schemas-microsoft-com:vml" xmlns:wp14="http://schemas.microsoft.com/office/word/2010/wordprocessingDrawing" xmlns:wp="http://schemas.openxmlformats.org/drawingml/2006/wordprocessingDrawing" xmlns:w10="urn:schemas-microsoft-com:office:word" xmlns:w="http://schemas.openxmlformats.org/wordprocessingml/2006/main" xmlns:w14="http://schemas.microsoft.com/office/word/2010/wordml" xmlns:w15="http://schemas.microsoft.com/office/word/2012/wordml" xmlns:w16cex="http://schemas.microsoft.com/office/word/2018/wordml/cex" xmlns:w16cid="http://schemas.microsoft.com/office/word/2016/wordml/cid" xmlns:w16="http://schemas.microsoft.com/office/word/2018/wordml" xmlns:w16du="http://schemas.microsoft.com/office/word/2023/wordml/word16du" xmlns:w16sdtdh="http://schemas.microsoft.com/office/word/2020/wordml/sdtdatahash" xmlns:w16sdtfl="http://schemas.microsoft.com/office/word/2024/wordml/sdtformatlock" xmlns:w16se="http://schemas.microsoft.com/office/word/2015/wordml/symex" xmlns:wpg="http://schemas.microsoft.com/office/word/2010/wordprocessingGroup" xmlns:wpi="http://schemas.microsoft.com/office/word/2010/wordprocessingInk" xmlns:wne="http://schemas.microsoft.com/office/word/2006/wordml" xmlns:wps="http://schemas.microsoft.com/office/word/2010/wordprocessingShape" mc:Ignorable="w14 w15 w16se w16cid w16 w16cex w16sdtdh w16sdtfl w16du wp14">
   <w:footnote w:type="separator" w:id="-1">
     <w:p>
       <w:r>
@@ -32396,7 +32408,7 @@
 </file>
 
 <file path=word/header1.xml><?xml version="1.0" encoding="utf-8"?>
-<w:hdr xmlns:wpc="http://schemas.microsoft.com/office/word/2010/wordprocessingCanvas" xmlns:cx="http://schemas.microsoft.com/office/drawing/2014/chartex" xmlns:cx1="http://schemas.microsoft.com/office/drawing/2015/9/8/chartex" xmlns:cx2="http://schemas.microsoft.com/office/drawing/2015/10/21/chartex" xmlns:cx3="http://schemas.microsoft.com/office/drawing/2016/5/9/chartex" xmlns:cx4="http://schemas.microsoft.com/office/drawing/2016/5/10/chartex" xmlns:cx5="http://schemas.microsoft.com/office/drawing/2016/5/11/chartex" xmlns:cx6="http://schemas.microsoft.com/office/drawing/2016/5/12/chartex" xmlns:cx7="http://schemas.microsoft.com/office/drawing/2016/5/13/chartex" xmlns:cx8="http://schemas.microsoft.com/office/drawing/2016/5/14/chartex" xmlns:mc="http://schemas.openxmlformats.org/markup-compatibility/2006" xmlns:aink="http://schemas.microsoft.com/office/drawing/2016/ink" xmlns:am3d="http://schemas.microsoft.com/office/drawing/2017/model3d" xmlns:o="urn:schemas-microsoft-com:office:office" xmlns:oel="http://schemas.microsoft.com/office/2019/extlst" xmlns:r="http://schemas.openxmlformats.org/officeDocument/2006/relationships" xmlns:m="http://schemas.openxmlformats.org/officeDocument/2006/math" xmlns:v="urn:schemas-microsoft-com:vml" xmlns:wp14="http://schemas.microsoft.com/office/word/2010/wordprocessingDrawing" xmlns:wp="http://schemas.openxmlformats.org/drawingml/2006/wordprocessingDrawing" xmlns:w10="urn:schemas-microsoft-com:office:word" xmlns:w="http://schemas.openxmlformats.org/wordprocessingml/2006/main" xmlns:w14="http://schemas.microsoft.com/office/word/2010/wordml" xmlns:w15="http://schemas.microsoft.com/office/word/2012/wordml" xmlns:w16cex="http://schemas.microsoft.com/office/word/2018/wordml/cex" xmlns:w16cid="http://schemas.microsoft.com/office/word/2016/wordml/cid" xmlns:w16="http://schemas.microsoft.com/office/word/2018/wordml" xmlns:w16sdtdh="http://schemas.microsoft.com/office/word/2020/wordml/sdtdatahash" xmlns:w16se="http://schemas.microsoft.com/office/word/2015/wordml/symex" xmlns:wpg="http://schemas.microsoft.com/office/word/2010/wordprocessingGroup" xmlns:wpi="http://schemas.microsoft.com/office/word/2010/wordprocessingInk" xmlns:wne="http://schemas.microsoft.com/office/word/2006/wordml" xmlns:wps="http://schemas.microsoft.com/office/word/2010/wordprocessingShape" mc:Ignorable="w14 w15 w16se w16cid w16 w16cex w16sdtdh wp14">
+<w:hdr xmlns:wpc="http://schemas.microsoft.com/office/word/2010/wordprocessingCanvas" xmlns:cx="http://schemas.microsoft.com/office/drawing/2014/chartex" xmlns:cx1="http://schemas.microsoft.com/office/drawing/2015/9/8/chartex" xmlns:cx2="http://schemas.microsoft.com/office/drawing/2015/10/21/chartex" xmlns:cx3="http://schemas.microsoft.com/office/drawing/2016/5/9/chartex" xmlns:cx4="http://schemas.microsoft.com/office/drawing/2016/5/10/chartex" xmlns:cx5="http://schemas.microsoft.com/office/drawing/2016/5/11/chartex" xmlns:cx6="http://schemas.microsoft.com/office/drawing/2016/5/12/chartex" xmlns:cx7="http://schemas.microsoft.com/office/drawing/2016/5/13/chartex" xmlns:cx8="http://schemas.microsoft.com/office/drawing/2016/5/14/chartex" xmlns:mc="http://schemas.openxmlformats.org/markup-compatibility/2006" xmlns:aink="http://schemas.microsoft.com/office/drawing/2016/ink" xmlns:am3d="http://schemas.microsoft.com/office/drawing/2017/model3d" xmlns:o="urn:schemas-microsoft-com:office:office" xmlns:oel="http://schemas.microsoft.com/office/2019/extlst" xmlns:r="http://schemas.openxmlformats.org/officeDocument/2006/relationships" xmlns:m="http://schemas.openxmlformats.org/officeDocument/2006/math" xmlns:v="urn:schemas-microsoft-com:vml" xmlns:wp14="http://schemas.microsoft.com/office/word/2010/wordprocessingDrawing" xmlns:wp="http://schemas.openxmlformats.org/drawingml/2006/wordprocessingDrawing" xmlns:w10="urn:schemas-microsoft-com:office:word" xmlns:w="http://schemas.openxmlformats.org/wordprocessingml/2006/main" xmlns:w14="http://schemas.microsoft.com/office/word/2010/wordml" xmlns:w15="http://schemas.microsoft.com/office/word/2012/wordml" xmlns:w16cex="http://schemas.microsoft.com/office/word/2018/wordml/cex" xmlns:w16cid="http://schemas.microsoft.com/office/word/2016/wordml/cid" xmlns:w16="http://schemas.microsoft.com/office/word/2018/wordml" xmlns:w16du="http://schemas.microsoft.com/office/word/2023/wordml/word16du" xmlns:w16sdtdh="http://schemas.microsoft.com/office/word/2020/wordml/sdtdatahash" xmlns:w16sdtfl="http://schemas.microsoft.com/office/word/2024/wordml/sdtformatlock" xmlns:w16se="http://schemas.microsoft.com/office/word/2015/wordml/symex" xmlns:wpg="http://schemas.microsoft.com/office/word/2010/wordprocessingGroup" xmlns:wpi="http://schemas.microsoft.com/office/word/2010/wordprocessingInk" xmlns:wne="http://schemas.microsoft.com/office/word/2006/wordml" xmlns:wps="http://schemas.microsoft.com/office/word/2010/wordprocessingShape" mc:Ignorable="w14 w15 w16se w16cid w16 w16cex w16sdtdh w16sdtfl w16du wp14">
   <w:p>
     <w:pPr>
       <w:pStyle w:val="Header"/>
@@ -32405,7 +32417,7 @@
       <w:rPr>
         <w:noProof/>
       </w:rPr>
-      <w:pict w14:anchorId="15B810BE">
+      <w:pict w14:anchorId="602A3837">
         <v:shapetype id="_x0000_t136" coordsize="21600,21600" o:spt="136" adj="10800" path="m@7,l@8,m@5,21600l@6,21600e">
           <v:formulas>
             <v:f eqn="sum #0 0 10800"/>
@@ -32430,7 +32442,7 @@
           </v:handles>
           <o:lock v:ext="edit" text="t" shapetype="t"/>
         </v:shapetype>
-        <v:shape id="PowerPlusWaterMarkObject127076079" o:spid="_x0000_s1026" type="#_x0000_t136" style="position:absolute;margin-left:0;margin-top:0;width:471.3pt;height:188.5pt;rotation:315;z-index:-251653632;mso-position-horizontal:center;mso-position-horizontal-relative:margin;mso-position-vertical:center;mso-position-vertical-relative:margin" o:allowincell="f" fillcolor="silver" stroked="f">
+        <v:shape id="PowerPlusWaterMarkObject127076079" o:spid="_x0000_s1027" type="#_x0000_t136" alt="" style="position:absolute;margin-left:0;margin-top:0;width:471.3pt;height:188.5pt;rotation:315;z-index:-251653632;mso-wrap-edited:f;mso-width-percent:0;mso-height-percent:0;mso-position-horizontal:center;mso-position-horizontal-relative:margin;mso-position-vertical:center;mso-position-vertical-relative:margin;mso-width-percent:0;mso-height-percent:0" o:allowincell="f" fillcolor="silver" stroked="f">
           <v:fill opacity=".5"/>
           <v:textpath style="font-family:&quot;Times New Roman&quot;;font-size:1pt" string="DRAFT"/>
           <w10:wrap anchorx="margin" anchory="margin"/>
@@ -32442,7 +32454,7 @@
 </file>
 
 <file path=word/header2.xml><?xml version="1.0" encoding="utf-8"?>
-<w:hdr xmlns:wpc="http://schemas.microsoft.com/office/word/2010/wordprocessingCanvas" xmlns:cx="http://schemas.microsoft.com/office/drawing/2014/chartex" xmlns:cx1="http://schemas.microsoft.com/office/drawing/2015/9/8/chartex" xmlns:cx2="http://schemas.microsoft.com/office/drawing/2015/10/21/chartex" xmlns:cx3="http://schemas.microsoft.com/office/drawing/2016/5/9/chartex" xmlns:cx4="http://schemas.microsoft.com/office/drawing/2016/5/10/chartex" xmlns:cx5="http://schemas.microsoft.com/office/drawing/2016/5/11/chartex" xmlns:cx6="http://schemas.microsoft.com/office/drawing/2016/5/12/chartex" xmlns:cx7="http://schemas.microsoft.com/office/drawing/2016/5/13/chartex" xmlns:cx8="http://schemas.microsoft.com/office/drawing/2016/5/14/chartex" xmlns:mc="http://schemas.openxmlformats.org/markup-compatibility/2006" xmlns:aink="http://schemas.microsoft.com/office/drawing/2016/ink" xmlns:am3d="http://schemas.microsoft.com/office/drawing/2017/model3d" xmlns:o="urn:schemas-microsoft-com:office:office" xmlns:oel="http://schemas.microsoft.com/office/2019/extlst" xmlns:r="http://schemas.openxmlformats.org/officeDocument/2006/relationships" xmlns:m="http://schemas.openxmlformats.org/officeDocument/2006/math" xmlns:v="urn:schemas-microsoft-com:vml" xmlns:wp14="http://schemas.microsoft.com/office/word/2010/wordprocessingDrawing" xmlns:wp="http://schemas.openxmlformats.org/drawingml/2006/wordprocessingDrawing" xmlns:w10="urn:schemas-microsoft-com:office:word" xmlns:w="http://schemas.openxmlformats.org/wordprocessingml/2006/main" xmlns:w14="http://schemas.microsoft.com/office/word/2010/wordml" xmlns:w15="http://schemas.microsoft.com/office/word/2012/wordml" xmlns:w16cex="http://schemas.microsoft.com/office/word/2018/wordml/cex" xmlns:w16cid="http://schemas.microsoft.com/office/word/2016/wordml/cid" xmlns:w16="http://schemas.microsoft.com/office/word/2018/wordml" xmlns:w16sdtdh="http://schemas.microsoft.com/office/word/2020/wordml/sdtdatahash" xmlns:w16se="http://schemas.microsoft.com/office/word/2015/wordml/symex" xmlns:wpg="http://schemas.microsoft.com/office/word/2010/wordprocessingGroup" xmlns:wpi="http://schemas.microsoft.com/office/word/2010/wordprocessingInk" xmlns:wne="http://schemas.microsoft.com/office/word/2006/wordml" xmlns:wps="http://schemas.microsoft.com/office/word/2010/wordprocessingShape" mc:Ignorable="w14 w15 w16se w16cid w16 w16cex w16sdtdh wp14">
+<w:hdr xmlns:wpc="http://schemas.microsoft.com/office/word/2010/wordprocessingCanvas" xmlns:cx="http://schemas.microsoft.com/office/drawing/2014/chartex" xmlns:cx1="http://schemas.microsoft.com/office/drawing/2015/9/8/chartex" xmlns:cx2="http://schemas.microsoft.com/office/drawing/2015/10/21/chartex" xmlns:cx3="http://schemas.microsoft.com/office/drawing/2016/5/9/chartex" xmlns:cx4="http://schemas.microsoft.com/office/drawing/2016/5/10/chartex" xmlns:cx5="http://schemas.microsoft.com/office/drawing/2016/5/11/chartex" xmlns:cx6="http://schemas.microsoft.com/office/drawing/2016/5/12/chartex" xmlns:cx7="http://schemas.microsoft.com/office/drawing/2016/5/13/chartex" xmlns:cx8="http://schemas.microsoft.com/office/drawing/2016/5/14/chartex" xmlns:mc="http://schemas.openxmlformats.org/markup-compatibility/2006" xmlns:aink="http://schemas.microsoft.com/office/drawing/2016/ink" xmlns:am3d="http://schemas.microsoft.com/office/drawing/2017/model3d" xmlns:o="urn:schemas-microsoft-com:office:office" xmlns:oel="http://schemas.microsoft.com/office/2019/extlst" xmlns:r="http://schemas.openxmlformats.org/officeDocument/2006/relationships" xmlns:m="http://schemas.openxmlformats.org/officeDocument/2006/math" xmlns:v="urn:schemas-microsoft-com:vml" xmlns:wp14="http://schemas.microsoft.com/office/word/2010/wordprocessingDrawing" xmlns:wp="http://schemas.openxmlformats.org/drawingml/2006/wordprocessingDrawing" xmlns:w10="urn:schemas-microsoft-com:office:word" xmlns:w="http://schemas.openxmlformats.org/wordprocessingml/2006/main" xmlns:w14="http://schemas.microsoft.com/office/word/2010/wordml" xmlns:w15="http://schemas.microsoft.com/office/word/2012/wordml" xmlns:w16cex="http://schemas.microsoft.com/office/word/2018/wordml/cex" xmlns:w16cid="http://schemas.microsoft.com/office/word/2016/wordml/cid" xmlns:w16="http://schemas.microsoft.com/office/word/2018/wordml" xmlns:w16du="http://schemas.microsoft.com/office/word/2023/wordml/word16du" xmlns:w16sdtdh="http://schemas.microsoft.com/office/word/2020/wordml/sdtdatahash" xmlns:w16sdtfl="http://schemas.microsoft.com/office/word/2024/wordml/sdtformatlock" xmlns:w16se="http://schemas.microsoft.com/office/word/2015/wordml/symex" xmlns:wpg="http://schemas.microsoft.com/office/word/2010/wordprocessingGroup" xmlns:wpi="http://schemas.microsoft.com/office/word/2010/wordprocessingInk" xmlns:wne="http://schemas.microsoft.com/office/word/2006/wordml" xmlns:wps="http://schemas.microsoft.com/office/word/2010/wordprocessingShape" mc:Ignorable="w14 w15 w16se w16cid w16 w16cex w16sdtdh w16sdtfl w16du wp14">
   <w:tbl>
     <w:tblPr>
       <w:tblW w:w="9653" w:type="dxa"/>
@@ -32475,7 +32487,6 @@
         <w:tcPr>
           <w:tcW w:w="9653" w:type="dxa"/>
           <w:gridSpan w:val="5"/>
-          <w:shd w:val="clear" w:color="auto" w:fill="auto"/>
           <w:vAlign w:val="center"/>
         </w:tcPr>
         <w:p>
@@ -32556,7 +32567,6 @@
       <w:tc>
         <w:tcPr>
           <w:tcW w:w="2070" w:type="dxa"/>
-          <w:shd w:val="clear" w:color="auto" w:fill="auto"/>
           <w:vAlign w:val="center"/>
         </w:tcPr>
         <w:p>
@@ -32587,7 +32597,6 @@
       <w:tc>
         <w:tcPr>
           <w:tcW w:w="2543" w:type="dxa"/>
-          <w:shd w:val="clear" w:color="auto" w:fill="auto"/>
           <w:vAlign w:val="center"/>
         </w:tcPr>
         <w:p>
@@ -32611,7 +32620,6 @@
       <w:tc>
         <w:tcPr>
           <w:tcW w:w="1440" w:type="dxa"/>
-          <w:shd w:val="clear" w:color="auto" w:fill="auto"/>
           <w:vAlign w:val="center"/>
         </w:tcPr>
         <w:p>
@@ -32642,7 +32650,6 @@
       <w:tc>
         <w:tcPr>
           <w:tcW w:w="1777" w:type="dxa"/>
-          <w:shd w:val="clear" w:color="auto" w:fill="auto"/>
           <w:vAlign w:val="center"/>
         </w:tcPr>
         <w:p>
@@ -32666,7 +32673,6 @@
       <w:tc>
         <w:tcPr>
           <w:tcW w:w="1823" w:type="dxa"/>
-          <w:shd w:val="clear" w:color="auto" w:fill="auto"/>
           <w:vAlign w:val="center"/>
         </w:tcPr>
         <w:sdt>
@@ -32779,7 +32785,6 @@
       <w:tc>
         <w:tcPr>
           <w:tcW w:w="2070" w:type="dxa"/>
-          <w:shd w:val="clear" w:color="auto" w:fill="auto"/>
           <w:vAlign w:val="center"/>
         </w:tcPr>
         <w:p>
@@ -32811,7 +32816,6 @@
         <w:tcPr>
           <w:tcW w:w="7583" w:type="dxa"/>
           <w:gridSpan w:val="4"/>
-          <w:shd w:val="clear" w:color="auto" w:fill="auto"/>
           <w:vAlign w:val="center"/>
         </w:tcPr>
         <w:p>
@@ -32834,7 +32838,6 @@
       <w:tc>
         <w:tcPr>
           <w:tcW w:w="2070" w:type="dxa"/>
-          <w:shd w:val="clear" w:color="auto" w:fill="auto"/>
           <w:vAlign w:val="center"/>
         </w:tcPr>
         <w:p>
@@ -32867,7 +32870,6 @@
         <w:tcPr>
           <w:tcW w:w="7583" w:type="dxa"/>
           <w:gridSpan w:val="4"/>
-          <w:shd w:val="clear" w:color="auto" w:fill="auto"/>
           <w:vAlign w:val="center"/>
         </w:tcPr>
         <w:p>
@@ -32909,7 +32911,7 @@
       <w:rPr>
         <w:noProof/>
       </w:rPr>
-      <w:pict w14:anchorId="43098FAD">
+      <w:pict w14:anchorId="58CC6B8C">
         <v:shapetype id="_x0000_t136" coordsize="21600,21600" o:spt="136" adj="10800" path="m@7,l@8,m@5,21600l@6,21600e">
           <v:formulas>
             <v:f eqn="sum #0 0 10800"/>
@@ -32934,7 +32936,7 @@
           </v:handles>
           <o:lock v:ext="edit" text="t" shapetype="t"/>
         </v:shapetype>
-        <v:shape id="PowerPlusWaterMarkObject127076080" o:spid="_x0000_s1027" type="#_x0000_t136" style="position:absolute;margin-left:0;margin-top:0;width:471.3pt;height:188.5pt;rotation:315;z-index:-251651584;mso-position-horizontal:center;mso-position-horizontal-relative:margin;mso-position-vertical:center;mso-position-vertical-relative:margin" o:allowincell="f" fillcolor="silver" stroked="f">
+        <v:shape id="PowerPlusWaterMarkObject127076080" o:spid="_x0000_s1026" type="#_x0000_t136" alt="" style="position:absolute;margin-left:0;margin-top:0;width:471.3pt;height:188.5pt;rotation:315;z-index:-251651584;mso-wrap-edited:f;mso-width-percent:0;mso-height-percent:0;mso-position-horizontal:center;mso-position-horizontal-relative:margin;mso-position-vertical:center;mso-position-vertical-relative:margin;mso-width-percent:0;mso-height-percent:0" o:allowincell="f" fillcolor="silver" stroked="f">
           <v:fill opacity=".5"/>
           <v:textpath style="font-family:&quot;Times New Roman&quot;;font-size:1pt" string="DRAFT"/>
           <w10:wrap anchorx="margin" anchory="margin"/>
@@ -32946,7 +32948,7 @@
 </file>
 
 <file path=word/header3.xml><?xml version="1.0" encoding="utf-8"?>
-<w:hdr xmlns:wpc="http://schemas.microsoft.com/office/word/2010/wordprocessingCanvas" xmlns:cx="http://schemas.microsoft.com/office/drawing/2014/chartex" xmlns:cx1="http://schemas.microsoft.com/office/drawing/2015/9/8/chartex" xmlns:cx2="http://schemas.microsoft.com/office/drawing/2015/10/21/chartex" xmlns:cx3="http://schemas.microsoft.com/office/drawing/2016/5/9/chartex" xmlns:cx4="http://schemas.microsoft.com/office/drawing/2016/5/10/chartex" xmlns:cx5="http://schemas.microsoft.com/office/drawing/2016/5/11/chartex" xmlns:cx6="http://schemas.microsoft.com/office/drawing/2016/5/12/chartex" xmlns:cx7="http://schemas.microsoft.com/office/drawing/2016/5/13/chartex" xmlns:cx8="http://schemas.microsoft.com/office/drawing/2016/5/14/chartex" xmlns:mc="http://schemas.openxmlformats.org/markup-compatibility/2006" xmlns:aink="http://schemas.microsoft.com/office/drawing/2016/ink" xmlns:am3d="http://schemas.microsoft.com/office/drawing/2017/model3d" xmlns:o="urn:schemas-microsoft-com:office:office" xmlns:oel="http://schemas.microsoft.com/office/2019/extlst" xmlns:r="http://schemas.openxmlformats.org/officeDocument/2006/relationships" xmlns:m="http://schemas.openxmlformats.org/officeDocument/2006/math" xmlns:v="urn:schemas-microsoft-com:vml" xmlns:wp14="http://schemas.microsoft.com/office/word/2010/wordprocessingDrawing" xmlns:wp="http://schemas.openxmlformats.org/drawingml/2006/wordprocessingDrawing" xmlns:w10="urn:schemas-microsoft-com:office:word" xmlns:w="http://schemas.openxmlformats.org/wordprocessingml/2006/main" xmlns:w14="http://schemas.microsoft.com/office/word/2010/wordml" xmlns:w15="http://schemas.microsoft.com/office/word/2012/wordml" xmlns:w16cex="http://schemas.microsoft.com/office/word/2018/wordml/cex" xmlns:w16cid="http://schemas.microsoft.com/office/word/2016/wordml/cid" xmlns:w16="http://schemas.microsoft.com/office/word/2018/wordml" xmlns:w16sdtdh="http://schemas.microsoft.com/office/word/2020/wordml/sdtdatahash" xmlns:w16se="http://schemas.microsoft.com/office/word/2015/wordml/symex" xmlns:wpg="http://schemas.microsoft.com/office/word/2010/wordprocessingGroup" xmlns:wpi="http://schemas.microsoft.com/office/word/2010/wordprocessingInk" xmlns:wne="http://schemas.microsoft.com/office/word/2006/wordml" xmlns:wps="http://schemas.microsoft.com/office/word/2010/wordprocessingShape" mc:Ignorable="w14 w15 w16se w16cid w16 w16cex w16sdtdh wp14">
+<w:hdr xmlns:wpc="http://schemas.microsoft.com/office/word/2010/wordprocessingCanvas" xmlns:cx="http://schemas.microsoft.com/office/drawing/2014/chartex" xmlns:cx1="http://schemas.microsoft.com/office/drawing/2015/9/8/chartex" xmlns:cx2="http://schemas.microsoft.com/office/drawing/2015/10/21/chartex" xmlns:cx3="http://schemas.microsoft.com/office/drawing/2016/5/9/chartex" xmlns:cx4="http://schemas.microsoft.com/office/drawing/2016/5/10/chartex" xmlns:cx5="http://schemas.microsoft.com/office/drawing/2016/5/11/chartex" xmlns:cx6="http://schemas.microsoft.com/office/drawing/2016/5/12/chartex" xmlns:cx7="http://schemas.microsoft.com/office/drawing/2016/5/13/chartex" xmlns:cx8="http://schemas.microsoft.com/office/drawing/2016/5/14/chartex" xmlns:mc="http://schemas.openxmlformats.org/markup-compatibility/2006" xmlns:aink="http://schemas.microsoft.com/office/drawing/2016/ink" xmlns:am3d="http://schemas.microsoft.com/office/drawing/2017/model3d" xmlns:o="urn:schemas-microsoft-com:office:office" xmlns:oel="http://schemas.microsoft.com/office/2019/extlst" xmlns:r="http://schemas.openxmlformats.org/officeDocument/2006/relationships" xmlns:m="http://schemas.openxmlformats.org/officeDocument/2006/math" xmlns:v="urn:schemas-microsoft-com:vml" xmlns:wp14="http://schemas.microsoft.com/office/word/2010/wordprocessingDrawing" xmlns:wp="http://schemas.openxmlformats.org/drawingml/2006/wordprocessingDrawing" xmlns:w10="urn:schemas-microsoft-com:office:word" xmlns:w="http://schemas.openxmlformats.org/wordprocessingml/2006/main" xmlns:w14="http://schemas.microsoft.com/office/word/2010/wordml" xmlns:w15="http://schemas.microsoft.com/office/word/2012/wordml" xmlns:w16cex="http://schemas.microsoft.com/office/word/2018/wordml/cex" xmlns:w16cid="http://schemas.microsoft.com/office/word/2016/wordml/cid" xmlns:w16="http://schemas.microsoft.com/office/word/2018/wordml" xmlns:w16du="http://schemas.microsoft.com/office/word/2023/wordml/word16du" xmlns:w16sdtdh="http://schemas.microsoft.com/office/word/2020/wordml/sdtdatahash" xmlns:w16sdtfl="http://schemas.microsoft.com/office/word/2024/wordml/sdtformatlock" xmlns:w16se="http://schemas.microsoft.com/office/word/2015/wordml/symex" xmlns:wpg="http://schemas.microsoft.com/office/word/2010/wordprocessingGroup" xmlns:wpi="http://schemas.microsoft.com/office/word/2010/wordprocessingInk" xmlns:wne="http://schemas.microsoft.com/office/word/2006/wordml" xmlns:wps="http://schemas.microsoft.com/office/word/2010/wordprocessingShape" mc:Ignorable="w14 w15 w16se w16cid w16 w16cex w16sdtdh w16sdtfl w16du wp14">
   <w:tbl>
     <w:tblPr>
       <w:tblW w:w="10037" w:type="dxa"/>
@@ -33292,7 +33294,7 @@
       <w:rPr>
         <w:noProof/>
       </w:rPr>
-      <w:pict w14:anchorId="3CDFAE7F">
+      <w:pict w14:anchorId="68D4AD44">
         <v:shapetype id="_x0000_t136" coordsize="21600,21600" o:spt="136" adj="10800" path="m@7,l@8,m@5,21600l@6,21600e">
           <v:formulas>
             <v:f eqn="sum #0 0 10800"/>
@@ -33317,7 +33319,7 @@
           </v:handles>
           <o:lock v:ext="edit" text="t" shapetype="t"/>
         </v:shapetype>
-        <v:shape id="PowerPlusWaterMarkObject127076078" o:spid="_x0000_s1025" type="#_x0000_t136" style="position:absolute;margin-left:0;margin-top:0;width:471.3pt;height:188.5pt;rotation:315;z-index:-251655680;mso-position-horizontal:center;mso-position-horizontal-relative:margin;mso-position-vertical:center;mso-position-vertical-relative:margin" o:allowincell="f" fillcolor="silver" stroked="f">
+        <v:shape id="PowerPlusWaterMarkObject127076078" o:spid="_x0000_s1025" type="#_x0000_t136" alt="" style="position:absolute;margin-left:0;margin-top:0;width:471.3pt;height:188.5pt;rotation:315;z-index:-251655680;mso-wrap-edited:f;mso-width-percent:0;mso-height-percent:0;mso-position-horizontal:center;mso-position-horizontal-relative:margin;mso-position-vertical:center;mso-position-vertical-relative:margin;mso-width-percent:0;mso-height-percent:0" o:allowincell="f" fillcolor="silver" stroked="f">
           <v:fill opacity=".5"/>
           <v:textpath style="font-family:&quot;Times New Roman&quot;;font-size:1pt" string="DRAFT"/>
           <w10:wrap anchorx="margin" anchory="margin"/>
@@ -33407,7 +33409,7 @@
               <v:stroke joinstyle="miter"/>
               <v:path gradientshapeok="t" o:connecttype="rect"/>
             </v:shapetype>
-            <v:shape id="Text Box 3" o:spid="_x0000_s1026" type="#_x0000_t202" style="position:absolute;margin-left:85.15pt;margin-top:270.75pt;width:311.05pt;height:77.05pt;rotation:-2679150fd;z-index:-251657728;visibility:visible;mso-wrap-style:square;mso-width-percent:0;mso-height-percent:0;mso-wrap-distance-left:9pt;mso-wrap-distance-top:0;mso-wrap-distance-right:9pt;mso-wrap-distance-bottom:0;mso-position-horizontal:absolute;mso-position-horizontal-relative:text;mso-position-vertical:absolute;mso-position-vertical-relative:text;mso-width-percent:0;mso-height-percent:0;mso-width-relative:page;mso-height-relative:page;v-text-anchor:top" o:gfxdata="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" o:allowincell="f" filled="f" stroked="f">
+            <v:shape id="Text Box 3" o:spid="_x0000_s1026" type="#_x0000_t202" style="position:absolute;margin-left:85.15pt;margin-top:270.75pt;width:311.05pt;height:77.05pt;rotation:-2679150fd;z-index:-251657728;visibility:visible;mso-wrap-style:square;mso-width-percent:0;mso-height-percent:0;mso-wrap-distance-left:9pt;mso-wrap-distance-top:0;mso-wrap-distance-right:9pt;mso-wrap-distance-bottom:0;mso-position-horizontal:absolute;mso-position-horizontal-relative:text;mso-position-vertical:absolute;mso-position-vertical-relative:text;mso-width-percent:0;mso-height-percent:0;mso-width-relative:page;mso-height-relative:page;v-text-anchor:top" o:gfxdata="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" o:allowincell="f" filled="f" stroked="f">
               <o:lock v:ext="edit" shapetype="t"/>
               <v:textbox style="mso-fit-shape-to-text:t">
                 <w:txbxContent>
@@ -33439,7 +33441,7 @@
 </file>
 
 <file path=word/numbering.xml><?xml version="1.0" encoding="utf-8"?>
-<w:numbering xmlns:wpc="http://schemas.microsoft.com/office/word/2010/wordprocessingCanvas" xmlns:cx="http://schemas.microsoft.com/office/drawing/2014/chartex" xmlns:cx1="http://schemas.microsoft.com/office/drawing/2015/9/8/chartex" xmlns:cx2="http://schemas.microsoft.com/office/drawing/2015/10/21/chartex" xmlns:cx3="http://schemas.microsoft.com/office/drawing/2016/5/9/chartex" xmlns:cx4="http://schemas.microsoft.com/office/drawing/2016/5/10/chartex" xmlns:cx5="http://schemas.microsoft.com/office/drawing/2016/5/11/chartex" xmlns:cx6="http://schemas.microsoft.com/office/drawing/2016/5/12/chartex" xmlns:cx7="http://schemas.microsoft.com/office/drawing/2016/5/13/chartex" xmlns:cx8="http://schemas.microsoft.com/office/drawing/2016/5/14/chartex" xmlns:mc="http://schemas.openxmlformats.org/markup-compatibility/2006" xmlns:aink="http://schemas.microsoft.com/office/drawing/2016/ink" xmlns:am3d="http://schemas.microsoft.com/office/drawing/2017/model3d" xmlns:o="urn:schemas-microsoft-com:office:office" xmlns:oel="http://schemas.microsoft.com/office/2019/extlst" xmlns:r="http://schemas.openxmlformats.org/officeDocument/2006/relationships" xmlns:m="http://schemas.openxmlformats.org/officeDocument/2006/math" xmlns:v="urn:schemas-microsoft-com:vml" xmlns:wp14="http://schemas.microsoft.com/office/word/2010/wordprocessingDrawing" xmlns:wp="http://schemas.openxmlformats.org/drawingml/2006/wordprocessingDrawing" xmlns:w10="urn:schemas-microsoft-com:office:word" xmlns:w="http://schemas.openxmlformats.org/wordprocessingml/2006/main" xmlns:w14="http://schemas.microsoft.com/office/word/2010/wordml" xmlns:w15="http://schemas.microsoft.com/office/word/2012/wordml" xmlns:w16cex="http://schemas.microsoft.com/office/word/2018/wordml/cex" xmlns:w16cid="http://schemas.microsoft.com/office/word/2016/wordml/cid" xmlns:w16="http://schemas.microsoft.com/office/word/2018/wordml" xmlns:w16sdtdh="http://schemas.microsoft.com/office/word/2020/wordml/sdtdatahash" xmlns:w16se="http://schemas.microsoft.com/office/word/2015/wordml/symex" xmlns:wpg="http://schemas.microsoft.com/office/word/2010/wordprocessingGroup" xmlns:wpi="http://schemas.microsoft.com/office/word/2010/wordprocessingInk" xmlns:wne="http://schemas.microsoft.com/office/word/2006/wordml" xmlns:wps="http://schemas.microsoft.com/office/word/2010/wordprocessingShape" mc:Ignorable="w14 w15 w16se w16cid w16 w16cex w16sdtdh wp14">
+<w:numbering xmlns:wpc="http://schemas.microsoft.com/office/word/2010/wordprocessingCanvas" xmlns:cx="http://schemas.microsoft.com/office/drawing/2014/chartex" xmlns:cx1="http://schemas.microsoft.com/office/drawing/2015/9/8/chartex" xmlns:cx2="http://schemas.microsoft.com/office/drawing/2015/10/21/chartex" xmlns:cx3="http://schemas.microsoft.com/office/drawing/2016/5/9/chartex" xmlns:cx4="http://schemas.microsoft.com/office/drawing/2016/5/10/chartex" xmlns:cx5="http://schemas.microsoft.com/office/drawing/2016/5/11/chartex" xmlns:cx6="http://schemas.microsoft.com/office/drawing/2016/5/12/chartex" xmlns:cx7="http://schemas.microsoft.com/office/drawing/2016/5/13/chartex" xmlns:cx8="http://schemas.microsoft.com/office/drawing/2016/5/14/chartex" xmlns:mc="http://schemas.openxmlformats.org/markup-compatibility/2006" xmlns:aink="http://schemas.microsoft.com/office/drawing/2016/ink" xmlns:am3d="http://schemas.microsoft.com/office/drawing/2017/model3d" xmlns:o="urn:schemas-microsoft-com:office:office" xmlns:oel="http://schemas.microsoft.com/office/2019/extlst" xmlns:r="http://schemas.openxmlformats.org/officeDocument/2006/relationships" xmlns:m="http://schemas.openxmlformats.org/officeDocument/2006/math" xmlns:v="urn:schemas-microsoft-com:vml" xmlns:wp14="http://schemas.microsoft.com/office/word/2010/wordprocessingDrawing" xmlns:wp="http://schemas.openxmlformats.org/drawingml/2006/wordprocessingDrawing" xmlns:w10="urn:schemas-microsoft-com:office:word" xmlns:w="http://schemas.openxmlformats.org/wordprocessingml/2006/main" xmlns:w14="http://schemas.microsoft.com/office/word/2010/wordml" xmlns:w15="http://schemas.microsoft.com/office/word/2012/wordml" xmlns:w16cex="http://schemas.microsoft.com/office/word/2018/wordml/cex" xmlns:w16cid="http://schemas.microsoft.com/office/word/2016/wordml/cid" xmlns:w16="http://schemas.microsoft.com/office/word/2018/wordml" xmlns:w16du="http://schemas.microsoft.com/office/word/2023/wordml/word16du" xmlns:w16sdtdh="http://schemas.microsoft.com/office/word/2020/wordml/sdtdatahash" xmlns:w16sdtfl="http://schemas.microsoft.com/office/word/2024/wordml/sdtformatlock" xmlns:w16se="http://schemas.microsoft.com/office/word/2015/wordml/symex" xmlns:wpg="http://schemas.microsoft.com/office/word/2010/wordprocessingGroup" xmlns:wpi="http://schemas.microsoft.com/office/word/2010/wordprocessingInk" xmlns:wne="http://schemas.microsoft.com/office/word/2006/wordml" xmlns:wps="http://schemas.microsoft.com/office/word/2010/wordprocessingShape" mc:Ignorable="w14 w15 w16se w16cid w16 w16cex w16sdtdh w16sdtfl w16du wp14">
   <w:abstractNum w:abstractNumId="0" w15:restartNumberingAfterBreak="0">
     <w:nsid w:val="0A440BC6"/>
     <w:multiLevelType w:val="multilevel"/>
@@ -36881,7 +36883,7 @@
 </file>
 
 <file path=word/people.xml><?xml version="1.0" encoding="utf-8"?>
-<w15:people xmlns:wpc="http://schemas.microsoft.com/office/word/2010/wordprocessingCanvas" xmlns:cx="http://schemas.microsoft.com/office/drawing/2014/chartex" xmlns:cx1="http://schemas.microsoft.com/office/drawing/2015/9/8/chartex" xmlns:cx2="http://schemas.microsoft.com/office/drawing/2015/10/21/chartex" xmlns:cx3="http://schemas.microsoft.com/office/drawing/2016/5/9/chartex" xmlns:cx4="http://schemas.microsoft.com/office/drawing/2016/5/10/chartex" xmlns:cx5="http://schemas.microsoft.com/office/drawing/2016/5/11/chartex" xmlns:cx6="http://schemas.microsoft.com/office/drawing/2016/5/12/chartex" xmlns:cx7="http://schemas.microsoft.com/office/drawing/2016/5/13/chartex" xmlns:cx8="http://schemas.microsoft.com/office/drawing/2016/5/14/chartex" xmlns:mc="http://schemas.openxmlformats.org/markup-compatibility/2006" xmlns:aink="http://schemas.microsoft.com/office/drawing/2016/ink" xmlns:am3d="http://schemas.microsoft.com/office/drawing/2017/model3d" xmlns:o="urn:schemas-microsoft-com:office:office" xmlns:oel="http://schemas.microsoft.com/office/2019/extlst" xmlns:r="http://schemas.openxmlformats.org/officeDocument/2006/relationships" xmlns:m="http://schemas.openxmlformats.org/officeDocument/2006/math" xmlns:v="urn:schemas-microsoft-com:vml" xmlns:wp14="http://schemas.microsoft.com/office/word/2010/wordprocessingDrawing" xmlns:wp="http://schemas.openxmlformats.org/drawingml/2006/wordprocessingDrawing" xmlns:w10="urn:schemas-microsoft-com:office:word" xmlns:w="http://schemas.openxmlformats.org/wordprocessingml/2006/main" xmlns:w14="http://schemas.microsoft.com/office/word/2010/wordml" xmlns:w15="http://schemas.microsoft.com/office/word/2012/wordml" xmlns:w16cex="http://schemas.microsoft.com/office/word/2018/wordml/cex" xmlns:w16cid="http://schemas.microsoft.com/office/word/2016/wordml/cid" xmlns:w16="http://schemas.microsoft.com/office/word/2018/wordml" xmlns:w16sdtdh="http://schemas.microsoft.com/office/word/2020/wordml/sdtdatahash" xmlns:w16se="http://schemas.microsoft.com/office/word/2015/wordml/symex" xmlns:wpg="http://schemas.microsoft.com/office/word/2010/wordprocessingGroup" xmlns:wpi="http://schemas.microsoft.com/office/word/2010/wordprocessingInk" xmlns:wne="http://schemas.microsoft.com/office/word/2006/wordml" xmlns:wps="http://schemas.microsoft.com/office/word/2010/wordprocessingShape" mc:Ignorable="w14 w15 w16se w16cid w16 w16cex w16sdtdh wp14">
+<w15:people xmlns:wpc="http://schemas.microsoft.com/office/word/2010/wordprocessingCanvas" xmlns:cx="http://schemas.microsoft.com/office/drawing/2014/chartex" xmlns:cx1="http://schemas.microsoft.com/office/drawing/2015/9/8/chartex" xmlns:cx2="http://schemas.microsoft.com/office/drawing/2015/10/21/chartex" xmlns:cx3="http://schemas.microsoft.com/office/drawing/2016/5/9/chartex" xmlns:cx4="http://schemas.microsoft.com/office/drawing/2016/5/10/chartex" xmlns:cx5="http://schemas.microsoft.com/office/drawing/2016/5/11/chartex" xmlns:cx6="http://schemas.microsoft.com/office/drawing/2016/5/12/chartex" xmlns:cx7="http://schemas.microsoft.com/office/drawing/2016/5/13/chartex" xmlns:cx8="http://schemas.microsoft.com/office/drawing/2016/5/14/chartex" xmlns:mc="http://schemas.openxmlformats.org/markup-compatibility/2006" xmlns:aink="http://schemas.microsoft.com/office/drawing/2016/ink" xmlns:am3d="http://schemas.microsoft.com/office/drawing/2017/model3d" xmlns:o="urn:schemas-microsoft-com:office:office" xmlns:oel="http://schemas.microsoft.com/office/2019/extlst" xmlns:r="http://schemas.openxmlformats.org/officeDocument/2006/relationships" xmlns:m="http://schemas.openxmlformats.org/officeDocument/2006/math" xmlns:v="urn:schemas-microsoft-com:vml" xmlns:wp14="http://schemas.microsoft.com/office/word/2010/wordprocessingDrawing" xmlns:wp="http://schemas.openxmlformats.org/drawingml/2006/wordprocessingDrawing" xmlns:w10="urn:schemas-microsoft-com:office:word" xmlns:w="http://schemas.openxmlformats.org/wordprocessingml/2006/main" xmlns:w14="http://schemas.microsoft.com/office/word/2010/wordml" xmlns:w15="http://schemas.microsoft.com/office/word/2012/wordml" xmlns:w16cex="http://schemas.microsoft.com/office/word/2018/wordml/cex" xmlns:w16cid="http://schemas.microsoft.com/office/word/2016/wordml/cid" xmlns:w16="http://schemas.microsoft.com/office/word/2018/wordml" xmlns:w16du="http://schemas.microsoft.com/office/word/2023/wordml/word16du" xmlns:w16sdtdh="http://schemas.microsoft.com/office/word/2020/wordml/sdtdatahash" xmlns:w16sdtfl="http://schemas.microsoft.com/office/word/2024/wordml/sdtformatlock" xmlns:w16se="http://schemas.microsoft.com/office/word/2015/wordml/symex" xmlns:wpg="http://schemas.microsoft.com/office/word/2010/wordprocessingGroup" xmlns:wpi="http://schemas.microsoft.com/office/word/2010/wordprocessingInk" xmlns:wne="http://schemas.microsoft.com/office/word/2006/wordml" xmlns:wps="http://schemas.microsoft.com/office/word/2010/wordprocessingShape" mc:Ignorable="w14 w15 w16se w16cid w16 w16cex w16sdtdh w16sdtfl w16du wp14">
   <w15:person w15:author="Leigh Shepherd">
     <w15:presenceInfo w15:providerId="None" w15:userId="Leigh Shepherd"/>
   </w15:person>
@@ -36894,6 +36896,9 @@
   <w15:person w15:author="Sandra Regnell [2]">
     <w15:presenceInfo w15:providerId="Windows Live" w15:userId="5c5540c25fbbd18b"/>
   </w15:person>
+  <w15:person w15:author="Matt Parson">
+    <w15:presenceInfo w15:providerId="Windows Live" w15:userId="392356c278394843"/>
+  </w15:person>
   <w15:person w15:author="Bo Li">
     <w15:presenceInfo w15:providerId="AD" w15:userId="S::bli@altimmune.com::bbf705b8-e8cd-40a7-aa4b-0231048fca12"/>
   </w15:person>
@@ -36904,7 +36909,7 @@
 </file>
 
 <file path=word/styles.xml><?xml version="1.0" encoding="utf-8"?>
-<w:styles xmlns:mc="http://schemas.openxmlformats.org/markup-compatibility/2006" xmlns:r="http://schemas.openxmlformats.org/officeDocument/2006/relationships" xmlns:w="http://schemas.openxmlformats.org/wordprocessingml/2006/main" xmlns:w14="http://schemas.microsoft.com/office/word/2010/wordml" xmlns:w15="http://schemas.microsoft.com/office/word/2012/wordml" xmlns:w16cex="http://schemas.microsoft.com/office/word/2018/wordml/cex" xmlns:w16cid="http://schemas.microsoft.com/office/word/2016/wordml/cid" xmlns:w16="http://schemas.microsoft.com/office/word/2018/wordml" xmlns:w16sdtdh="http://schemas.microsoft.com/office/word/2020/wordml/sdtdatahash" xmlns:w16se="http://schemas.microsoft.com/office/word/2015/wordml/symex" mc:Ignorable="w14 w15 w16se w16cid w16 w16cex w16sdtdh">
+<w:styles xmlns:mc="http://schemas.openxmlformats.org/markup-compatibility/2006" xmlns:r="http://schemas.openxmlformats.org/officeDocument/2006/relationships" xmlns:w="http://schemas.openxmlformats.org/wordprocessingml/2006/main" xmlns:w14="http://schemas.microsoft.com/office/word/2010/wordml" xmlns:w15="http://schemas.microsoft.com/office/word/2012/wordml" xmlns:w16cex="http://schemas.microsoft.com/office/word/2018/wordml/cex" xmlns:w16cid="http://schemas.microsoft.com/office/word/2016/wordml/cid" xmlns:w16="http://schemas.microsoft.com/office/word/2018/wordml" xmlns:w16du="http://schemas.microsoft.com/office/word/2023/wordml/word16du" xmlns:w16sdtdh="http://schemas.microsoft.com/office/word/2020/wordml/sdtdatahash" xmlns:w16sdtfl="http://schemas.microsoft.com/office/word/2024/wordml/sdtformatlock" xmlns:w16se="http://schemas.microsoft.com/office/word/2015/wordml/symex" mc:Ignorable="w14 w15 w16se w16cid w16 w16cex w16sdtdh w16sdtfl w16du">
   <w:docDefaults>
     <w:rPrDefault>
       <w:rPr>
@@ -38571,6 +38576,28 @@
 </file>
 
 <file path=customXml/item2.xml><?xml version="1.0" encoding="utf-8"?>
+<p:properties xmlns:p="http://schemas.microsoft.com/office/2006/metadata/properties" xmlns:xsi="http://www.w3.org/2001/XMLSchema-instance" xmlns:pc="http://schemas.microsoft.com/office/infopath/2007/PartnerControls">
+  <documentManagement>
+    <_Flow_SignoffStatus xmlns="f1094e53-c13b-4c53-aad2-614b7b6eab3e" xsi:nil="true"/>
+    <TaxCatchAll xmlns="47f5edce-a01f-4828-ae0c-3185981bb7f0" xsi:nil="true"/>
+    <lcf76f155ced4ddcb4097134ff3c332f xmlns="f1094e53-c13b-4c53-aad2-614b7b6eab3e">
+      <Terms xmlns="http://schemas.microsoft.com/office/infopath/2007/PartnerControls"/>
+    </lcf76f155ced4ddcb4097134ff3c332f>
+    <Date xmlns="f1094e53-c13b-4c53-aad2-614b7b6eab3e" xsi:nil="true"/>
+  </documentManagement>
+</p:properties>
+</file>
+
+<file path=customXml/item3.xml><?xml version="1.0" encoding="utf-8"?>
+<?mso-contentType ?>
+<FormTemplates xmlns="http://schemas.microsoft.com/sharepoint/v3/contenttype/forms">
+  <Display>DocumentLibraryForm</Display>
+  <Edit>DocumentLibraryForm</Edit>
+  <New>DocumentLibraryForm</New>
+</FormTemplates>
+</file>
+
+<file path=customXml/item4.xml><?xml version="1.0" encoding="utf-8"?>
 <ct:contentTypeSchema xmlns:ct="http://schemas.microsoft.com/office/2006/metadata/contentType" xmlns:ma="http://schemas.microsoft.com/office/2006/metadata/properties/metaAttributes" ct:_="" ma:_="" ma:contentTypeName="Document" ma:contentTypeID="0x010100FD0509479DB62C4DAEF3B9E34942A7F2" ma:contentTypeVersion="16" ma:contentTypeDescription="Create a new document." ma:contentTypeScope="" ma:versionID="e416a2f63fe68165701b1873e68d969a">
   <xsd:schema xmlns:xsd="http://www.w3.org/2001/XMLSchema" xmlns:xs="http://www.w3.org/2001/XMLSchema" xmlns:p="http://schemas.microsoft.com/office/2006/metadata/properties" xmlns:ns2="f1094e53-c13b-4c53-aad2-614b7b6eab3e" xmlns:ns3="47f5edce-a01f-4828-ae0c-3185981bb7f0" targetNamespace="http://schemas.microsoft.com/office/2006/metadata/properties" ma:root="true" ma:fieldsID="d70bee04a7c1f5d180ea7c004d00f8d5" ns2:_="" ns3:_="">
     <xsd:import namespace="f1094e53-c13b-4c53-aad2-614b7b6eab3e"/>
@@ -38811,28 +38838,6 @@
 </ct:contentTypeSchema>
 </file>
 
-<file path=customXml/item3.xml><?xml version="1.0" encoding="utf-8"?>
-<?mso-contentType ?>
-<FormTemplates xmlns="http://schemas.microsoft.com/sharepoint/v3/contenttype/forms">
-  <Display>DocumentLibraryForm</Display>
-  <Edit>DocumentLibraryForm</Edit>
-  <New>DocumentLibraryForm</New>
-</FormTemplates>
-</file>
-
-<file path=customXml/item4.xml><?xml version="1.0" encoding="utf-8"?>
-<p:properties xmlns:p="http://schemas.microsoft.com/office/2006/metadata/properties" xmlns:xsi="http://www.w3.org/2001/XMLSchema-instance" xmlns:pc="http://schemas.microsoft.com/office/infopath/2007/PartnerControls">
-  <documentManagement>
-    <_Flow_SignoffStatus xmlns="f1094e53-c13b-4c53-aad2-614b7b6eab3e" xsi:nil="true"/>
-    <TaxCatchAll xmlns="47f5edce-a01f-4828-ae0c-3185981bb7f0" xsi:nil="true"/>
-    <lcf76f155ced4ddcb4097134ff3c332f xmlns="f1094e53-c13b-4c53-aad2-614b7b6eab3e">
-      <Terms xmlns="http://schemas.microsoft.com/office/infopath/2007/PartnerControls"/>
-    </lcf76f155ced4ddcb4097134ff3c332f>
-    <Date xmlns="f1094e53-c13b-4c53-aad2-614b7b6eab3e" xsi:nil="true"/>
-  </documentManagement>
-</p:properties>
-</file>
-
 <file path=customXml/itemProps1.xml><?xml version="1.0" encoding="utf-8"?>
 <ds:datastoreItem xmlns:ds="http://schemas.openxmlformats.org/officeDocument/2006/customXml" ds:itemID="{649189BA-8DD2-4A2B-847E-443D5985868E}">
   <ds:schemaRefs>
@@ -38842,13 +38847,39 @@
 </file>
 
 <file path=customXml/itemProps2.xml><?xml version="1.0" encoding="utf-8"?>
-<ds:datastoreItem xmlns:ds="http://schemas.openxmlformats.org/officeDocument/2006/customXml" ds:itemID="{97C9A8DE-B553-47C4-95B2-6AFB67AE584C}"/>
+<ds:datastoreItem xmlns:ds="http://schemas.openxmlformats.org/officeDocument/2006/customXml" ds:itemID="{F031737B-32C2-4886-80EC-40E97A9A186C}">
+  <ds:schemaRefs>
+    <ds:schemaRef ds:uri="http://schemas.microsoft.com/office/2006/metadata/properties"/>
+    <ds:schemaRef ds:uri="http://schemas.microsoft.com/office/infopath/2007/PartnerControls"/>
+    <ds:schemaRef ds:uri="f1094e53-c13b-4c53-aad2-614b7b6eab3e"/>
+    <ds:schemaRef ds:uri="47f5edce-a01f-4828-ae0c-3185981bb7f0"/>
+  </ds:schemaRefs>
+</ds:datastoreItem>
 </file>
 
 <file path=customXml/itemProps3.xml><?xml version="1.0" encoding="utf-8"?>
-<ds:datastoreItem xmlns:ds="http://schemas.openxmlformats.org/officeDocument/2006/customXml" ds:itemID="{E2882DD1-178B-4265-A8A8-4548925A2A4F}"/>
+<ds:datastoreItem xmlns:ds="http://schemas.openxmlformats.org/officeDocument/2006/customXml" ds:itemID="{E2882DD1-178B-4265-A8A8-4548925A2A4F}">
+  <ds:schemaRefs>
+    <ds:schemaRef ds:uri="http://schemas.microsoft.com/sharepoint/v3/contenttype/forms"/>
+  </ds:schemaRefs>
+</ds:datastoreItem>
 </file>
 
 <file path=customXml/itemProps4.xml><?xml version="1.0" encoding="utf-8"?>
-<ds:datastoreItem xmlns:ds="http://schemas.openxmlformats.org/officeDocument/2006/customXml" ds:itemID="{F031737B-32C2-4886-80EC-40E97A9A186C}"/>
+<ds:datastoreItem xmlns:ds="http://schemas.openxmlformats.org/officeDocument/2006/customXml" ds:itemID="{97C9A8DE-B553-47C4-95B2-6AFB67AE584C}">
+  <ds:schemaRefs>
+    <ds:schemaRef ds:uri="http://schemas.microsoft.com/office/2006/metadata/contentType"/>
+    <ds:schemaRef ds:uri="http://schemas.microsoft.com/office/2006/metadata/properties/metaAttributes"/>
+    <ds:schemaRef ds:uri="http://www.w3.org/2001/XMLSchema"/>
+    <ds:schemaRef ds:uri="http://schemas.microsoft.com/office/2006/metadata/properties"/>
+    <ds:schemaRef ds:uri="f1094e53-c13b-4c53-aad2-614b7b6eab3e"/>
+    <ds:schemaRef ds:uri="47f5edce-a01f-4828-ae0c-3185981bb7f0"/>
+    <ds:schemaRef ds:uri="http://schemas.microsoft.com/office/2006/documentManagement/types"/>
+    <ds:schemaRef ds:uri="http://schemas.microsoft.com/office/infopath/2007/PartnerControls"/>
+    <ds:schemaRef ds:uri="http://schemas.openxmlformats.org/package/2006/metadata/core-properties"/>
+    <ds:schemaRef ds:uri="http://purl.org/dc/elements/1.1/"/>
+    <ds:schemaRef ds:uri="http://purl.org/dc/terms/"/>
+    <ds:schemaRef ds:uri="http://schemas.microsoft.com/internal/obd"/>
+  </ds:schemaRefs>
+</ds:datastoreItem>
 </file>
</xml_diff>